<commit_message>
Correct model versioning status in report; add catboost/lightgbm to requirements
</commit_message>
<xml_diff>
--- a/docs/report_obioma.docx
+++ b/docs/report_obioma.docx
@@ -71,52 +71,20 @@
           <w:rFonts w:ascii="Times New Roman" w:hAnsi="Times New Roman" w:cs="Times New Roman"/>
         </w:rPr>
       </w:pPr>
-      <w:proofErr w:type="spellStart"/>
-      <w:r>
-        <w:rPr>
-          <w:rFonts w:ascii="Times New Roman" w:hAnsi="Times New Roman" w:cs="Times New Roman"/>
-          <w:b/>
-          <w:bCs/>
-        </w:rPr>
-        <w:t>Programme</w:t>
-      </w:r>
-      <w:proofErr w:type="spellEnd"/>
-      <w:r>
-        <w:rPr>
-          <w:rFonts w:ascii="Times New Roman" w:hAnsi="Times New Roman" w:cs="Times New Roman"/>
-          <w:b/>
-          <w:bCs/>
-        </w:rPr>
-        <w:t>:</w:t>
-      </w:r>
-      <w:r>
-        <w:rPr>
-          <w:rFonts w:ascii="Times New Roman" w:hAnsi="Times New Roman" w:cs="Times New Roman"/>
-        </w:rPr>
-        <w:t xml:space="preserve"> Deep Tech / </w:t>
-      </w:r>
-      <w:proofErr w:type="spellStart"/>
-      <w:r>
-        <w:rPr>
-          <w:rFonts w:ascii="Times New Roman" w:hAnsi="Times New Roman" w:cs="Times New Roman"/>
-        </w:rPr>
-        <w:t>WesOnline</w:t>
-      </w:r>
-      <w:proofErr w:type="spellEnd"/>
-      <w:r>
-        <w:rPr>
-          <w:rFonts w:ascii="Times New Roman" w:hAnsi="Times New Roman" w:cs="Times New Roman"/>
-        </w:rPr>
-        <w:t xml:space="preserve"> Mentorship </w:t>
-      </w:r>
-      <w:proofErr w:type="spellStart"/>
-      <w:r>
-        <w:rPr>
-          <w:rFonts w:ascii="Times New Roman" w:hAnsi="Times New Roman" w:cs="Times New Roman"/>
-        </w:rPr>
-        <w:t>Programme</w:t>
-      </w:r>
-      <w:proofErr w:type="spellEnd"/>
+      <w:r>
+        <w:rPr>
+          <w:rFonts w:ascii="Times New Roman" w:hAnsi="Times New Roman" w:cs="Times New Roman"/>
+          <w:b/>
+          <w:bCs/>
+        </w:rPr>
+        <w:t>Programme:</w:t>
+      </w:r>
+      <w:r>
+        <w:rPr>
+          <w:rFonts w:ascii="Times New Roman" w:hAnsi="Times New Roman" w:cs="Times New Roman"/>
+        </w:rPr>
+        <w:t xml:space="preserve"> Deep Tech / WesOnline Mentorship Programme</w:t>
+      </w:r>
     </w:p>
     <w:p>
       <w:pPr>
@@ -185,49 +153,7 @@
         <w:rPr>
           <w:rFonts w:ascii="Times New Roman" w:hAnsi="Times New Roman" w:cs="Times New Roman"/>
         </w:rPr>
-        <w:t xml:space="preserve"> -was developed under the </w:t>
-      </w:r>
-      <w:proofErr w:type="spellStart"/>
-      <w:r>
-        <w:rPr>
-          <w:rFonts w:ascii="Times New Roman" w:hAnsi="Times New Roman" w:cs="Times New Roman"/>
-        </w:rPr>
-        <w:t>DeepTech</w:t>
-      </w:r>
-      <w:proofErr w:type="spellEnd"/>
-      <w:r>
-        <w:rPr>
-          <w:rFonts w:ascii="Times New Roman" w:hAnsi="Times New Roman" w:cs="Times New Roman"/>
-        </w:rPr>
-        <w:t>/</w:t>
-      </w:r>
-      <w:proofErr w:type="spellStart"/>
-      <w:r>
-        <w:rPr>
-          <w:rFonts w:ascii="Times New Roman" w:hAnsi="Times New Roman" w:cs="Times New Roman"/>
-        </w:rPr>
-        <w:t>WESOnline</w:t>
-      </w:r>
-      <w:proofErr w:type="spellEnd"/>
-      <w:r>
-        <w:rPr>
-          <w:rFonts w:ascii="Times New Roman" w:hAnsi="Times New Roman" w:cs="Times New Roman"/>
-        </w:rPr>
-        <w:t xml:space="preserve"> Mentorship Program. Led by Obioma Ogbuokiri, with team members Sylvia </w:t>
-      </w:r>
-      <w:proofErr w:type="spellStart"/>
-      <w:r>
-        <w:rPr>
-          <w:rFonts w:ascii="Times New Roman" w:hAnsi="Times New Roman" w:cs="Times New Roman"/>
-        </w:rPr>
-        <w:t>Onwuanabile</w:t>
-      </w:r>
-      <w:proofErr w:type="spellEnd"/>
-      <w:r>
-        <w:rPr>
-          <w:rFonts w:ascii="Times New Roman" w:hAnsi="Times New Roman" w:cs="Times New Roman"/>
-        </w:rPr>
-        <w:t xml:space="preserve"> and Kalu Emeka, and guided by mentor Tomisin Adeniyi, the initiative sought to design a production-grade, modularized architecture capable of detecting fraud in real time while ensuring transparency and explainability.</w:t>
+        <w:t xml:space="preserve"> -was developed under the DeepTech/WESOnline Mentorship Program. Led by Obioma Ogbuokiri, with team members Sylvia Onwuanabile and Kalu Emeka, and guided by mentor Tomisin Adeniyi, the initiative sought to design a production-grade, modularized architecture capable of detecting fraud in real time while ensuring transparency and explainability.</w:t>
       </w:r>
     </w:p>
     <w:p>
@@ -243,57 +169,19 @@
         </w:rPr>
         <w:t xml:space="preserve">The system integrates </w:t>
       </w:r>
-      <w:proofErr w:type="spellStart"/>
-      <w:r>
-        <w:rPr>
-          <w:rFonts w:ascii="Times New Roman" w:hAnsi="Times New Roman" w:cs="Times New Roman"/>
-          <w:b/>
-          <w:bCs/>
-        </w:rPr>
-        <w:t>XGBoost</w:t>
-      </w:r>
-      <w:proofErr w:type="spellEnd"/>
-      <w:r>
-        <w:rPr>
-          <w:rFonts w:ascii="Times New Roman" w:hAnsi="Times New Roman" w:cs="Times New Roman"/>
-          <w:b/>
-          <w:bCs/>
-        </w:rPr>
-        <w:t xml:space="preserve"> with Class Weight Adjustment</w:t>
-      </w:r>
-      <w:r>
-        <w:rPr>
-          <w:rFonts w:ascii="Times New Roman" w:hAnsi="Times New Roman" w:cs="Times New Roman"/>
-        </w:rPr>
-        <w:t xml:space="preserve"> to address class imbalance without sacrificing data variance or introducing synthetic noise. A dual-layer explainability framework further enhances its utility: SHAP attributions quantify feature importance, while a large language model (LLM) translates these outputs into plain-English explanations for immediate analyst review. Transactions can be processed individually or in bulk via a </w:t>
-      </w:r>
-      <w:proofErr w:type="spellStart"/>
-      <w:r>
-        <w:rPr>
-          <w:rFonts w:ascii="Times New Roman" w:hAnsi="Times New Roman" w:cs="Times New Roman"/>
-        </w:rPr>
-        <w:t>Streamlit</w:t>
-      </w:r>
-      <w:proofErr w:type="spellEnd"/>
-      <w:r>
-        <w:rPr>
-          <w:rFonts w:ascii="Times New Roman" w:hAnsi="Times New Roman" w:cs="Times New Roman"/>
-        </w:rPr>
-        <w:t xml:space="preserve"> interface, with a </w:t>
-      </w:r>
-      <w:proofErr w:type="spellStart"/>
-      <w:r>
-        <w:rPr>
-          <w:rFonts w:ascii="Times New Roman" w:hAnsi="Times New Roman" w:cs="Times New Roman"/>
-        </w:rPr>
-        <w:t>FastAPI</w:t>
-      </w:r>
-      <w:proofErr w:type="spellEnd"/>
-      <w:r>
-        <w:rPr>
-          <w:rFonts w:ascii="Times New Roman" w:hAnsi="Times New Roman" w:cs="Times New Roman"/>
-        </w:rPr>
-        <w:t xml:space="preserve"> backend ensuring efficient normalization, inference, and explanation delivery.</w:t>
+      <w:r>
+        <w:rPr>
+          <w:rFonts w:ascii="Times New Roman" w:hAnsi="Times New Roman" w:cs="Times New Roman"/>
+          <w:b/>
+          <w:bCs/>
+        </w:rPr>
+        <w:t>XGBoost with Class Weight Adjustment</w:t>
+      </w:r>
+      <w:r>
+        <w:rPr>
+          <w:rFonts w:ascii="Times New Roman" w:hAnsi="Times New Roman" w:cs="Times New Roman"/>
+        </w:rPr>
+        <w:t xml:space="preserve"> to address class imbalance without sacrificing data variance or introducing synthetic noise. A dual-layer explainability framework further enhances its utility: SHAP attributions quantify feature importance, while a large language model (LLM) translates these outputs into plain-English explanations for immediate analyst review. Transactions can be processed individually or in bulk via a Streamlit interface, with a FastAPI backend ensuring efficient normalization, inference, and explanation delivery.</w:t>
       </w:r>
     </w:p>
     <w:p>
@@ -398,21 +286,7 @@
         <w:rPr>
           <w:rFonts w:ascii="Times New Roman" w:hAnsi="Times New Roman" w:cs="Times New Roman"/>
         </w:rPr>
-        <w:t xml:space="preserve">Credit card fraud detection is a critical challenge in financial technology, where the cost of missed fraudulent transactions (false negatives) far outweighs the inconvenience of false positives. Financial institutions lose billions annually to fraud, and traditional detection systems often suffer from high false-positive rates or poor recall due to extreme class imbalance. This project aimed to build an end-to-end fraud detection pipeline capable of real-time inference, explainability, and user interaction. The work was carried out by Obioma Ogbuokiri under the mentorship of Tomisin Adeniyi, with contributions from Sylvia </w:t>
-      </w:r>
-      <w:proofErr w:type="spellStart"/>
-      <w:r>
-        <w:rPr>
-          <w:rFonts w:ascii="Times New Roman" w:hAnsi="Times New Roman" w:cs="Times New Roman"/>
-        </w:rPr>
-        <w:t>Onwuanabile</w:t>
-      </w:r>
-      <w:proofErr w:type="spellEnd"/>
-      <w:r>
-        <w:rPr>
-          <w:rFonts w:ascii="Times New Roman" w:hAnsi="Times New Roman" w:cs="Times New Roman"/>
-        </w:rPr>
-        <w:t xml:space="preserve"> and Kalu Emeka.</w:t>
+        <w:t>Credit card fraud detection is a critical challenge in financial technology, where the cost of missed fraudulent transactions (false negatives) far outweighs the inconvenience of false positives. Financial institutions lose billions annually to fraud, and traditional detection systems often suffer from high false-positive rates or poor recall due to extreme class imbalance. This project aimed to build an end-to-end fraud detection pipeline capable of real-time inference, explainability, and user interaction. The work was carried out by Obioma Ogbuokiri under the mentorship of Tomisin Adeniyi, with contributions from Sylvia Onwuanabile and Kalu Emeka.</w:t>
       </w:r>
     </w:p>
     <w:p>
@@ -453,21 +327,7 @@
         <w:rPr>
           <w:rFonts w:ascii="Times New Roman" w:hAnsi="Times New Roman" w:cs="Times New Roman"/>
         </w:rPr>
-        <w:t xml:space="preserve">The project adopts a modular, dual-layer architecture aligned with modern </w:t>
-      </w:r>
-      <w:proofErr w:type="spellStart"/>
-      <w:r>
-        <w:rPr>
-          <w:rFonts w:ascii="Times New Roman" w:hAnsi="Times New Roman" w:cs="Times New Roman"/>
-        </w:rPr>
-        <w:t>MLOps</w:t>
-      </w:r>
-      <w:proofErr w:type="spellEnd"/>
-      <w:r>
-        <w:rPr>
-          <w:rFonts w:ascii="Times New Roman" w:hAnsi="Times New Roman" w:cs="Times New Roman"/>
-        </w:rPr>
-        <w:t xml:space="preserve"> principles:</w:t>
+        <w:t>The project adopts a modular, dual-layer architecture aligned with modern MLOps principles:</w:t>
       </w:r>
     </w:p>
     <w:p>
@@ -539,25 +399,7 @@
           <w:b/>
           <w:bCs/>
         </w:rPr>
-        <w:t>Backend (</w:t>
-      </w:r>
-      <w:proofErr w:type="spellStart"/>
-      <w:r>
-        <w:rPr>
-          <w:rFonts w:ascii="Times New Roman" w:hAnsi="Times New Roman" w:cs="Times New Roman"/>
-          <w:b/>
-          <w:bCs/>
-        </w:rPr>
-        <w:t>FastAPI</w:t>
-      </w:r>
-      <w:proofErr w:type="spellEnd"/>
-      <w:r>
-        <w:rPr>
-          <w:rFonts w:ascii="Times New Roman" w:hAnsi="Times New Roman" w:cs="Times New Roman"/>
-          <w:b/>
-          <w:bCs/>
-        </w:rPr>
-        <w:t>, Port 8000):</w:t>
+        <w:t>Backend (FastAPI, Port 8000):</w:t>
       </w:r>
       <w:r>
         <w:rPr>
@@ -583,25 +425,7 @@
           <w:b/>
           <w:bCs/>
         </w:rPr>
-        <w:t>Frontend (</w:t>
-      </w:r>
-      <w:proofErr w:type="spellStart"/>
-      <w:r>
-        <w:rPr>
-          <w:rFonts w:ascii="Times New Roman" w:hAnsi="Times New Roman" w:cs="Times New Roman"/>
-          <w:b/>
-          <w:bCs/>
-        </w:rPr>
-        <w:t>Streamlit</w:t>
-      </w:r>
-      <w:proofErr w:type="spellEnd"/>
-      <w:r>
-        <w:rPr>
-          <w:rFonts w:ascii="Times New Roman" w:hAnsi="Times New Roman" w:cs="Times New Roman"/>
-          <w:b/>
-          <w:bCs/>
-        </w:rPr>
-        <w:t>):</w:t>
+        <w:t>Frontend (Streamlit):</w:t>
       </w:r>
       <w:r>
         <w:rPr>
@@ -802,914 +626,19 @@
     </w:p>
     <w:p>
       <w:pPr>
-        <w:pStyle w:val="PlainText"/>
-        <w:jc w:val="both"/>
-        <w:rPr>
-          <w:rFonts w:ascii="Times New Roman" w:hAnsi="Times New Roman" w:cs="Times New Roman"/>
-          <w:b/>
-          <w:bCs/>
-          <w:sz w:val="24"/>
-          <w:szCs w:val="24"/>
-        </w:rPr>
-      </w:pPr>
-      <w:r>
-        <w:rPr>
-          <w:rFonts w:ascii="Times New Roman" w:hAnsi="Times New Roman" w:cs="Times New Roman"/>
-          <w:b/>
-          <w:bCs/>
-          <w:sz w:val="24"/>
-          <w:szCs w:val="24"/>
-        </w:rPr>
-        <w:lastRenderedPageBreak/>
-        <w:t>Real time fraud_detection_system/</w:t>
-      </w:r>
-    </w:p>
-    <w:p>
-      <w:pPr>
-        <w:pStyle w:val="PlainText"/>
-        <w:jc w:val="both"/>
-        <w:rPr>
-          <w:rFonts w:ascii="Times New Roman" w:hAnsi="Times New Roman" w:cs="Times New Roman"/>
-          <w:b/>
-          <w:bCs/>
-          <w:sz w:val="24"/>
-          <w:szCs w:val="24"/>
-        </w:rPr>
-      </w:pPr>
-      <w:r>
-        <w:rPr>
-          <w:rFonts w:ascii="Times New Roman" w:hAnsi="Times New Roman" w:cs="Times New Roman"/>
-          <w:b/>
-          <w:bCs/>
-          <w:sz w:val="24"/>
-          <w:szCs w:val="24"/>
-        </w:rPr>
-        <w:t>├─</w:t>
-      </w:r>
-      <w:proofErr w:type="gramStart"/>
-      <w:r>
-        <w:rPr>
-          <w:rFonts w:ascii="Times New Roman" w:hAnsi="Times New Roman" w:cs="Times New Roman"/>
-          <w:b/>
-          <w:bCs/>
-          <w:sz w:val="24"/>
-          <w:szCs w:val="24"/>
-        </w:rPr>
-        <w:t>─ .gitignore</w:t>
-      </w:r>
-      <w:proofErr w:type="gramEnd"/>
-    </w:p>
-    <w:p>
-      <w:pPr>
-        <w:pStyle w:val="PlainText"/>
-        <w:jc w:val="both"/>
-        <w:rPr>
-          <w:rFonts w:ascii="Times New Roman" w:hAnsi="Times New Roman" w:cs="Times New Roman"/>
-          <w:b/>
-          <w:bCs/>
-          <w:sz w:val="24"/>
-          <w:szCs w:val="24"/>
-        </w:rPr>
-      </w:pPr>
-      <w:r>
-        <w:rPr>
-          <w:rFonts w:ascii="Times New Roman" w:hAnsi="Times New Roman" w:cs="Times New Roman"/>
-          <w:b/>
-          <w:bCs/>
-          <w:sz w:val="24"/>
-          <w:szCs w:val="24"/>
-        </w:rPr>
-        <w:t>├── README.md</w:t>
-      </w:r>
-    </w:p>
-    <w:p>
-      <w:pPr>
-        <w:pStyle w:val="PlainText"/>
-        <w:jc w:val="both"/>
-        <w:rPr>
-          <w:rFonts w:ascii="Times New Roman" w:hAnsi="Times New Roman" w:cs="Times New Roman"/>
-          <w:b/>
-          <w:bCs/>
-          <w:sz w:val="24"/>
-          <w:szCs w:val="24"/>
-        </w:rPr>
-      </w:pPr>
-      <w:r>
-        <w:rPr>
-          <w:rFonts w:ascii="Times New Roman" w:hAnsi="Times New Roman" w:cs="Times New Roman"/>
-          <w:b/>
-          <w:bCs/>
-          <w:sz w:val="24"/>
-          <w:szCs w:val="24"/>
-        </w:rPr>
-        <w:t>├── requirements.txt</w:t>
-      </w:r>
-    </w:p>
-    <w:p>
-      <w:pPr>
-        <w:pStyle w:val="PlainText"/>
-        <w:jc w:val="both"/>
-        <w:rPr>
-          <w:rFonts w:ascii="Times New Roman" w:hAnsi="Times New Roman" w:cs="Times New Roman"/>
-          <w:b/>
-          <w:bCs/>
-          <w:sz w:val="24"/>
-          <w:szCs w:val="24"/>
-        </w:rPr>
-      </w:pPr>
-      <w:r>
-        <w:rPr>
-          <w:rFonts w:ascii="Times New Roman" w:hAnsi="Times New Roman" w:cs="Times New Roman"/>
-          <w:b/>
-          <w:bCs/>
-          <w:sz w:val="24"/>
-          <w:szCs w:val="24"/>
-        </w:rPr>
-        <w:t>├── test_batch_sample.csv</w:t>
-      </w:r>
-    </w:p>
-    <w:p>
-      <w:pPr>
-        <w:pStyle w:val="PlainText"/>
-        <w:jc w:val="both"/>
-        <w:rPr>
-          <w:rFonts w:ascii="Times New Roman" w:hAnsi="Times New Roman" w:cs="Times New Roman"/>
-          <w:b/>
-          <w:bCs/>
-          <w:sz w:val="24"/>
-          <w:szCs w:val="24"/>
-        </w:rPr>
-      </w:pPr>
-      <w:r>
-        <w:rPr>
-          <w:rFonts w:ascii="Times New Roman" w:hAnsi="Times New Roman" w:cs="Times New Roman"/>
-          <w:b/>
-          <w:bCs/>
-          <w:sz w:val="24"/>
-          <w:szCs w:val="24"/>
-        </w:rPr>
-        <w:t>├── src/</w:t>
-      </w:r>
-    </w:p>
-    <w:p>
-      <w:pPr>
-        <w:pStyle w:val="PlainText"/>
-        <w:jc w:val="both"/>
-        <w:rPr>
-          <w:rFonts w:ascii="Times New Roman" w:hAnsi="Times New Roman" w:cs="Times New Roman"/>
-          <w:b/>
-          <w:bCs/>
-          <w:sz w:val="24"/>
-          <w:szCs w:val="24"/>
-        </w:rPr>
-      </w:pPr>
-      <w:r>
-        <w:rPr>
-          <w:rFonts w:ascii="Times New Roman" w:hAnsi="Times New Roman" w:cs="Times New Roman"/>
-          <w:b/>
-          <w:bCs/>
-          <w:sz w:val="24"/>
-          <w:szCs w:val="24"/>
-        </w:rPr>
-        <w:t>│   ├── __init__.py</w:t>
-      </w:r>
-    </w:p>
-    <w:p>
-      <w:pPr>
-        <w:pStyle w:val="PlainText"/>
-        <w:jc w:val="both"/>
-        <w:rPr>
-          <w:rFonts w:ascii="Times New Roman" w:hAnsi="Times New Roman" w:cs="Times New Roman"/>
-          <w:b/>
-          <w:bCs/>
-          <w:sz w:val="24"/>
-          <w:szCs w:val="24"/>
-        </w:rPr>
-      </w:pPr>
-      <w:r>
-        <w:rPr>
-          <w:rFonts w:ascii="Times New Roman" w:hAnsi="Times New Roman" w:cs="Times New Roman"/>
-          <w:b/>
-          <w:bCs/>
-          <w:sz w:val="24"/>
-          <w:szCs w:val="24"/>
-        </w:rPr>
-        <w:t>│   ├── data_prep.py</w:t>
-      </w:r>
-    </w:p>
-    <w:p>
-      <w:pPr>
-        <w:pStyle w:val="PlainText"/>
-        <w:jc w:val="both"/>
-        <w:rPr>
-          <w:rFonts w:ascii="Times New Roman" w:hAnsi="Times New Roman" w:cs="Times New Roman"/>
-          <w:b/>
-          <w:bCs/>
-          <w:sz w:val="24"/>
-          <w:szCs w:val="24"/>
-        </w:rPr>
-      </w:pPr>
-      <w:r>
-        <w:rPr>
-          <w:rFonts w:ascii="Times New Roman" w:hAnsi="Times New Roman" w:cs="Times New Roman"/>
-          <w:b/>
-          <w:bCs/>
-          <w:sz w:val="24"/>
-          <w:szCs w:val="24"/>
-        </w:rPr>
-        <w:t>│   ├── sampling.py</w:t>
-      </w:r>
-    </w:p>
-    <w:p>
-      <w:pPr>
-        <w:pStyle w:val="PlainText"/>
-        <w:jc w:val="both"/>
-        <w:rPr>
-          <w:rFonts w:ascii="Times New Roman" w:hAnsi="Times New Roman" w:cs="Times New Roman"/>
-          <w:b/>
-          <w:bCs/>
-          <w:sz w:val="24"/>
-          <w:szCs w:val="24"/>
-        </w:rPr>
-      </w:pPr>
-      <w:r>
-        <w:rPr>
-          <w:rFonts w:ascii="Times New Roman" w:hAnsi="Times New Roman" w:cs="Times New Roman"/>
-          <w:b/>
-          <w:bCs/>
-          <w:sz w:val="24"/>
-          <w:szCs w:val="24"/>
-        </w:rPr>
-        <w:t>│   ├── train.py</w:t>
-      </w:r>
-    </w:p>
-    <w:p>
-      <w:pPr>
-        <w:pStyle w:val="PlainText"/>
-        <w:jc w:val="both"/>
-        <w:rPr>
-          <w:rFonts w:ascii="Times New Roman" w:hAnsi="Times New Roman" w:cs="Times New Roman"/>
-          <w:b/>
-          <w:bCs/>
-          <w:sz w:val="24"/>
-          <w:szCs w:val="24"/>
-        </w:rPr>
-      </w:pPr>
-      <w:r>
-        <w:rPr>
-          <w:rFonts w:ascii="Times New Roman" w:hAnsi="Times New Roman" w:cs="Times New Roman"/>
-          <w:b/>
-          <w:bCs/>
-          <w:sz w:val="24"/>
-          <w:szCs w:val="24"/>
-        </w:rPr>
-        <w:t>│   ├── evaluate.py</w:t>
-      </w:r>
-    </w:p>
-    <w:p>
-      <w:pPr>
-        <w:pStyle w:val="PlainText"/>
-        <w:jc w:val="both"/>
-        <w:rPr>
-          <w:rFonts w:ascii="Times New Roman" w:hAnsi="Times New Roman" w:cs="Times New Roman"/>
-          <w:b/>
-          <w:bCs/>
-          <w:sz w:val="24"/>
-          <w:szCs w:val="24"/>
-        </w:rPr>
-      </w:pPr>
-      <w:r>
-        <w:rPr>
-          <w:rFonts w:ascii="Times New Roman" w:hAnsi="Times New Roman" w:cs="Times New Roman"/>
-          <w:b/>
-          <w:bCs/>
-          <w:sz w:val="24"/>
-          <w:szCs w:val="24"/>
-        </w:rPr>
-        <w:t>│   └── utils.py</w:t>
-      </w:r>
-    </w:p>
-    <w:p>
-      <w:pPr>
-        <w:pStyle w:val="PlainText"/>
-        <w:jc w:val="both"/>
-        <w:rPr>
-          <w:rFonts w:ascii="Times New Roman" w:hAnsi="Times New Roman" w:cs="Times New Roman"/>
-          <w:b/>
-          <w:bCs/>
-          <w:sz w:val="24"/>
-          <w:szCs w:val="24"/>
-        </w:rPr>
-      </w:pPr>
-      <w:r>
-        <w:rPr>
-          <w:rFonts w:ascii="Times New Roman" w:hAnsi="Times New Roman" w:cs="Times New Roman"/>
-          <w:b/>
-          <w:bCs/>
-          <w:sz w:val="24"/>
-          <w:szCs w:val="24"/>
-        </w:rPr>
-        <w:t>├── notebooks/</w:t>
-      </w:r>
-    </w:p>
-    <w:p>
-      <w:pPr>
-        <w:pStyle w:val="PlainText"/>
-        <w:jc w:val="both"/>
-        <w:rPr>
-          <w:rFonts w:ascii="Times New Roman" w:hAnsi="Times New Roman" w:cs="Times New Roman"/>
-          <w:b/>
-          <w:bCs/>
-          <w:sz w:val="24"/>
-          <w:szCs w:val="24"/>
-        </w:rPr>
-      </w:pPr>
-      <w:r>
-        <w:rPr>
-          <w:rFonts w:ascii="Times New Roman" w:hAnsi="Times New Roman" w:cs="Times New Roman"/>
-          <w:b/>
-          <w:bCs/>
-          <w:sz w:val="24"/>
-          <w:szCs w:val="24"/>
-        </w:rPr>
-        <w:t>│   ├─</w:t>
-      </w:r>
-      <w:proofErr w:type="gramStart"/>
-      <w:r>
-        <w:rPr>
-          <w:rFonts w:ascii="Times New Roman" w:hAnsi="Times New Roman" w:cs="Times New Roman"/>
-          <w:b/>
-          <w:bCs/>
-          <w:sz w:val="24"/>
-          <w:szCs w:val="24"/>
-        </w:rPr>
-        <w:t>─ .gitkeep</w:t>
-      </w:r>
-      <w:proofErr w:type="gramEnd"/>
-    </w:p>
-    <w:p>
-      <w:pPr>
-        <w:pStyle w:val="PlainText"/>
-        <w:jc w:val="both"/>
-        <w:rPr>
-          <w:rFonts w:ascii="Times New Roman" w:hAnsi="Times New Roman" w:cs="Times New Roman"/>
-          <w:b/>
-          <w:bCs/>
-          <w:sz w:val="24"/>
-          <w:szCs w:val="24"/>
-        </w:rPr>
-      </w:pPr>
-      <w:r>
-        <w:rPr>
-          <w:rFonts w:ascii="Times New Roman" w:hAnsi="Times New Roman" w:cs="Times New Roman"/>
-          <w:b/>
-          <w:bCs/>
-          <w:sz w:val="24"/>
-          <w:szCs w:val="24"/>
-        </w:rPr>
-        <w:t>│   ├── fraud_training_</w:t>
-      </w:r>
-      <w:proofErr w:type="gramStart"/>
-      <w:r>
-        <w:rPr>
-          <w:rFonts w:ascii="Times New Roman" w:hAnsi="Times New Roman" w:cs="Times New Roman"/>
-          <w:b/>
-          <w:bCs/>
-          <w:sz w:val="24"/>
-          <w:szCs w:val="24"/>
-        </w:rPr>
-        <w:t>obi.ipynb</w:t>
-      </w:r>
-      <w:proofErr w:type="gramEnd"/>
-    </w:p>
-    <w:p>
-      <w:pPr>
-        <w:pStyle w:val="PlainText"/>
-        <w:jc w:val="both"/>
-        <w:rPr>
-          <w:rFonts w:ascii="Times New Roman" w:hAnsi="Times New Roman" w:cs="Times New Roman"/>
-          <w:b/>
-          <w:bCs/>
-          <w:sz w:val="24"/>
-          <w:szCs w:val="24"/>
-        </w:rPr>
-      </w:pPr>
-      <w:r>
-        <w:rPr>
-          <w:rFonts w:ascii="Times New Roman" w:hAnsi="Times New Roman" w:cs="Times New Roman"/>
-          <w:b/>
-          <w:bCs/>
-          <w:sz w:val="24"/>
-          <w:szCs w:val="24"/>
-        </w:rPr>
-        <w:t xml:space="preserve">│   ├── </w:t>
-      </w:r>
-      <w:proofErr w:type="gramStart"/>
-      <w:r>
-        <w:rPr>
-          <w:rFonts w:ascii="Times New Roman" w:hAnsi="Times New Roman" w:cs="Times New Roman"/>
-          <w:b/>
-          <w:bCs/>
-          <w:sz w:val="24"/>
-          <w:szCs w:val="24"/>
-        </w:rPr>
-        <w:t>preprocessing.ipynb</w:t>
-      </w:r>
-      <w:proofErr w:type="gramEnd"/>
-    </w:p>
-    <w:p>
-      <w:pPr>
-        <w:pStyle w:val="PlainText"/>
-        <w:jc w:val="both"/>
-        <w:rPr>
-          <w:rFonts w:ascii="Times New Roman" w:hAnsi="Times New Roman" w:cs="Times New Roman"/>
-          <w:b/>
-          <w:bCs/>
-          <w:sz w:val="24"/>
-          <w:szCs w:val="24"/>
-        </w:rPr>
-      </w:pPr>
-      <w:r>
-        <w:rPr>
-          <w:rFonts w:ascii="Times New Roman" w:hAnsi="Times New Roman" w:cs="Times New Roman"/>
-          <w:b/>
-          <w:bCs/>
-          <w:sz w:val="24"/>
-          <w:szCs w:val="24"/>
-        </w:rPr>
-        <w:t>│   └── catboost_info/</w:t>
-      </w:r>
-    </w:p>
-    <w:p>
-      <w:pPr>
-        <w:pStyle w:val="PlainText"/>
-        <w:jc w:val="both"/>
-        <w:rPr>
-          <w:rFonts w:ascii="Times New Roman" w:hAnsi="Times New Roman" w:cs="Times New Roman"/>
-          <w:b/>
-          <w:bCs/>
-          <w:sz w:val="24"/>
-          <w:szCs w:val="24"/>
-        </w:rPr>
-      </w:pPr>
-      <w:r>
-        <w:rPr>
-          <w:rFonts w:ascii="Times New Roman" w:hAnsi="Times New Roman" w:cs="Times New Roman"/>
-          <w:b/>
-          <w:bCs/>
-          <w:sz w:val="24"/>
-          <w:szCs w:val="24"/>
-        </w:rPr>
-        <w:t>├── backend/</w:t>
-      </w:r>
-    </w:p>
-    <w:p>
-      <w:pPr>
-        <w:pStyle w:val="PlainText"/>
-        <w:jc w:val="both"/>
-        <w:rPr>
-          <w:rFonts w:ascii="Times New Roman" w:hAnsi="Times New Roman" w:cs="Times New Roman"/>
-          <w:b/>
-          <w:bCs/>
-          <w:sz w:val="24"/>
-          <w:szCs w:val="24"/>
-        </w:rPr>
-      </w:pPr>
-      <w:r>
-        <w:rPr>
-          <w:rFonts w:ascii="Times New Roman" w:hAnsi="Times New Roman" w:cs="Times New Roman"/>
-          <w:b/>
-          <w:bCs/>
-          <w:sz w:val="24"/>
-          <w:szCs w:val="24"/>
-        </w:rPr>
-        <w:t>│   ├─</w:t>
-      </w:r>
-      <w:proofErr w:type="gramStart"/>
-      <w:r>
-        <w:rPr>
-          <w:rFonts w:ascii="Times New Roman" w:hAnsi="Times New Roman" w:cs="Times New Roman"/>
-          <w:b/>
-          <w:bCs/>
-          <w:sz w:val="24"/>
-          <w:szCs w:val="24"/>
-        </w:rPr>
-        <w:t>─ .env</w:t>
-      </w:r>
-      <w:proofErr w:type="gramEnd"/>
-    </w:p>
-    <w:p>
-      <w:pPr>
-        <w:pStyle w:val="PlainText"/>
-        <w:jc w:val="both"/>
-        <w:rPr>
-          <w:rFonts w:ascii="Times New Roman" w:hAnsi="Times New Roman" w:cs="Times New Roman"/>
-          <w:b/>
-          <w:bCs/>
-          <w:sz w:val="24"/>
-          <w:szCs w:val="24"/>
-        </w:rPr>
-      </w:pPr>
-      <w:r>
-        <w:rPr>
-          <w:rFonts w:ascii="Times New Roman" w:hAnsi="Times New Roman" w:cs="Times New Roman"/>
-          <w:b/>
-          <w:bCs/>
-          <w:sz w:val="24"/>
-          <w:szCs w:val="24"/>
-        </w:rPr>
-        <w:t>│   ├─</w:t>
-      </w:r>
-      <w:proofErr w:type="gramStart"/>
-      <w:r>
-        <w:rPr>
-          <w:rFonts w:ascii="Times New Roman" w:hAnsi="Times New Roman" w:cs="Times New Roman"/>
-          <w:b/>
-          <w:bCs/>
-          <w:sz w:val="24"/>
-          <w:szCs w:val="24"/>
-        </w:rPr>
-        <w:t>─ .env</w:t>
-      </w:r>
-      <w:proofErr w:type="gramEnd"/>
-      <w:r>
-        <w:rPr>
-          <w:rFonts w:ascii="Times New Roman" w:hAnsi="Times New Roman" w:cs="Times New Roman"/>
-          <w:b/>
-          <w:bCs/>
-          <w:sz w:val="24"/>
-          <w:szCs w:val="24"/>
-        </w:rPr>
-        <w:t>.example</w:t>
-      </w:r>
-    </w:p>
-    <w:p>
-      <w:pPr>
-        <w:pStyle w:val="PlainText"/>
-        <w:jc w:val="both"/>
-        <w:rPr>
-          <w:rFonts w:ascii="Times New Roman" w:hAnsi="Times New Roman" w:cs="Times New Roman"/>
-          <w:b/>
-          <w:bCs/>
-          <w:sz w:val="24"/>
-          <w:szCs w:val="24"/>
-        </w:rPr>
-      </w:pPr>
-      <w:r>
-        <w:rPr>
-          <w:rFonts w:ascii="Times New Roman" w:hAnsi="Times New Roman" w:cs="Times New Roman"/>
-          <w:b/>
-          <w:bCs/>
-          <w:sz w:val="24"/>
-          <w:szCs w:val="24"/>
-        </w:rPr>
-        <w:t>│   ├── main.py</w:t>
-      </w:r>
-    </w:p>
-    <w:p>
-      <w:pPr>
-        <w:pStyle w:val="PlainText"/>
-        <w:jc w:val="both"/>
-        <w:rPr>
-          <w:rFonts w:ascii="Times New Roman" w:hAnsi="Times New Roman" w:cs="Times New Roman"/>
-          <w:b/>
-          <w:bCs/>
-          <w:sz w:val="24"/>
-          <w:szCs w:val="24"/>
-        </w:rPr>
-      </w:pPr>
-      <w:r>
-        <w:rPr>
-          <w:rFonts w:ascii="Times New Roman" w:hAnsi="Times New Roman" w:cs="Times New Roman"/>
-          <w:b/>
-          <w:bCs/>
-          <w:sz w:val="24"/>
-          <w:szCs w:val="24"/>
-        </w:rPr>
-        <w:t>│   ├── explain.py</w:t>
-      </w:r>
-    </w:p>
-    <w:p>
-      <w:pPr>
-        <w:pStyle w:val="PlainText"/>
-        <w:jc w:val="both"/>
-        <w:rPr>
-          <w:rFonts w:ascii="Times New Roman" w:hAnsi="Times New Roman" w:cs="Times New Roman"/>
-          <w:b/>
-          <w:bCs/>
-          <w:sz w:val="24"/>
-          <w:szCs w:val="24"/>
-        </w:rPr>
-      </w:pPr>
-      <w:r>
-        <w:rPr>
-          <w:rFonts w:ascii="Times New Roman" w:hAnsi="Times New Roman" w:cs="Times New Roman"/>
-          <w:b/>
-          <w:bCs/>
-          <w:sz w:val="24"/>
-          <w:szCs w:val="24"/>
-        </w:rPr>
-        <w:t>│   ├── fraud_model.pkl</w:t>
-      </w:r>
-    </w:p>
-    <w:p>
-      <w:pPr>
-        <w:pStyle w:val="PlainText"/>
-        <w:jc w:val="both"/>
-        <w:rPr>
-          <w:rFonts w:ascii="Times New Roman" w:hAnsi="Times New Roman" w:cs="Times New Roman"/>
-          <w:b/>
-          <w:bCs/>
-          <w:sz w:val="24"/>
-          <w:szCs w:val="24"/>
-        </w:rPr>
-      </w:pPr>
-      <w:r>
-        <w:rPr>
-          <w:rFonts w:ascii="Times New Roman" w:hAnsi="Times New Roman" w:cs="Times New Roman"/>
-          <w:b/>
-          <w:bCs/>
-          <w:sz w:val="24"/>
-          <w:szCs w:val="24"/>
-        </w:rPr>
-        <w:t>│   └── scaler.pkl</w:t>
-      </w:r>
-    </w:p>
-    <w:p>
-      <w:pPr>
-        <w:pStyle w:val="PlainText"/>
-        <w:jc w:val="both"/>
-        <w:rPr>
-          <w:rFonts w:ascii="Times New Roman" w:hAnsi="Times New Roman" w:cs="Times New Roman"/>
-          <w:b/>
-          <w:bCs/>
-          <w:sz w:val="24"/>
-          <w:szCs w:val="24"/>
-        </w:rPr>
-      </w:pPr>
-      <w:r>
-        <w:rPr>
-          <w:rFonts w:ascii="Times New Roman" w:hAnsi="Times New Roman" w:cs="Times New Roman"/>
-          <w:b/>
-          <w:bCs/>
-          <w:sz w:val="24"/>
-          <w:szCs w:val="24"/>
-        </w:rPr>
-        <w:t>├── frontend/</w:t>
-      </w:r>
-    </w:p>
-    <w:p>
-      <w:pPr>
-        <w:pStyle w:val="PlainText"/>
-        <w:jc w:val="both"/>
-        <w:rPr>
-          <w:rFonts w:ascii="Times New Roman" w:hAnsi="Times New Roman" w:cs="Times New Roman"/>
-          <w:b/>
-          <w:bCs/>
-          <w:sz w:val="24"/>
-          <w:szCs w:val="24"/>
-        </w:rPr>
-      </w:pPr>
-      <w:r>
-        <w:rPr>
-          <w:rFonts w:ascii="Times New Roman" w:hAnsi="Times New Roman" w:cs="Times New Roman"/>
-          <w:b/>
-          <w:bCs/>
-          <w:sz w:val="24"/>
-          <w:szCs w:val="24"/>
-        </w:rPr>
-        <w:t>│   └── app.py</w:t>
-      </w:r>
-    </w:p>
-    <w:p>
-      <w:pPr>
-        <w:pStyle w:val="PlainText"/>
-        <w:jc w:val="both"/>
-        <w:rPr>
-          <w:rFonts w:ascii="Times New Roman" w:hAnsi="Times New Roman" w:cs="Times New Roman"/>
-          <w:b/>
-          <w:bCs/>
-          <w:sz w:val="24"/>
-          <w:szCs w:val="24"/>
-        </w:rPr>
-      </w:pPr>
-      <w:r>
-        <w:rPr>
-          <w:rFonts w:ascii="Times New Roman" w:hAnsi="Times New Roman" w:cs="Times New Roman"/>
-          <w:b/>
-          <w:bCs/>
-          <w:sz w:val="24"/>
-          <w:szCs w:val="24"/>
-        </w:rPr>
-        <w:t>├── docs/</w:t>
-      </w:r>
-    </w:p>
-    <w:p>
-      <w:pPr>
-        <w:pStyle w:val="PlainText"/>
-        <w:jc w:val="both"/>
-        <w:rPr>
-          <w:rFonts w:ascii="Times New Roman" w:hAnsi="Times New Roman" w:cs="Times New Roman"/>
-          <w:b/>
-          <w:bCs/>
-          <w:sz w:val="24"/>
-          <w:szCs w:val="24"/>
-        </w:rPr>
-      </w:pPr>
-      <w:r>
-        <w:rPr>
-          <w:rFonts w:ascii="Times New Roman" w:hAnsi="Times New Roman" w:cs="Times New Roman"/>
-          <w:b/>
-          <w:bCs/>
-          <w:sz w:val="24"/>
-          <w:szCs w:val="24"/>
-        </w:rPr>
-        <w:t>│   └── report_obioma.docx</w:t>
-      </w:r>
-    </w:p>
-    <w:p>
-      <w:pPr>
-        <w:pStyle w:val="PlainText"/>
-        <w:jc w:val="both"/>
-        <w:rPr>
-          <w:rFonts w:ascii="Times New Roman" w:hAnsi="Times New Roman" w:cs="Times New Roman"/>
-          <w:b/>
-          <w:bCs/>
-          <w:sz w:val="24"/>
-          <w:szCs w:val="24"/>
-        </w:rPr>
-      </w:pPr>
-      <w:r>
-        <w:rPr>
-          <w:rFonts w:ascii="Times New Roman" w:hAnsi="Times New Roman" w:cs="Times New Roman"/>
-          <w:b/>
-          <w:bCs/>
-          <w:sz w:val="24"/>
-          <w:szCs w:val="24"/>
-        </w:rPr>
-        <w:t>├── data/</w:t>
-      </w:r>
-    </w:p>
-    <w:p>
-      <w:pPr>
-        <w:pStyle w:val="PlainText"/>
-        <w:jc w:val="both"/>
-        <w:rPr>
-          <w:rFonts w:ascii="Times New Roman" w:hAnsi="Times New Roman" w:cs="Times New Roman"/>
-          <w:b/>
-          <w:bCs/>
-          <w:sz w:val="24"/>
-          <w:szCs w:val="24"/>
-        </w:rPr>
-      </w:pPr>
-      <w:r>
-        <w:rPr>
-          <w:rFonts w:ascii="Times New Roman" w:hAnsi="Times New Roman" w:cs="Times New Roman"/>
-          <w:b/>
-          <w:bCs/>
-          <w:sz w:val="24"/>
-          <w:szCs w:val="24"/>
-        </w:rPr>
-        <w:t>└── models_archive/</w:t>
-      </w:r>
-    </w:p>
-    <w:p>
-      <w:pPr>
-        <w:pStyle w:val="PlainText"/>
-        <w:jc w:val="both"/>
-        <w:rPr>
-          <w:rFonts w:ascii="Times New Roman" w:hAnsi="Times New Roman" w:cs="Times New Roman"/>
-          <w:b/>
-          <w:bCs/>
-          <w:sz w:val="24"/>
-          <w:szCs w:val="24"/>
-        </w:rPr>
-      </w:pPr>
-    </w:p>
-    <w:p>
-      <w:pPr>
-        <w:pStyle w:val="PlainText"/>
-        <w:jc w:val="both"/>
-        <w:rPr>
-          <w:rFonts w:ascii="Times New Roman" w:hAnsi="Times New Roman" w:cs="Times New Roman"/>
-          <w:sz w:val="24"/>
-          <w:szCs w:val="24"/>
-        </w:rPr>
-      </w:pPr>
-    </w:p>
-    <w:p>
-      <w:pPr>
-        <w:pStyle w:val="PlainText"/>
-        <w:jc w:val="both"/>
-        <w:rPr>
-          <w:rFonts w:ascii="Times New Roman" w:hAnsi="Times New Roman" w:cs="Times New Roman"/>
-          <w:sz w:val="24"/>
-          <w:szCs w:val="24"/>
-        </w:rPr>
-      </w:pPr>
-    </w:p>
-    <w:p>
-      <w:pPr>
-        <w:pStyle w:val="PlainText"/>
-        <w:jc w:val="both"/>
-        <w:rPr>
-          <w:rFonts w:ascii="Times New Roman" w:hAnsi="Times New Roman" w:cs="Times New Roman"/>
-          <w:sz w:val="24"/>
-          <w:szCs w:val="24"/>
-        </w:rPr>
-      </w:pPr>
-    </w:p>
-    <w:p>
-      <w:pPr>
-        <w:pStyle w:val="PlainText"/>
-        <w:jc w:val="both"/>
-        <w:rPr>
-          <w:rFonts w:ascii="Times New Roman" w:hAnsi="Times New Roman" w:cs="Times New Roman"/>
-          <w:sz w:val="24"/>
-          <w:szCs w:val="24"/>
-        </w:rPr>
-      </w:pPr>
-    </w:p>
-    <w:p>
-      <w:pPr>
-        <w:pStyle w:val="PlainText"/>
-        <w:jc w:val="both"/>
-        <w:rPr>
-          <w:rFonts w:ascii="Times New Roman" w:hAnsi="Times New Roman" w:cs="Times New Roman"/>
-          <w:sz w:val="24"/>
-          <w:szCs w:val="24"/>
-        </w:rPr>
-      </w:pPr>
-    </w:p>
-    <w:p>
-      <w:pPr>
-        <w:pStyle w:val="PlainText"/>
-        <w:jc w:val="both"/>
-        <w:rPr>
-          <w:rFonts w:ascii="Times New Roman" w:hAnsi="Times New Roman" w:cs="Times New Roman"/>
-          <w:sz w:val="24"/>
-          <w:szCs w:val="24"/>
-        </w:rPr>
-      </w:pPr>
-    </w:p>
-    <w:p>
-      <w:pPr>
-        <w:pStyle w:val="PlainText"/>
-        <w:jc w:val="both"/>
-        <w:rPr>
-          <w:rFonts w:ascii="Times New Roman" w:hAnsi="Times New Roman" w:cs="Times New Roman"/>
-          <w:sz w:val="24"/>
-          <w:szCs w:val="24"/>
-        </w:rPr>
-      </w:pPr>
-    </w:p>
-    <w:p>
-      <w:pPr>
-        <w:pStyle w:val="PlainText"/>
-        <w:jc w:val="both"/>
-        <w:rPr>
-          <w:rFonts w:ascii="Times New Roman" w:hAnsi="Times New Roman" w:cs="Times New Roman"/>
-          <w:sz w:val="24"/>
-          <w:szCs w:val="24"/>
-        </w:rPr>
-      </w:pPr>
-    </w:p>
-    <w:p>
-      <w:pPr>
-        <w:pStyle w:val="PlainText"/>
-        <w:jc w:val="both"/>
-        <w:rPr>
-          <w:rFonts w:ascii="Times New Roman" w:hAnsi="Times New Roman" w:cs="Times New Roman"/>
-          <w:sz w:val="24"/>
-          <w:szCs w:val="24"/>
-        </w:rPr>
-      </w:pPr>
-    </w:p>
-    <w:p>
-      <w:pPr>
-        <w:pStyle w:val="PlainText"/>
-        <w:jc w:val="both"/>
-        <w:rPr>
-          <w:rFonts w:ascii="Times New Roman" w:hAnsi="Times New Roman" w:cs="Times New Roman"/>
-          <w:sz w:val="24"/>
-          <w:szCs w:val="24"/>
-        </w:rPr>
-      </w:pPr>
-    </w:p>
-    <w:p>
-      <w:pPr>
-        <w:jc w:val="both"/>
-        <w:rPr>
-          <w:rFonts w:ascii="Times New Roman" w:hAnsi="Times New Roman" w:cs="Times New Roman"/>
-          <w:b/>
-          <w:bCs/>
-        </w:rPr>
-      </w:pPr>
-      <w:r>
-        <w:rPr>
-          <w:rFonts w:ascii="Times New Roman" w:hAnsi="Times New Roman" w:cs="Times New Roman"/>
-          <w:b/>
-          <w:bCs/>
+        <w:jc w:val="both"/>
+        <w:rPr>
+          <w:rFonts w:ascii="Times New Roman" w:hAnsi="Times New Roman" w:cs="Times New Roman"/>
+          <w:b/>
+          <w:bCs/>
+        </w:rPr>
+      </w:pPr>
+      <w:r>
+        <w:rPr>
+          <w:rFonts w:ascii="Times New Roman" w:hAnsi="Times New Roman" w:cs="Times New Roman"/>
+          <w:b/>
+          <w:bCs/>
+          <w:noProof/>
         </w:rPr>
         <w:lastRenderedPageBreak/>
         <w:drawing>
@@ -1869,21 +798,7 @@
         <w:rPr>
           <w:rFonts w:ascii="Times New Roman" w:hAnsi="Times New Roman" w:cs="Times New Roman"/>
         </w:rPr>
-        <w:t xml:space="preserve"> </w:t>
-      </w:r>
-      <w:proofErr w:type="spellStart"/>
-      <w:r>
-        <w:rPr>
-          <w:rFonts w:ascii="Times New Roman" w:hAnsi="Times New Roman" w:cs="Times New Roman"/>
-        </w:rPr>
-        <w:t>StandardScaler</w:t>
-      </w:r>
-      <w:proofErr w:type="spellEnd"/>
-      <w:r>
-        <w:rPr>
-          <w:rFonts w:ascii="Times New Roman" w:hAnsi="Times New Roman" w:cs="Times New Roman"/>
-        </w:rPr>
-        <w:t xml:space="preserve"> applied to Time and Amount to normalize magnitudes, with fitted parameters serialized to prevent data leakage.</w:t>
+        <w:t xml:space="preserve"> StandardScaler applied to Time and Amount to normalize magnitudes, with fitted parameters serialized to prevent data leakage.</w:t>
       </w:r>
     </w:p>
     <w:p>
@@ -2231,21 +1146,7 @@
         <w:rPr>
           <w:rFonts w:ascii="Times New Roman" w:hAnsi="Times New Roman" w:cs="Times New Roman"/>
         </w:rPr>
-        <w:t xml:space="preserve"> across the full feature set. This is a key reason a tree-based ensemble method like </w:t>
-      </w:r>
-      <w:proofErr w:type="spellStart"/>
-      <w:r>
-        <w:rPr>
-          <w:rFonts w:ascii="Times New Roman" w:hAnsi="Times New Roman" w:cs="Times New Roman"/>
-        </w:rPr>
-        <w:t>XGBoost</w:t>
-      </w:r>
-      <w:proofErr w:type="spellEnd"/>
-      <w:r>
-        <w:rPr>
-          <w:rFonts w:ascii="Times New Roman" w:hAnsi="Times New Roman" w:cs="Times New Roman"/>
-        </w:rPr>
-        <w:t>, which naturally captures non-linear feature interactions and threshold effects, outperformed the linear baseline (Logistic Regression) in the model comparison (Section 5), and it foreshadows why the four features with the strongest individual correlation (V14, V17, V12, V10) later seen as the top SHAP-attributed features in the model's actual fraud predictions (Section 6.3) – the  correlation analysis and the trained model's learned feature importance are independently pointing to the same underlying signal.</w:t>
+        <w:t xml:space="preserve"> across the full feature set. This is a key reason a tree-based ensemble method like XGBoost, which naturally captures non-linear feature interactions and threshold effects, outperformed the linear baseline (Logistic Regression) in the model comparison (Section 5), and it foreshadows why the four features with the strongest individual correlation (V14, V17, V12, V10) later seen as the top SHAP-attributed features in the model's actual fraud predictions (Section 6.3) – the  correlation analysis and the trained model's learned feature importance are independently pointing to the same underlying signal.</w:t>
       </w:r>
     </w:p>
     <w:p>
@@ -2477,25 +1378,7 @@
           <w:b/>
           <w:bCs/>
         </w:rPr>
-        <w:t xml:space="preserve">Random </w:t>
-      </w:r>
-      <w:proofErr w:type="spellStart"/>
-      <w:r>
-        <w:rPr>
-          <w:rFonts w:ascii="Times New Roman" w:hAnsi="Times New Roman" w:cs="Times New Roman"/>
-          <w:b/>
-          <w:bCs/>
-        </w:rPr>
-        <w:t>Undersampling</w:t>
-      </w:r>
-      <w:proofErr w:type="spellEnd"/>
-      <w:r>
-        <w:rPr>
-          <w:rFonts w:ascii="Times New Roman" w:hAnsi="Times New Roman" w:cs="Times New Roman"/>
-          <w:b/>
-          <w:bCs/>
-        </w:rPr>
-        <w:t xml:space="preserve"> (RUS): </w:t>
+        <w:t xml:space="preserve">Random Undersampling (RUS): </w:t>
       </w:r>
       <w:r>
         <w:rPr>
@@ -3640,123 +2523,21 @@
         <w:rPr>
           <w:rFonts w:ascii="Times New Roman" w:hAnsi="Times New Roman" w:cs="Times New Roman"/>
         </w:rPr>
-        <w:t xml:space="preserve">Five models (Logistic Regression, Random Forest, </w:t>
-      </w:r>
-      <w:proofErr w:type="spellStart"/>
-      <w:r>
-        <w:rPr>
-          <w:rFonts w:ascii="Times New Roman" w:hAnsi="Times New Roman" w:cs="Times New Roman"/>
-        </w:rPr>
-        <w:t>XGBoost</w:t>
-      </w:r>
-      <w:proofErr w:type="spellEnd"/>
-      <w:r>
-        <w:rPr>
-          <w:rFonts w:ascii="Times New Roman" w:hAnsi="Times New Roman" w:cs="Times New Roman"/>
-        </w:rPr>
-        <w:t xml:space="preserve">, </w:t>
-      </w:r>
-      <w:proofErr w:type="spellStart"/>
-      <w:r>
-        <w:rPr>
-          <w:rFonts w:ascii="Times New Roman" w:hAnsi="Times New Roman" w:cs="Times New Roman"/>
-        </w:rPr>
-        <w:t>CatBoost</w:t>
-      </w:r>
-      <w:proofErr w:type="spellEnd"/>
-      <w:r>
-        <w:rPr>
-          <w:rFonts w:ascii="Times New Roman" w:hAnsi="Times New Roman" w:cs="Times New Roman"/>
-        </w:rPr>
-        <w:t xml:space="preserve">, </w:t>
-      </w:r>
-      <w:proofErr w:type="spellStart"/>
-      <w:r>
-        <w:rPr>
-          <w:rFonts w:ascii="Times New Roman" w:hAnsi="Times New Roman" w:cs="Times New Roman"/>
-        </w:rPr>
-        <w:t>LightGBM</w:t>
-      </w:r>
-      <w:proofErr w:type="spellEnd"/>
-      <w:r>
-        <w:rPr>
-          <w:rFonts w:ascii="Times New Roman" w:hAnsi="Times New Roman" w:cs="Times New Roman"/>
-        </w:rPr>
-        <w:t xml:space="preserve">) were evaluated across three imbalance-handling strategies (SMOTE, Random Under-Sampling, and class-weighting), ranked by PR-AUC using average_precision_score (the statistically preferred method over trapezoidal </w:t>
-      </w:r>
-      <w:proofErr w:type="spellStart"/>
-      <w:proofErr w:type="gramStart"/>
-      <w:r>
-        <w:rPr>
-          <w:rFonts w:ascii="Times New Roman" w:hAnsi="Times New Roman" w:cs="Times New Roman"/>
-        </w:rPr>
-        <w:t>auc</w:t>
-      </w:r>
-      <w:proofErr w:type="spellEnd"/>
-      <w:r>
-        <w:rPr>
-          <w:rFonts w:ascii="Times New Roman" w:hAnsi="Times New Roman" w:cs="Times New Roman"/>
-        </w:rPr>
-        <w:t>(</w:t>
-      </w:r>
-      <w:proofErr w:type="gramEnd"/>
-      <w:r>
-        <w:rPr>
-          <w:rFonts w:ascii="Times New Roman" w:hAnsi="Times New Roman" w:cs="Times New Roman"/>
-        </w:rPr>
-        <w:t>) integration for precision-recall curves, per scikit-</w:t>
-      </w:r>
-      <w:proofErr w:type="spellStart"/>
-      <w:r>
-        <w:rPr>
-          <w:rFonts w:ascii="Times New Roman" w:hAnsi="Times New Roman" w:cs="Times New Roman"/>
-        </w:rPr>
-        <w:t>learn's</w:t>
-      </w:r>
-      <w:proofErr w:type="spellEnd"/>
-      <w:r>
-        <w:rPr>
-          <w:rFonts w:ascii="Times New Roman" w:hAnsi="Times New Roman" w:cs="Times New Roman"/>
-        </w:rPr>
-        <w:t xml:space="preserve"> own documentation). </w:t>
-      </w:r>
-      <w:proofErr w:type="spellStart"/>
-      <w:r>
-        <w:rPr>
-          <w:rFonts w:ascii="Times New Roman" w:hAnsi="Times New Roman" w:cs="Times New Roman"/>
-          <w:b/>
-          <w:bCs/>
-        </w:rPr>
-        <w:t>XGBoost</w:t>
-      </w:r>
-      <w:proofErr w:type="spellEnd"/>
-      <w:r>
-        <w:rPr>
-          <w:rFonts w:ascii="Times New Roman" w:hAnsi="Times New Roman" w:cs="Times New Roman"/>
-          <w:b/>
-          <w:bCs/>
-        </w:rPr>
-        <w:t xml:space="preserve"> with class-weighting</w:t>
-      </w:r>
-      <w:r>
-        <w:rPr>
-          <w:rFonts w:ascii="Times New Roman" w:hAnsi="Times New Roman" w:cs="Times New Roman"/>
-        </w:rPr>
-        <w:t xml:space="preserve"> was selected, with a validated PR-AUC of 0.8791 – reproduced consistently across three independent runs during this review process, confirming the result's reliability despite minor floating-point variation observed in some lower-ranked models (attributable to multi-threaded, non-deterministic computation in libraries using </w:t>
-      </w:r>
-      <w:proofErr w:type="spellStart"/>
-      <w:r>
-        <w:rPr>
-          <w:rFonts w:ascii="Times New Roman" w:hAnsi="Times New Roman" w:cs="Times New Roman"/>
-        </w:rPr>
-        <w:t>n_jobs</w:t>
-      </w:r>
-      <w:proofErr w:type="spellEnd"/>
-      <w:r>
-        <w:rPr>
-          <w:rFonts w:ascii="Times New Roman" w:hAnsi="Times New Roman" w:cs="Times New Roman"/>
-        </w:rPr>
-        <w:t>=-1, a documented characteristic of parallelized gradient boosting).</w:t>
+        <w:t xml:space="preserve">Five models (Logistic Regression, Random Forest, XGBoost, CatBoost, LightGBM) were evaluated across three imbalance-handling strategies (SMOTE, Random Under-Sampling, and class-weighting), ranked by PR-AUC using average_precision_score (the statistically preferred method over trapezoidal auc() integration for precision-recall curves, per scikit-learn's own documentation). </w:t>
+      </w:r>
+      <w:r>
+        <w:rPr>
+          <w:rFonts w:ascii="Times New Roman" w:hAnsi="Times New Roman" w:cs="Times New Roman"/>
+          <w:b/>
+          <w:bCs/>
+        </w:rPr>
+        <w:t>XGBoost with class-weighting</w:t>
+      </w:r>
+      <w:r>
+        <w:rPr>
+          <w:rFonts w:ascii="Times New Roman" w:hAnsi="Times New Roman" w:cs="Times New Roman"/>
+        </w:rPr>
+        <w:t xml:space="preserve"> was selected, with a validated PR-AUC of 0.8791 – reproduced consistently across three independent runs during this review process, confirming the result's reliability despite minor floating-point variation observed in some lower-ranked models (attributable to multi-threaded, non-deterministic computation in libraries using n_jobs=-1, a documented characteristic of parallelized gradient boosting).</w:t>
       </w:r>
     </w:p>
     <w:p>
@@ -3797,49 +2578,7 @@
         <w:rPr>
           <w:rFonts w:ascii="Times New Roman" w:hAnsi="Times New Roman" w:cs="Times New Roman"/>
         </w:rPr>
-        <w:t xml:space="preserve">Default parameters were insufficient for the imbalanced dataset. Using </w:t>
-      </w:r>
-      <w:proofErr w:type="spellStart"/>
-      <w:r>
-        <w:rPr>
-          <w:rFonts w:ascii="Times New Roman" w:hAnsi="Times New Roman" w:cs="Times New Roman"/>
-        </w:rPr>
-        <w:t>RandomizedSearchCV</w:t>
-      </w:r>
-      <w:proofErr w:type="spellEnd"/>
-      <w:r>
-        <w:rPr>
-          <w:rFonts w:ascii="Times New Roman" w:hAnsi="Times New Roman" w:cs="Times New Roman"/>
-        </w:rPr>
-        <w:t xml:space="preserve"> with </w:t>
-      </w:r>
-      <w:proofErr w:type="spellStart"/>
-      <w:r>
-        <w:rPr>
-          <w:rFonts w:ascii="Times New Roman" w:hAnsi="Times New Roman" w:cs="Times New Roman"/>
-        </w:rPr>
-        <w:t>StratifiedKFold</w:t>
-      </w:r>
-      <w:proofErr w:type="spellEnd"/>
-      <w:r>
-        <w:rPr>
-          <w:rFonts w:ascii="Times New Roman" w:hAnsi="Times New Roman" w:cs="Times New Roman"/>
-        </w:rPr>
-        <w:t xml:space="preserve"> cross-validation, the team optimized </w:t>
-      </w:r>
-      <w:proofErr w:type="spellStart"/>
-      <w:r>
-        <w:rPr>
-          <w:rFonts w:ascii="Times New Roman" w:hAnsi="Times New Roman" w:cs="Times New Roman"/>
-        </w:rPr>
-        <w:t>XGBoost</w:t>
-      </w:r>
-      <w:proofErr w:type="spellEnd"/>
-      <w:r>
-        <w:rPr>
-          <w:rFonts w:ascii="Times New Roman" w:hAnsi="Times New Roman" w:cs="Times New Roman"/>
-        </w:rPr>
-        <w:t xml:space="preserve"> for PR-AUC.</w:t>
+        <w:t>Default parameters were insufficient for the imbalanced dataset. Using RandomizedSearchCV with StratifiedKFold cross-validation, the team optimized XGBoost for PR-AUC.</w:t>
       </w:r>
     </w:p>
     <w:p>
@@ -3858,63 +2597,7 @@
           <w:rFonts w:ascii="Times New Roman" w:hAnsi="Times New Roman" w:cs="Times New Roman"/>
         </w:rPr>
         <w:lastRenderedPageBreak/>
-        <w:t xml:space="preserve">Final tuned configuration: </w:t>
-      </w:r>
-      <w:proofErr w:type="spellStart"/>
-      <w:r>
-        <w:rPr>
-          <w:rFonts w:ascii="Times New Roman" w:hAnsi="Times New Roman" w:cs="Times New Roman"/>
-        </w:rPr>
-        <w:t>max_depth</w:t>
-      </w:r>
-      <w:proofErr w:type="spellEnd"/>
-      <w:r>
-        <w:rPr>
-          <w:rFonts w:ascii="Times New Roman" w:hAnsi="Times New Roman" w:cs="Times New Roman"/>
-        </w:rPr>
-        <w:t xml:space="preserve">=8, </w:t>
-      </w:r>
-      <w:proofErr w:type="spellStart"/>
-      <w:r>
-        <w:rPr>
-          <w:rFonts w:ascii="Times New Roman" w:hAnsi="Times New Roman" w:cs="Times New Roman"/>
-        </w:rPr>
-        <w:t>learning_rate</w:t>
-      </w:r>
-      <w:proofErr w:type="spellEnd"/>
-      <w:r>
-        <w:rPr>
-          <w:rFonts w:ascii="Times New Roman" w:hAnsi="Times New Roman" w:cs="Times New Roman"/>
-        </w:rPr>
-        <w:t xml:space="preserve">=0.05, </w:t>
-      </w:r>
-      <w:proofErr w:type="spellStart"/>
-      <w:r>
-        <w:rPr>
-          <w:rFonts w:ascii="Times New Roman" w:hAnsi="Times New Roman" w:cs="Times New Roman"/>
-        </w:rPr>
-        <w:t>n_estimators</w:t>
-      </w:r>
-      <w:proofErr w:type="spellEnd"/>
-      <w:r>
-        <w:rPr>
-          <w:rFonts w:ascii="Times New Roman" w:hAnsi="Times New Roman" w:cs="Times New Roman"/>
-        </w:rPr>
-        <w:t xml:space="preserve">=500, subsample=0.8, </w:t>
-      </w:r>
-      <w:proofErr w:type="spellStart"/>
-      <w:r>
-        <w:rPr>
-          <w:rFonts w:ascii="Times New Roman" w:hAnsi="Times New Roman" w:cs="Times New Roman"/>
-        </w:rPr>
-        <w:t>colsample_bytree</w:t>
-      </w:r>
-      <w:proofErr w:type="spellEnd"/>
-      <w:r>
-        <w:rPr>
-          <w:rFonts w:ascii="Times New Roman" w:hAnsi="Times New Roman" w:cs="Times New Roman"/>
-        </w:rPr>
-        <w:t>=0.7. This tuning improved recall stability and reduced false negatives compared to defaults. Runner-up models (Random Forest + SMOTE) were partially tuned but deprioritized due to time constraints.</w:t>
+        <w:t>Final tuned configuration: max_depth=8, learning_rate=0.05, n_estimators=500, subsample=0.8, colsample_bytree=0.7. This tuning improved recall stability and reduced false negatives compared to defaults. Runner-up models (Random Forest + SMOTE) were partially tuned but deprioritized due to time constraints.</w:t>
       </w:r>
     </w:p>
     <w:p>
@@ -4206,21 +2889,7 @@
         <w:rPr>
           <w:rFonts w:ascii="Times New Roman" w:hAnsi="Times New Roman" w:cs="Times New Roman"/>
         </w:rPr>
-        <w:t xml:space="preserve">A sweep across thresholds 0.1–0.8 was run against the tuned </w:t>
-      </w:r>
-      <w:proofErr w:type="spellStart"/>
-      <w:r>
-        <w:rPr>
-          <w:rFonts w:ascii="Times New Roman" w:hAnsi="Times New Roman" w:cs="Times New Roman"/>
-        </w:rPr>
-        <w:t>XGBoost</w:t>
-      </w:r>
-      <w:proofErr w:type="spellEnd"/>
-      <w:r>
-        <w:rPr>
-          <w:rFonts w:ascii="Times New Roman" w:hAnsi="Times New Roman" w:cs="Times New Roman"/>
-        </w:rPr>
-        <w:t xml:space="preserve"> model's test predictions.</w:t>
+        <w:t>A sweep across thresholds 0.1–0.8 was run against the tuned XGBoost model's test predictions.</w:t>
       </w:r>
     </w:p>
     <w:p>
@@ -5844,7 +4513,6 @@
                 <w14:ligatures w14:val="none"/>
               </w:rPr>
             </w:pPr>
-            <w:proofErr w:type="spellStart"/>
             <w:r>
               <w:rPr>
                 <w:rFonts w:ascii="Times New Roman" w:eastAsia="Times New Roman" w:hAnsi="Times New Roman" w:cs="Times New Roman"/>
@@ -5856,7 +4524,6 @@
               </w:rPr>
               <w:t>XGBoost</w:t>
             </w:r>
-            <w:proofErr w:type="spellEnd"/>
           </w:p>
         </w:tc>
         <w:tc>
@@ -6305,7 +4972,6 @@
                 <w14:ligatures w14:val="none"/>
               </w:rPr>
             </w:pPr>
-            <w:proofErr w:type="spellStart"/>
             <w:r>
               <w:rPr>
                 <w:rFonts w:ascii="Times New Roman" w:eastAsia="Times New Roman" w:hAnsi="Times New Roman" w:cs="Times New Roman"/>
@@ -6317,7 +4983,6 @@
               </w:rPr>
               <w:t>CatBoost</w:t>
             </w:r>
-            <w:proofErr w:type="spellEnd"/>
           </w:p>
         </w:tc>
         <w:tc>
@@ -6537,7 +5202,6 @@
                 <w14:ligatures w14:val="none"/>
               </w:rPr>
             </w:pPr>
-            <w:proofErr w:type="spellStart"/>
             <w:r>
               <w:rPr>
                 <w:rFonts w:ascii="Times New Roman" w:eastAsia="Times New Roman" w:hAnsi="Times New Roman" w:cs="Times New Roman"/>
@@ -6547,7 +5211,6 @@
               </w:rPr>
               <w:t>CatBoost</w:t>
             </w:r>
-            <w:proofErr w:type="spellEnd"/>
           </w:p>
         </w:tc>
         <w:tc>
@@ -6747,7 +5410,6 @@
                 <w14:ligatures w14:val="none"/>
               </w:rPr>
             </w:pPr>
-            <w:proofErr w:type="spellStart"/>
             <w:r>
               <w:rPr>
                 <w:rFonts w:ascii="Times New Roman" w:eastAsia="Times New Roman" w:hAnsi="Times New Roman" w:cs="Times New Roman"/>
@@ -6757,7 +5419,6 @@
               </w:rPr>
               <w:t>XGBoost</w:t>
             </w:r>
-            <w:proofErr w:type="spellEnd"/>
           </w:p>
         </w:tc>
         <w:tc>
@@ -7199,7 +5860,6 @@
                 <w14:ligatures w14:val="none"/>
               </w:rPr>
             </w:pPr>
-            <w:proofErr w:type="spellStart"/>
             <w:r>
               <w:rPr>
                 <w:rFonts w:ascii="Times New Roman" w:eastAsia="Times New Roman" w:hAnsi="Times New Roman" w:cs="Times New Roman"/>
@@ -7211,7 +5871,6 @@
               </w:rPr>
               <w:t>LightGBM</w:t>
             </w:r>
-            <w:proofErr w:type="spellEnd"/>
           </w:p>
         </w:tc>
         <w:tc>
@@ -7431,7 +6090,6 @@
                 <w14:ligatures w14:val="none"/>
               </w:rPr>
             </w:pPr>
-            <w:proofErr w:type="spellStart"/>
             <w:r>
               <w:rPr>
                 <w:rFonts w:ascii="Times New Roman" w:eastAsia="Times New Roman" w:hAnsi="Times New Roman" w:cs="Times New Roman"/>
@@ -7441,7 +6099,6 @@
               </w:rPr>
               <w:t>LightGBM</w:t>
             </w:r>
-            <w:proofErr w:type="spellEnd"/>
           </w:p>
         </w:tc>
         <w:tc>
@@ -8501,7 +7158,6 @@
                 <w14:ligatures w14:val="none"/>
               </w:rPr>
             </w:pPr>
-            <w:proofErr w:type="spellStart"/>
             <w:r>
               <w:rPr>
                 <w:rFonts w:ascii="Times New Roman" w:eastAsia="Times New Roman" w:hAnsi="Times New Roman" w:cs="Times New Roman"/>
@@ -8511,7 +7167,6 @@
               </w:rPr>
               <w:t>CatBoost</w:t>
             </w:r>
-            <w:proofErr w:type="spellEnd"/>
           </w:p>
         </w:tc>
         <w:tc>
@@ -8711,7 +7366,6 @@
                 <w14:ligatures w14:val="none"/>
               </w:rPr>
             </w:pPr>
-            <w:proofErr w:type="spellStart"/>
             <w:r>
               <w:rPr>
                 <w:rFonts w:ascii="Times New Roman" w:eastAsia="Times New Roman" w:hAnsi="Times New Roman" w:cs="Times New Roman"/>
@@ -8721,7 +7375,6 @@
               </w:rPr>
               <w:t>LightGBM</w:t>
             </w:r>
-            <w:proofErr w:type="spellEnd"/>
           </w:p>
         </w:tc>
         <w:tc>
@@ -8921,7 +7574,6 @@
                 <w14:ligatures w14:val="none"/>
               </w:rPr>
             </w:pPr>
-            <w:proofErr w:type="spellStart"/>
             <w:r>
               <w:rPr>
                 <w:rFonts w:ascii="Times New Roman" w:eastAsia="Times New Roman" w:hAnsi="Times New Roman" w:cs="Times New Roman"/>
@@ -8931,7 +7583,6 @@
               </w:rPr>
               <w:t>XGBoost</w:t>
             </w:r>
-            <w:proofErr w:type="spellEnd"/>
           </w:p>
         </w:tc>
         <w:tc>
@@ -9160,23 +7811,13 @@
           <w:rFonts w:ascii="Times New Roman" w:hAnsi="Times New Roman" w:cs="Times New Roman"/>
         </w:rPr>
       </w:pPr>
-      <w:proofErr w:type="spellStart"/>
-      <w:r>
-        <w:rPr>
-          <w:rFonts w:ascii="Times New Roman" w:hAnsi="Times New Roman" w:cs="Times New Roman"/>
-          <w:b/>
-          <w:bCs/>
-        </w:rPr>
-        <w:t>XGBoost</w:t>
-      </w:r>
-      <w:proofErr w:type="spellEnd"/>
-      <w:r>
-        <w:rPr>
-          <w:rFonts w:ascii="Times New Roman" w:hAnsi="Times New Roman" w:cs="Times New Roman"/>
-          <w:b/>
-          <w:bCs/>
-        </w:rPr>
-        <w:t>:</w:t>
+      <w:r>
+        <w:rPr>
+          <w:rFonts w:ascii="Times New Roman" w:hAnsi="Times New Roman" w:cs="Times New Roman"/>
+          <w:b/>
+          <w:bCs/>
+        </w:rPr>
+        <w:t>XGBoost:</w:t>
       </w:r>
       <w:r>
         <w:rPr>
@@ -9246,21 +7887,7 @@
         <w:rPr>
           <w:rFonts w:ascii="Times New Roman" w:hAnsi="Times New Roman" w:cs="Times New Roman"/>
         </w:rPr>
-        <w:t xml:space="preserve"> </w:t>
-      </w:r>
-      <w:proofErr w:type="spellStart"/>
-      <w:r>
-        <w:rPr>
-          <w:rFonts w:ascii="Times New Roman" w:hAnsi="Times New Roman" w:cs="Times New Roman"/>
-        </w:rPr>
-        <w:t>XGBoost</w:t>
-      </w:r>
-      <w:proofErr w:type="spellEnd"/>
-      <w:r>
-        <w:rPr>
-          <w:rFonts w:ascii="Times New Roman" w:hAnsi="Times New Roman" w:cs="Times New Roman"/>
-        </w:rPr>
-        <w:t xml:space="preserve"> was chosen for deployment due to its superior balance of recall and precision, minimizing financial risk while avoiding analyst overload. </w:t>
+        <w:t xml:space="preserve"> XGBoost was chosen for deployment due to its superior balance of recall and precision, minimizing financial risk while avoiding analyst overload. </w:t>
       </w:r>
       <w:r>
         <w:rPr>
@@ -9276,23 +7903,13 @@
         </w:rPr>
         <w:t xml:space="preserve"> and </w:t>
       </w:r>
-      <w:proofErr w:type="spellStart"/>
-      <w:r>
-        <w:rPr>
-          <w:rFonts w:ascii="Times New Roman" w:hAnsi="Times New Roman" w:cs="Times New Roman"/>
-          <w:b/>
-          <w:bCs/>
-        </w:rPr>
-        <w:t>CatBoost</w:t>
-      </w:r>
-      <w:proofErr w:type="spellEnd"/>
-      <w:r>
-        <w:rPr>
-          <w:rFonts w:ascii="Times New Roman" w:hAnsi="Times New Roman" w:cs="Times New Roman"/>
-          <w:b/>
-          <w:bCs/>
-        </w:rPr>
-        <w:t xml:space="preserve"> (Class weighted)</w:t>
+      <w:r>
+        <w:rPr>
+          <w:rFonts w:ascii="Times New Roman" w:hAnsi="Times New Roman" w:cs="Times New Roman"/>
+          <w:b/>
+          <w:bCs/>
+        </w:rPr>
+        <w:t>CatBoost (Class weighted)</w:t>
       </w:r>
       <w:r>
         <w:rPr>
@@ -9947,95 +8564,21 @@
           <w:bCs/>
         </w:rPr>
         <w:tab/>
-        <w:t xml:space="preserve"> Backend Architecture: </w:t>
-      </w:r>
-      <w:proofErr w:type="spellStart"/>
-      <w:r>
-        <w:rPr>
-          <w:rFonts w:ascii="Times New Roman" w:hAnsi="Times New Roman" w:cs="Times New Roman"/>
-          <w:b/>
-          <w:bCs/>
-        </w:rPr>
-        <w:t>FastAPI</w:t>
-      </w:r>
-      <w:proofErr w:type="spellEnd"/>
-      <w:r>
-        <w:rPr>
-          <w:rFonts w:ascii="Times New Roman" w:hAnsi="Times New Roman" w:cs="Times New Roman"/>
-          <w:b/>
-          <w:bCs/>
-        </w:rPr>
-        <w:t xml:space="preserve"> Fraud Detection API</w:t>
-      </w:r>
-    </w:p>
-    <w:p>
-      <w:pPr>
-        <w:jc w:val="both"/>
-        <w:rPr>
-          <w:rFonts w:ascii="Times New Roman" w:hAnsi="Times New Roman" w:cs="Times New Roman"/>
-        </w:rPr>
-      </w:pPr>
-      <w:r>
-        <w:rPr>
-          <w:rFonts w:ascii="Times New Roman" w:hAnsi="Times New Roman" w:cs="Times New Roman"/>
-        </w:rPr>
-        <w:t xml:space="preserve">The backend, implemented in </w:t>
-      </w:r>
-      <w:proofErr w:type="spellStart"/>
-      <w:r>
-        <w:rPr>
-          <w:rFonts w:ascii="Times New Roman" w:hAnsi="Times New Roman" w:cs="Times New Roman"/>
-        </w:rPr>
-        <w:t>FastAPI</w:t>
-      </w:r>
-      <w:proofErr w:type="spellEnd"/>
-      <w:r>
-        <w:rPr>
-          <w:rFonts w:ascii="Times New Roman" w:hAnsi="Times New Roman" w:cs="Times New Roman"/>
-        </w:rPr>
-        <w:t xml:space="preserve"> (backend/main.py), serves predictions through a POST /predict endpoint for single transactions and a POST /</w:t>
-      </w:r>
-      <w:proofErr w:type="spellStart"/>
-      <w:r>
-        <w:rPr>
-          <w:rFonts w:ascii="Times New Roman" w:hAnsi="Times New Roman" w:cs="Times New Roman"/>
-        </w:rPr>
-        <w:t>predict_batch</w:t>
-      </w:r>
-      <w:proofErr w:type="spellEnd"/>
-      <w:r>
-        <w:rPr>
-          <w:rFonts w:ascii="Times New Roman" w:hAnsi="Times New Roman" w:cs="Times New Roman"/>
-        </w:rPr>
-        <w:t xml:space="preserve"> endpoint for bulk CSV processing. On startup, it loads the tuned </w:t>
-      </w:r>
-      <w:proofErr w:type="spellStart"/>
-      <w:r>
-        <w:rPr>
-          <w:rFonts w:ascii="Times New Roman" w:hAnsi="Times New Roman" w:cs="Times New Roman"/>
-        </w:rPr>
-        <w:t>XGBoost</w:t>
-      </w:r>
-      <w:proofErr w:type="spellEnd"/>
-      <w:r>
-        <w:rPr>
-          <w:rFonts w:ascii="Times New Roman" w:hAnsi="Times New Roman" w:cs="Times New Roman"/>
-        </w:rPr>
-        <w:t xml:space="preserve"> model and fitted scaler (fraud_model.pkl, scaler.pkl) via </w:t>
-      </w:r>
-      <w:proofErr w:type="spellStart"/>
-      <w:r>
-        <w:rPr>
-          <w:rFonts w:ascii="Times New Roman" w:hAnsi="Times New Roman" w:cs="Times New Roman"/>
-        </w:rPr>
-        <w:t>joblib</w:t>
-      </w:r>
-      <w:proofErr w:type="spellEnd"/>
-      <w:r>
-        <w:rPr>
-          <w:rFonts w:ascii="Times New Roman" w:hAnsi="Times New Roman" w:cs="Times New Roman"/>
-        </w:rPr>
-        <w:t>, then processes each incoming transaction through four layers:</w:t>
+        <w:t xml:space="preserve"> Backend Architecture: FastAPI Fraud Detection API</w:t>
+      </w:r>
+    </w:p>
+    <w:p>
+      <w:pPr>
+        <w:jc w:val="both"/>
+        <w:rPr>
+          <w:rFonts w:ascii="Times New Roman" w:hAnsi="Times New Roman" w:cs="Times New Roman"/>
+        </w:rPr>
+      </w:pPr>
+      <w:r>
+        <w:rPr>
+          <w:rFonts w:ascii="Times New Roman" w:hAnsi="Times New Roman" w:cs="Times New Roman"/>
+        </w:rPr>
+        <w:t>The backend, implemented in FastAPI (backend/main.py), serves predictions through a POST /predict endpoint for single transactions and a POST /predict_batch endpoint for bulk CSV processing. On startup, it loads the tuned XGBoost model and fitted scaler (fraud_model.pkl, scaler.pkl) via joblib, then processes each incoming transaction through four layers:</w:t>
       </w:r>
     </w:p>
     <w:p>
@@ -10061,57 +8604,7 @@
         <w:rPr>
           <w:rFonts w:ascii="Times New Roman" w:hAnsi="Times New Roman" w:cs="Times New Roman"/>
         </w:rPr>
-        <w:t xml:space="preserve"> Reconstructs the </w:t>
-      </w:r>
-      <w:proofErr w:type="spellStart"/>
-      <w:r>
-        <w:rPr>
-          <w:rFonts w:ascii="Times New Roman" w:hAnsi="Times New Roman" w:cs="Times New Roman"/>
-        </w:rPr>
-        <w:t>Amount_log</w:t>
-      </w:r>
-      <w:proofErr w:type="spellEnd"/>
-      <w:r>
-        <w:rPr>
-          <w:rFonts w:ascii="Times New Roman" w:hAnsi="Times New Roman" w:cs="Times New Roman"/>
-        </w:rPr>
-        <w:t xml:space="preserve"> feature and applies the same </w:t>
-      </w:r>
-      <w:proofErr w:type="spellStart"/>
-      <w:r>
-        <w:rPr>
-          <w:rFonts w:ascii="Times New Roman" w:hAnsi="Times New Roman" w:cs="Times New Roman"/>
-        </w:rPr>
-        <w:t>StandardScaler</w:t>
-      </w:r>
-      <w:proofErr w:type="spellEnd"/>
-      <w:r>
-        <w:rPr>
-          <w:rFonts w:ascii="Times New Roman" w:hAnsi="Times New Roman" w:cs="Times New Roman"/>
-        </w:rPr>
-        <w:t xml:space="preserve"> transformation (fit during training) to Time and Amount, then aligns columns to </w:t>
-      </w:r>
-      <w:proofErr w:type="spellStart"/>
-      <w:proofErr w:type="gramStart"/>
-      <w:r>
-        <w:rPr>
-          <w:rFonts w:ascii="Times New Roman" w:hAnsi="Times New Roman" w:cs="Times New Roman"/>
-        </w:rPr>
-        <w:t>model.feature</w:t>
-      </w:r>
-      <w:proofErr w:type="gramEnd"/>
-      <w:r>
-        <w:rPr>
-          <w:rFonts w:ascii="Times New Roman" w:hAnsi="Times New Roman" w:cs="Times New Roman"/>
-        </w:rPr>
-        <w:t>_names_in</w:t>
-      </w:r>
-      <w:proofErr w:type="spellEnd"/>
-      <w:r>
-        <w:rPr>
-          <w:rFonts w:ascii="Times New Roman" w:hAnsi="Times New Roman" w:cs="Times New Roman"/>
-        </w:rPr>
-        <w:t>_ before inference – ensuring incoming requests are processed identically to the training pipeline.</w:t>
+        <w:t xml:space="preserve"> Reconstructs the Amount_log feature and applies the same StandardScaler transformation (fit during training) to Time and Amount, then aligns columns to model.feature_names_in_ before inference – ensuring incoming requests are processed identically to the training pipeline.</w:t>
       </w:r>
     </w:p>
     <w:p>
@@ -10137,21 +8630,7 @@
         <w:rPr>
           <w:rFonts w:ascii="Times New Roman" w:hAnsi="Times New Roman" w:cs="Times New Roman"/>
         </w:rPr>
-        <w:t xml:space="preserve"> Returns a binary fraud classification and probability score from the tuned </w:t>
-      </w:r>
-      <w:proofErr w:type="spellStart"/>
-      <w:r>
-        <w:rPr>
-          <w:rFonts w:ascii="Times New Roman" w:hAnsi="Times New Roman" w:cs="Times New Roman"/>
-        </w:rPr>
-        <w:t>XGBoost</w:t>
-      </w:r>
-      <w:proofErr w:type="spellEnd"/>
-      <w:r>
-        <w:rPr>
-          <w:rFonts w:ascii="Times New Roman" w:hAnsi="Times New Roman" w:cs="Times New Roman"/>
-        </w:rPr>
-        <w:t xml:space="preserve"> model.</w:t>
+        <w:t xml:space="preserve"> Returns a binary fraud classification and probability score from the tuned XGBoost model.</w:t>
       </w:r>
     </w:p>
     <w:p>
@@ -10177,21 +8656,7 @@
         <w:rPr>
           <w:rFonts w:ascii="Times New Roman" w:hAnsi="Times New Roman" w:cs="Times New Roman"/>
         </w:rPr>
-        <w:t xml:space="preserve"> Computes deterministic feature attributions (</w:t>
-      </w:r>
-      <w:proofErr w:type="spellStart"/>
-      <w:r>
-        <w:rPr>
-          <w:rFonts w:ascii="Times New Roman" w:hAnsi="Times New Roman" w:cs="Times New Roman"/>
-        </w:rPr>
-        <w:t>get_shap_explanation</w:t>
-      </w:r>
-      <w:proofErr w:type="spellEnd"/>
-      <w:r>
-        <w:rPr>
-          <w:rFonts w:ascii="Times New Roman" w:hAnsi="Times New Roman" w:cs="Times New Roman"/>
-        </w:rPr>
-        <w:t>), identifying which of the 31 input features most influenced that specific prediction – only triggered when a transaction is flagged as fraud, to avoid unnecessary computation on legitimate transactions.</w:t>
+        <w:t xml:space="preserve"> Computes deterministic feature attributions (get_shap_explanation), identifying which of the 31 input features most influenced that specific prediction – only triggered when a transaction is flagged as fraud, to avoid unnecessary computation on legitimate transactions.</w:t>
       </w:r>
     </w:p>
     <w:p>
@@ -10217,35 +8682,7 @@
         <w:rPr>
           <w:rFonts w:ascii="Times New Roman" w:hAnsi="Times New Roman" w:cs="Times New Roman"/>
         </w:rPr>
-        <w:t xml:space="preserve"> Translates SHAP outputs into human-readable explanations (</w:t>
-      </w:r>
-      <w:proofErr w:type="spellStart"/>
-      <w:r>
-        <w:rPr>
-          <w:rFonts w:ascii="Times New Roman" w:hAnsi="Times New Roman" w:cs="Times New Roman"/>
-        </w:rPr>
-        <w:t>generate_llm_explanation</w:t>
-      </w:r>
-      <w:proofErr w:type="spellEnd"/>
-      <w:r>
-        <w:rPr>
-          <w:rFonts w:ascii="Times New Roman" w:hAnsi="Times New Roman" w:cs="Times New Roman"/>
-        </w:rPr>
-        <w:t xml:space="preserve">, via the </w:t>
-      </w:r>
-      <w:proofErr w:type="spellStart"/>
-      <w:r>
-        <w:rPr>
-          <w:rFonts w:ascii="Times New Roman" w:hAnsi="Times New Roman" w:cs="Times New Roman"/>
-        </w:rPr>
-        <w:t>Groq</w:t>
-      </w:r>
-      <w:proofErr w:type="spellEnd"/>
-      <w:r>
-        <w:rPr>
-          <w:rFonts w:ascii="Times New Roman" w:hAnsi="Times New Roman" w:cs="Times New Roman"/>
-        </w:rPr>
-        <w:t xml:space="preserve"> API), giving a fraud analyst plain-language reasoning instead of raw feature attributions.</w:t>
+        <w:t xml:space="preserve"> Translates SHAP outputs into human-readable explanations (generate_llm_explanation, via the Groq API), giving a fraud analyst plain-language reasoning instead of raw feature attributions.</w:t>
       </w:r>
     </w:p>
     <w:p>
@@ -10395,77 +8832,7 @@
         <w:rPr>
           <w:rFonts w:ascii="Times New Roman" w:hAnsi="Times New Roman" w:cs="Times New Roman"/>
         </w:rPr>
-        <w:t xml:space="preserve">The SHAP + LLM explanation pipeline was demonstrated end-to-end on a sample fraud transaction, correctly identifying V14, V10, and V12 as the top contributing features (consistent with the EDA findings above) and generating a structured, analyst-readable explanation. During testing, the </w:t>
-      </w:r>
-      <w:proofErr w:type="spellStart"/>
-      <w:r>
-        <w:rPr>
-          <w:rFonts w:ascii="Times New Roman" w:hAnsi="Times New Roman" w:cs="Times New Roman"/>
-        </w:rPr>
-        <w:t>Groq</w:t>
-      </w:r>
-      <w:proofErr w:type="spellEnd"/>
-      <w:r>
-        <w:rPr>
-          <w:rFonts w:ascii="Times New Roman" w:hAnsi="Times New Roman" w:cs="Times New Roman"/>
-        </w:rPr>
-        <w:t xml:space="preserve"> LLM API calls initially failed because the configured model names (llama-3.3-70b-versatile and others) had been deprecated, returning 404 errors — the system's fallback mechanism handled this gracefully rather than crashing the API, and the candidate model list was updated to current </w:t>
-      </w:r>
-      <w:proofErr w:type="spellStart"/>
-      <w:r>
-        <w:rPr>
-          <w:rFonts w:ascii="Times New Roman" w:hAnsi="Times New Roman" w:cs="Times New Roman"/>
-        </w:rPr>
-        <w:t>Groq</w:t>
-      </w:r>
-      <w:proofErr w:type="spellEnd"/>
-      <w:r>
-        <w:rPr>
-          <w:rFonts w:ascii="Times New Roman" w:hAnsi="Times New Roman" w:cs="Times New Roman"/>
-        </w:rPr>
-        <w:t xml:space="preserve"> offerings (</w:t>
-      </w:r>
-      <w:proofErr w:type="spellStart"/>
-      <w:r>
-        <w:rPr>
-          <w:rFonts w:ascii="Times New Roman" w:hAnsi="Times New Roman" w:cs="Times New Roman"/>
-        </w:rPr>
-        <w:t>openai</w:t>
-      </w:r>
-      <w:proofErr w:type="spellEnd"/>
-      <w:r>
-        <w:rPr>
-          <w:rFonts w:ascii="Times New Roman" w:hAnsi="Times New Roman" w:cs="Times New Roman"/>
-        </w:rPr>
-        <w:t xml:space="preserve">/gpt-oss-20b, </w:t>
-      </w:r>
-      <w:proofErr w:type="spellStart"/>
-      <w:r>
-        <w:rPr>
-          <w:rFonts w:ascii="Times New Roman" w:hAnsi="Times New Roman" w:cs="Times New Roman"/>
-        </w:rPr>
-        <w:t>openai</w:t>
-      </w:r>
-      <w:proofErr w:type="spellEnd"/>
-      <w:r>
-        <w:rPr>
-          <w:rFonts w:ascii="Times New Roman" w:hAnsi="Times New Roman" w:cs="Times New Roman"/>
-        </w:rPr>
-        <w:t xml:space="preserve">/gpt-oss-120b, </w:t>
-      </w:r>
-      <w:proofErr w:type="spellStart"/>
-      <w:r>
-        <w:rPr>
-          <w:rFonts w:ascii="Times New Roman" w:hAnsi="Times New Roman" w:cs="Times New Roman"/>
-        </w:rPr>
-        <w:t>groq</w:t>
-      </w:r>
-      <w:proofErr w:type="spellEnd"/>
-      <w:r>
-        <w:rPr>
-          <w:rFonts w:ascii="Times New Roman" w:hAnsi="Times New Roman" w:cs="Times New Roman"/>
-        </w:rPr>
-        <w:t>/compound-mini), restoring full LLM-generated explanations.</w:t>
+        <w:t>The SHAP + LLM explanation pipeline was demonstrated end-to-end on a sample fraud transaction, correctly identifying V14, V10, and V12 as the top contributing features (consistent with the EDA findings above) and generating a structured, analyst-readable explanation. During testing, the Groq LLM API calls initially failed because the configured model names (llama-3.3-70b-versatile and others) had been deprecated, returning 404 errors — the system's fallback mechanism handled this gracefully rather than crashing the API, and the candidate model list was updated to current Groq offerings (openai/gpt-oss-20b, openai/gpt-oss-120b, groq/compound-mini), restoring full LLM-generated explanations.</w:t>
       </w:r>
     </w:p>
     <w:p>
@@ -10677,35 +9044,7 @@
         <w:rPr>
           <w:rFonts w:ascii="Times New Roman" w:hAnsi="Times New Roman" w:cs="Times New Roman"/>
         </w:rPr>
-        <w:t xml:space="preserve">For this sample transaction, the model predicted fraud with 99.99% confidence. SHAP identified V14, V10, and V12 as the top contributing features, consistent with the EDA findings in Section 3, where these same features showed the clearest separation between fraudulent and legitimate transactions. The LLM explanation layer (powered by </w:t>
-      </w:r>
-      <w:proofErr w:type="spellStart"/>
-      <w:r>
-        <w:rPr>
-          <w:rFonts w:ascii="Times New Roman" w:hAnsi="Times New Roman" w:cs="Times New Roman"/>
-        </w:rPr>
-        <w:t>Groq's</w:t>
-      </w:r>
-      <w:proofErr w:type="spellEnd"/>
-      <w:r>
-        <w:rPr>
-          <w:rFonts w:ascii="Times New Roman" w:hAnsi="Times New Roman" w:cs="Times New Roman"/>
-        </w:rPr>
-        <w:t xml:space="preserve"> </w:t>
-      </w:r>
-      <w:proofErr w:type="spellStart"/>
-      <w:r>
-        <w:rPr>
-          <w:rFonts w:ascii="Times New Roman" w:hAnsi="Times New Roman" w:cs="Times New Roman"/>
-        </w:rPr>
-        <w:t>openai</w:t>
-      </w:r>
-      <w:proofErr w:type="spellEnd"/>
-      <w:r>
-        <w:rPr>
-          <w:rFonts w:ascii="Times New Roman" w:hAnsi="Times New Roman" w:cs="Times New Roman"/>
-        </w:rPr>
-        <w:t>/gpt-oss-20b model) translates this into a structured, analyst-readable summary, explaining what each contributing feature indicates and why it matters for the fraud determination, without requiring the analyst to interpret raw SHAP values or anonymized PCA components directly. This demonstrates the full explainability pipeline exactly as it runs in the deployed API: a prediction is never returned without a corresponding, human-readable justification for why it was flagged.</w:t>
+        <w:t>For this sample transaction, the model predicted fraud with 99.99% confidence. SHAP identified V14, V10, and V12 as the top contributing features, consistent with the EDA findings in Section 3, where these same features showed the clearest separation between fraudulent and legitimate transactions. The LLM explanation layer (powered by Groq's openai/gpt-oss-20b model) translates this into a structured, analyst-readable summary, explaining what each contributing feature indicates and why it matters for the fraud determination, without requiring the analyst to interpret raw SHAP values or anonymized PCA components directly. This demonstrates the full explainability pipeline exactly as it runs in the deployed API: a prediction is never returned without a corresponding, human-readable justification for why it was flagged.</w:t>
       </w:r>
     </w:p>
     <w:p>
@@ -10730,65 +9069,7 @@
           <w:rFonts w:ascii="Times New Roman" w:hAnsi="Times New Roman" w:cs="Times New Roman"/>
         </w:rPr>
         <w:lastRenderedPageBreak/>
-        <w:t xml:space="preserve">The API started cleanly inside the project's virtual environment, with both the model and scaler artifacts loading successfully during </w:t>
-      </w:r>
-      <w:proofErr w:type="spellStart"/>
-      <w:r>
-        <w:rPr>
-          <w:rFonts w:ascii="Times New Roman" w:hAnsi="Times New Roman" w:cs="Times New Roman"/>
-        </w:rPr>
-        <w:t>FastAPI's</w:t>
-      </w:r>
-      <w:proofErr w:type="spellEnd"/>
-      <w:r>
-        <w:rPr>
-          <w:rFonts w:ascii="Times New Roman" w:hAnsi="Times New Roman" w:cs="Times New Roman"/>
-        </w:rPr>
-        <w:t xml:space="preserve"> startup sequence (had either file been missing or corrupted, the try/except </w:t>
-      </w:r>
-      <w:proofErr w:type="spellStart"/>
-      <w:r>
-        <w:rPr>
-          <w:rFonts w:ascii="Times New Roman" w:hAnsi="Times New Roman" w:cs="Times New Roman"/>
-        </w:rPr>
-        <w:t>RuntimeError</w:t>
-      </w:r>
-      <w:proofErr w:type="spellEnd"/>
-      <w:r>
-        <w:rPr>
-          <w:rFonts w:ascii="Times New Roman" w:hAnsi="Times New Roman" w:cs="Times New Roman"/>
-        </w:rPr>
-        <w:t xml:space="preserve"> around </w:t>
-      </w:r>
-      <w:proofErr w:type="spellStart"/>
-      <w:proofErr w:type="gramStart"/>
-      <w:r>
-        <w:rPr>
-          <w:rFonts w:ascii="Times New Roman" w:hAnsi="Times New Roman" w:cs="Times New Roman"/>
-        </w:rPr>
-        <w:t>joblib.load</w:t>
-      </w:r>
-      <w:proofErr w:type="spellEnd"/>
-      <w:proofErr w:type="gramEnd"/>
-      <w:r>
-        <w:rPr>
-          <w:rFonts w:ascii="Times New Roman" w:hAnsi="Times New Roman" w:cs="Times New Roman"/>
-        </w:rPr>
-        <w:t xml:space="preserve">(...) in main.py would have raised an error here instead). The API was then validated end-to-end through the </w:t>
-      </w:r>
-      <w:proofErr w:type="spellStart"/>
-      <w:r>
-        <w:rPr>
-          <w:rFonts w:ascii="Times New Roman" w:hAnsi="Times New Roman" w:cs="Times New Roman"/>
-        </w:rPr>
-        <w:t>Streamlit</w:t>
-      </w:r>
-      <w:proofErr w:type="spellEnd"/>
-      <w:r>
-        <w:rPr>
-          <w:rFonts w:ascii="Times New Roman" w:hAnsi="Times New Roman" w:cs="Times New Roman"/>
-        </w:rPr>
-        <w:t xml:space="preserve"> dashboard: a real transaction submitted via Manual Entry Mode returned a </w:t>
+        <w:t xml:space="preserve">The API started cleanly inside the project's virtual environment, with both the model and scaler artifacts loading successfully during FastAPI's startup sequence (had either file been missing or corrupted, the try/except RuntimeError around joblib.load(...) in main.py would have raised an error here instead). The API was then validated end-to-end through the Streamlit dashboard: a real transaction submitted via Manual Entry Mode returned a </w:t>
       </w:r>
       <w:r>
         <w:rPr>
@@ -10893,25 +9174,7 @@
           <w:b/>
           <w:bCs/>
         </w:rPr>
-        <w:t xml:space="preserve">Figure 9: </w:t>
-      </w:r>
-      <w:proofErr w:type="spellStart"/>
-      <w:r>
-        <w:rPr>
-          <w:rFonts w:ascii="Times New Roman" w:hAnsi="Times New Roman" w:cs="Times New Roman"/>
-          <w:b/>
-          <w:bCs/>
-        </w:rPr>
-        <w:t>FastAPI</w:t>
-      </w:r>
-      <w:proofErr w:type="spellEnd"/>
-      <w:r>
-        <w:rPr>
-          <w:rFonts w:ascii="Times New Roman" w:hAnsi="Times New Roman" w:cs="Times New Roman"/>
-          <w:b/>
-          <w:bCs/>
-        </w:rPr>
-        <w:t xml:space="preserve"> deployment</w:t>
+        <w:t>Figure 9: FastAPI deployment</w:t>
       </w:r>
     </w:p>
     <w:p>
@@ -10954,23 +9217,13 @@
         </w:rPr>
         <w:t xml:space="preserve">The </w:t>
       </w:r>
-      <w:proofErr w:type="spellStart"/>
-      <w:r>
-        <w:rPr>
-          <w:rFonts w:ascii="Times New Roman" w:hAnsi="Times New Roman" w:cs="Times New Roman"/>
-          <w:b/>
-          <w:bCs/>
-        </w:rPr>
-        <w:t>Streamlit</w:t>
-      </w:r>
-      <w:proofErr w:type="spellEnd"/>
-      <w:r>
-        <w:rPr>
-          <w:rFonts w:ascii="Times New Roman" w:hAnsi="Times New Roman" w:cs="Times New Roman"/>
-          <w:b/>
-          <w:bCs/>
-        </w:rPr>
-        <w:t xml:space="preserve"> UI</w:t>
+      <w:r>
+        <w:rPr>
+          <w:rFonts w:ascii="Times New Roman" w:hAnsi="Times New Roman" w:cs="Times New Roman"/>
+          <w:b/>
+          <w:bCs/>
+        </w:rPr>
+        <w:t>Streamlit UI</w:t>
       </w:r>
       <w:r>
         <w:rPr>
@@ -11095,25 +9348,7 @@
           <w:b/>
           <w:bCs/>
         </w:rPr>
-        <w:t xml:space="preserve">Figure 10: </w:t>
-      </w:r>
-      <w:proofErr w:type="spellStart"/>
-      <w:r>
-        <w:rPr>
-          <w:rFonts w:ascii="Times New Roman" w:hAnsi="Times New Roman" w:cs="Times New Roman"/>
-          <w:b/>
-          <w:bCs/>
-        </w:rPr>
-        <w:t>Streamlit</w:t>
-      </w:r>
-      <w:proofErr w:type="spellEnd"/>
-      <w:r>
-        <w:rPr>
-          <w:rFonts w:ascii="Times New Roman" w:hAnsi="Times New Roman" w:cs="Times New Roman"/>
-          <w:b/>
-          <w:bCs/>
-        </w:rPr>
-        <w:t xml:space="preserve"> Interface Layout</w:t>
+        <w:t>Figure 10: Streamlit Interface Layout</w:t>
       </w:r>
     </w:p>
     <w:p>
@@ -11128,25 +9363,7 @@
           <w:rFonts w:ascii="Times New Roman" w:hAnsi="Times New Roman" w:cs="Times New Roman"/>
         </w:rPr>
         <w:lastRenderedPageBreak/>
-        <w:t>F</w:t>
-      </w:r>
-      <w:r>
-        <w:rPr>
-          <w:rFonts w:ascii="Times New Roman" w:hAnsi="Times New Roman" w:cs="Times New Roman"/>
-        </w:rPr>
-        <w:t>igure</w:t>
-      </w:r>
-      <w:r>
-        <w:rPr>
-          <w:rFonts w:ascii="Times New Roman" w:hAnsi="Times New Roman" w:cs="Times New Roman"/>
-        </w:rPr>
-        <w:t xml:space="preserve"> 10</w:t>
-      </w:r>
-      <w:r>
-        <w:rPr>
-          <w:rFonts w:ascii="Times New Roman" w:hAnsi="Times New Roman" w:cs="Times New Roman"/>
-        </w:rPr>
-        <w:t xml:space="preserve"> illustrates the frontend graphical user interface (GUI) developed for the real-time fraud detection system. Serving as the primary interaction layer, the interface enables users to evaluate transactions through two distinct operating modalities: manual data entry for isolated assessments and bulk CSV uploads for batch processing. The sidebar allows precise input of critical transaction features, including time elapsed, monetary amount, and V1-V28 PCA components. Upon execution via the "Run Assessment" button, the application queries the backend machine learning API to retrieve instantaneous predictions. Ultimately, this interface bridges complex backend analytical models with end-users, facilitating seamless, practical real-world fraud evaluation.</w:t>
+        <w:t>Figure 10 illustrates the frontend graphical user interface (GUI) developed for the real-time fraud detection system. Serving as the primary interaction layer, the interface enables users to evaluate transactions through two distinct operating modalities: manual data entry for isolated assessments and bulk CSV uploads for batch processing. The sidebar allows precise input of critical transaction features, including time elapsed, monetary amount, and V1-V28 PCA components. Upon execution via the "Run Assessment" button, the application queries the backend machine learning API to retrieve instantaneous predictions. Ultimately, this interface bridges complex backend analytical models with end-users, facilitating seamless, practical real-world fraud evaluation.</w:t>
       </w:r>
     </w:p>
     <w:p>
@@ -11187,91 +9404,21 @@
         <w:rPr>
           <w:rFonts w:ascii="Times New Roman" w:hAnsi="Times New Roman" w:cs="Times New Roman"/>
         </w:rPr>
-        <w:t xml:space="preserve">Beyond the notebook demonstration, the full system was validated end-to-end through the running </w:t>
-      </w:r>
-      <w:proofErr w:type="spellStart"/>
-      <w:r>
-        <w:rPr>
-          <w:rFonts w:ascii="Times New Roman" w:hAnsi="Times New Roman" w:cs="Times New Roman"/>
-        </w:rPr>
-        <w:t>FastAPI</w:t>
-      </w:r>
-      <w:proofErr w:type="spellEnd"/>
-      <w:r>
-        <w:rPr>
-          <w:rFonts w:ascii="Times New Roman" w:hAnsi="Times New Roman" w:cs="Times New Roman"/>
-        </w:rPr>
-        <w:t xml:space="preserve"> backend and </w:t>
-      </w:r>
-      <w:proofErr w:type="spellStart"/>
-      <w:r>
-        <w:rPr>
-          <w:rFonts w:ascii="Times New Roman" w:hAnsi="Times New Roman" w:cs="Times New Roman"/>
-        </w:rPr>
-        <w:t>Streamlit</w:t>
-      </w:r>
-      <w:proofErr w:type="spellEnd"/>
-      <w:r>
-        <w:rPr>
-          <w:rFonts w:ascii="Times New Roman" w:hAnsi="Times New Roman" w:cs="Times New Roman"/>
-        </w:rPr>
-        <w:t xml:space="preserve"> dashboard, using a real transaction sampled from the held-out test set. The dashboard correctly returned a 99.99% fraud probability, with SHAP identifying V14, V10, and V12 as the top contributing features – consistent with every prior finding in this report (the EDA correlation analysis, the KDE distribution plots, and the notebook's own SHAP demo), giving strong, independently corroborated evidence that the deployed system behaves identically to the model as trained and evaluated in the notebook.</w:t>
-      </w:r>
-    </w:p>
-    <w:p>
-      <w:pPr>
-        <w:jc w:val="both"/>
-        <w:rPr>
-          <w:rFonts w:ascii="Times New Roman" w:hAnsi="Times New Roman" w:cs="Times New Roman"/>
-        </w:rPr>
-      </w:pPr>
-      <w:r>
-        <w:rPr>
-          <w:rFonts w:ascii="Times New Roman" w:hAnsi="Times New Roman" w:cs="Times New Roman"/>
-        </w:rPr>
-        <w:t xml:space="preserve">During this live test, a second issue was found: the LLM-generated explanation rendered as a visibly truncated markdown table, cutting off mid-sentence. The cause was </w:t>
-      </w:r>
-      <w:proofErr w:type="spellStart"/>
-      <w:r>
-        <w:rPr>
-          <w:rFonts w:ascii="Times New Roman" w:hAnsi="Times New Roman" w:cs="Times New Roman"/>
-        </w:rPr>
-        <w:t>generate_llm_explanation's</w:t>
-      </w:r>
-      <w:proofErr w:type="spellEnd"/>
-      <w:r>
-        <w:rPr>
-          <w:rFonts w:ascii="Times New Roman" w:hAnsi="Times New Roman" w:cs="Times New Roman"/>
-        </w:rPr>
-        <w:t xml:space="preserve"> </w:t>
-      </w:r>
-      <w:proofErr w:type="spellStart"/>
-      <w:r>
-        <w:rPr>
-          <w:rFonts w:ascii="Times New Roman" w:hAnsi="Times New Roman" w:cs="Times New Roman"/>
-        </w:rPr>
-        <w:t>max_completion_tokens</w:t>
-      </w:r>
-      <w:proofErr w:type="spellEnd"/>
-      <w:r>
-        <w:rPr>
-          <w:rFonts w:ascii="Times New Roman" w:hAnsi="Times New Roman" w:cs="Times New Roman"/>
-        </w:rPr>
-        <w:t xml:space="preserve">=150 parameter – sufficient for a short paragraph, but too small for the explanation required. This was fixed by raising </w:t>
-      </w:r>
-      <w:proofErr w:type="spellStart"/>
-      <w:r>
-        <w:rPr>
-          <w:rFonts w:ascii="Times New Roman" w:hAnsi="Times New Roman" w:cs="Times New Roman"/>
-        </w:rPr>
-        <w:t>max_completion_tokens</w:t>
-      </w:r>
-      <w:proofErr w:type="spellEnd"/>
-      <w:r>
-        <w:rPr>
-          <w:rFonts w:ascii="Times New Roman" w:hAnsi="Times New Roman" w:cs="Times New Roman"/>
-        </w:rPr>
-        <w:t xml:space="preserve"> to 400 in backend/explain.py.</w:t>
+        <w:t>Beyond the notebook demonstration, the full system was validated end-to-end through the running FastAPI backend and Streamlit dashboard, using a real transaction sampled from the held-out test set. The dashboard correctly returned a 99.99% fraud probability, with SHAP identifying V14, V10, and V12 as the top contributing features – consistent with every prior finding in this report (the EDA correlation analysis, the KDE distribution plots, and the notebook's own SHAP demo), giving strong, independently corroborated evidence that the deployed system behaves identically to the model as trained and evaluated in the notebook.</w:t>
+      </w:r>
+    </w:p>
+    <w:p>
+      <w:pPr>
+        <w:jc w:val="both"/>
+        <w:rPr>
+          <w:rFonts w:ascii="Times New Roman" w:hAnsi="Times New Roman" w:cs="Times New Roman"/>
+        </w:rPr>
+      </w:pPr>
+      <w:r>
+        <w:rPr>
+          <w:rFonts w:ascii="Times New Roman" w:hAnsi="Times New Roman" w:cs="Times New Roman"/>
+        </w:rPr>
+        <w:t>During this live test, a second issue was found: the LLM-generated explanation rendered as a visibly truncated markdown table, cutting off mid-sentence. The cause was generate_llm_explanation's max_completion_tokens=150 parameter – sufficient for a short paragraph, but too small for the explanation required. This was fixed by raising max_completion_tokens to 400 in backend/explain.py.</w:t>
       </w:r>
     </w:p>
     <w:p>
@@ -11458,61 +9605,42 @@
         <w:rPr>
           <w:rFonts w:ascii="Times New Roman" w:hAnsi="Times New Roman" w:cs="Times New Roman"/>
         </w:rPr>
-        <w:t>Figure 13</w:t>
-      </w:r>
-      <w:r>
-        <w:rPr>
-          <w:rFonts w:ascii="Times New Roman" w:hAnsi="Times New Roman" w:cs="Times New Roman"/>
-        </w:rPr>
-        <w:t xml:space="preserve"> shows the </w:t>
-      </w:r>
-      <w:proofErr w:type="spellStart"/>
-      <w:r>
-        <w:rPr>
-          <w:rFonts w:ascii="Times New Roman" w:hAnsi="Times New Roman" w:cs="Times New Roman"/>
-        </w:rPr>
-        <w:t>Streamlit</w:t>
-      </w:r>
-      <w:proofErr w:type="spellEnd"/>
-      <w:r>
-        <w:rPr>
-          <w:rFonts w:ascii="Times New Roman" w:hAnsi="Times New Roman" w:cs="Times New Roman"/>
-        </w:rPr>
-        <w:t xml:space="preserve"> dashboard's CSV Batch Processing Mode interface, activated via the "Select Operating Mode" toggle. The panel instructs users to upload a CSV containing the required columns (Time, Amount, V1–V28), matching the 30 raw input features the backend model expects. An "Upload" component accepts files up to 200MB, supporting realistic bulk-transaction workloads rather than single-record testing alone. The presence of this fully functional upload interface confirms the frontend correctly supports the batch-prediction pathway end-to-end, alongside the previously validated Manual Entry Mode.</w:t>
-      </w:r>
-    </w:p>
-    <w:p>
-      <w:pPr>
-        <w:jc w:val="both"/>
-        <w:rPr>
-          <w:rFonts w:ascii="Times New Roman" w:hAnsi="Times New Roman" w:cs="Times New Roman"/>
-        </w:rPr>
-      </w:pPr>
-    </w:p>
-    <w:p>
-      <w:pPr>
-        <w:jc w:val="both"/>
-        <w:rPr>
-          <w:rFonts w:ascii="Times New Roman" w:hAnsi="Times New Roman" w:cs="Times New Roman"/>
-          <w:b/>
-          <w:bCs/>
-        </w:rPr>
-      </w:pPr>
-    </w:p>
-    <w:p>
-      <w:pPr>
-        <w:jc w:val="both"/>
-        <w:rPr>
-          <w:rFonts w:ascii="Times New Roman" w:hAnsi="Times New Roman" w:cs="Times New Roman"/>
-          <w:b/>
-          <w:bCs/>
-        </w:rPr>
-      </w:pPr>
-      <w:r>
-        <w:rPr>
-          <w:rFonts w:ascii="Times New Roman" w:hAnsi="Times New Roman" w:cs="Times New Roman"/>
-          <w:b/>
-          <w:bCs/>
+        <w:t>Figure 13 shows the Streamlit dashboard's CSV Batch Processing Mode interface, activated via the "Select Operating Mode" toggle. The panel instructs users to upload a CSV containing the required columns (Time, Amount, V1–V28), matching the 30 raw input features the backend model expects. An "Upload" component accepts files up to 200MB, supporting realistic bulk-transaction workloads rather than single-record testing alone. The presence of this fully functional upload interface confirms the frontend correctly supports the batch-prediction pathway end-to-end, alongside the previously validated Manual Entry Mode.</w:t>
+      </w:r>
+    </w:p>
+    <w:p>
+      <w:pPr>
+        <w:jc w:val="both"/>
+        <w:rPr>
+          <w:rFonts w:ascii="Times New Roman" w:hAnsi="Times New Roman" w:cs="Times New Roman"/>
+        </w:rPr>
+      </w:pPr>
+    </w:p>
+    <w:p>
+      <w:pPr>
+        <w:jc w:val="both"/>
+        <w:rPr>
+          <w:rFonts w:ascii="Times New Roman" w:hAnsi="Times New Roman" w:cs="Times New Roman"/>
+          <w:b/>
+          <w:bCs/>
+        </w:rPr>
+      </w:pPr>
+    </w:p>
+    <w:p>
+      <w:pPr>
+        <w:jc w:val="both"/>
+        <w:rPr>
+          <w:rFonts w:ascii="Times New Roman" w:hAnsi="Times New Roman" w:cs="Times New Roman"/>
+          <w:b/>
+          <w:bCs/>
+        </w:rPr>
+      </w:pPr>
+      <w:r>
+        <w:rPr>
+          <w:rFonts w:ascii="Times New Roman" w:hAnsi="Times New Roman" w:cs="Times New Roman"/>
+          <w:b/>
+          <w:bCs/>
+          <w:noProof/>
         </w:rPr>
         <w:drawing>
           <wp:inline distT="0" distB="0" distL="0" distR="0" wp14:anchorId="47382508" wp14:editId="4FF184B7">
@@ -11580,143 +9708,42 @@
         <w:rPr>
           <w:rFonts w:ascii="Times New Roman" w:hAnsi="Times New Roman" w:cs="Times New Roman"/>
         </w:rPr>
-        <w:t xml:space="preserve">A test CSV was generated directly from the model's held-out test set to validate the batch prediction pathway with known, verifiable outcomes. Using </w:t>
-      </w:r>
-      <w:proofErr w:type="spellStart"/>
-      <w:r>
-        <w:rPr>
-          <w:rFonts w:ascii="Times New Roman" w:hAnsi="Times New Roman" w:cs="Times New Roman"/>
-        </w:rPr>
-        <w:t>X_test</w:t>
-      </w:r>
-      <w:proofErr w:type="spellEnd"/>
-      <w:r>
-        <w:rPr>
-          <w:rFonts w:ascii="Times New Roman" w:hAnsi="Times New Roman" w:cs="Times New Roman"/>
-        </w:rPr>
-        <w:t xml:space="preserve"> and </w:t>
-      </w:r>
-      <w:proofErr w:type="spellStart"/>
-      <w:r>
-        <w:rPr>
-          <w:rFonts w:ascii="Times New Roman" w:hAnsi="Times New Roman" w:cs="Times New Roman"/>
-        </w:rPr>
-        <w:t>y_test</w:t>
-      </w:r>
-      <w:proofErr w:type="spellEnd"/>
-      <w:r>
-        <w:rPr>
-          <w:rFonts w:ascii="Times New Roman" w:hAnsi="Times New Roman" w:cs="Times New Roman"/>
-        </w:rPr>
-        <w:t xml:space="preserve">, three confirmed fraudulent transactions and ten confirmed legitimate transactions were sampled and concatenated, producing a 13-row file (test_batch_sample.csv, 7.0KB) containing all required columns (Time, Amount, V1–V28). This composition </w:t>
-      </w:r>
-      <w:r>
-        <w:rPr>
-          <w:rFonts w:ascii="Times New Roman" w:hAnsi="Times New Roman" w:cs="Times New Roman"/>
-        </w:rPr>
-        <w:t xml:space="preserve">– </w:t>
-      </w:r>
-      <w:r>
-        <w:rPr>
-          <w:rFonts w:ascii="Times New Roman" w:hAnsi="Times New Roman" w:cs="Times New Roman"/>
-        </w:rPr>
-        <w:t>a</w:t>
-      </w:r>
-      <w:r>
-        <w:rPr>
-          <w:rFonts w:ascii="Times New Roman" w:hAnsi="Times New Roman" w:cs="Times New Roman"/>
-        </w:rPr>
-        <w:t xml:space="preserve"> </w:t>
-      </w:r>
-      <w:r>
-        <w:rPr>
-          <w:rFonts w:ascii="Times New Roman" w:hAnsi="Times New Roman" w:cs="Times New Roman"/>
-        </w:rPr>
-        <w:t>deliberate mix rather than a random sample</w:t>
-      </w:r>
-      <w:r>
-        <w:rPr>
-          <w:rFonts w:ascii="Times New Roman" w:hAnsi="Times New Roman" w:cs="Times New Roman"/>
-        </w:rPr>
-        <w:t xml:space="preserve"> –</w:t>
-      </w:r>
-      <w:r>
-        <w:rPr>
-          <w:rFonts w:ascii="Times New Roman" w:hAnsi="Times New Roman" w:cs="Times New Roman"/>
-        </w:rPr>
-        <w:t xml:space="preserve"> </w:t>
-      </w:r>
-      <w:r>
-        <w:rPr>
-          <w:rFonts w:ascii="Times New Roman" w:hAnsi="Times New Roman" w:cs="Times New Roman"/>
-        </w:rPr>
-        <w:t>allowed the</w:t>
-      </w:r>
-      <w:r>
-        <w:rPr>
-          <w:rFonts w:ascii="Times New Roman" w:hAnsi="Times New Roman" w:cs="Times New Roman"/>
-        </w:rPr>
-        <w:t xml:space="preserve"> batch endpoint's fraud-detection accuracy to be checked against a known ground truth. As shown</w:t>
-      </w:r>
-      <w:r>
-        <w:rPr>
-          <w:rFonts w:ascii="Times New Roman" w:hAnsi="Times New Roman" w:cs="Times New Roman"/>
-        </w:rPr>
-        <w:t xml:space="preserve"> in figure 14</w:t>
-      </w:r>
-      <w:r>
-        <w:rPr>
-          <w:rFonts w:ascii="Times New Roman" w:hAnsi="Times New Roman" w:cs="Times New Roman"/>
-        </w:rPr>
-        <w:t xml:space="preserve">, </w:t>
-      </w:r>
-      <w:proofErr w:type="spellStart"/>
-      <w:r>
-        <w:rPr>
-          <w:rFonts w:ascii="Times New Roman" w:hAnsi="Times New Roman" w:cs="Times New Roman"/>
-        </w:rPr>
-        <w:t>Streamlit's</w:t>
-      </w:r>
-      <w:proofErr w:type="spellEnd"/>
-      <w:r>
-        <w:rPr>
-          <w:rFonts w:ascii="Times New Roman" w:hAnsi="Times New Roman" w:cs="Times New Roman"/>
-        </w:rPr>
-        <w:t xml:space="preserve"> file uploader correctly parsed the file, confirming "Loaded 13 transactions from CSV," validating both the upload mechanism and the CSV's structural compliance with the API's expected schema before batch processing was triggered.</w:t>
-      </w:r>
-    </w:p>
-    <w:p>
-      <w:pPr>
-        <w:jc w:val="both"/>
-        <w:rPr>
-          <w:rFonts w:ascii="Times New Roman" w:hAnsi="Times New Roman" w:cs="Times New Roman"/>
-        </w:rPr>
-      </w:pPr>
-    </w:p>
-    <w:p>
-      <w:pPr>
-        <w:jc w:val="both"/>
-        <w:rPr>
-          <w:rFonts w:ascii="Times New Roman" w:hAnsi="Times New Roman" w:cs="Times New Roman"/>
-          <w:b/>
-          <w:bCs/>
-        </w:rPr>
-      </w:pPr>
-    </w:p>
-    <w:p>
-      <w:pPr>
-        <w:jc w:val="both"/>
-        <w:rPr>
-          <w:rFonts w:ascii="Times New Roman" w:hAnsi="Times New Roman" w:cs="Times New Roman"/>
-          <w:b/>
-          <w:bCs/>
-        </w:rPr>
-      </w:pPr>
-      <w:r>
-        <w:rPr>
-          <w:rFonts w:ascii="Times New Roman" w:hAnsi="Times New Roman" w:cs="Times New Roman"/>
-          <w:b/>
-          <w:bCs/>
+        <w:t>A test CSV was generated directly from the model's held-out test set to validate the batch prediction pathway with known, verifiable outcomes. Using X_test and y_test, three confirmed fraudulent transactions and ten confirmed legitimate transactions were sampled and concatenated, producing a 13-row file (test_batch_sample.csv, 7.0KB) containing all required columns (Time, Amount, V1–V28). This composition – a deliberate mix rather than a random sample – allowed the batch endpoint's fraud-detection accuracy to be checked against a known ground truth. As shown in figure 14, Streamlit's file uploader correctly parsed the file, confirming "Loaded 13 transactions from CSV," validating both the upload mechanism and the CSV's structural compliance with the API's expected schema before batch processing was triggered.</w:t>
+      </w:r>
+    </w:p>
+    <w:p>
+      <w:pPr>
+        <w:jc w:val="both"/>
+        <w:rPr>
+          <w:rFonts w:ascii="Times New Roman" w:hAnsi="Times New Roman" w:cs="Times New Roman"/>
+        </w:rPr>
+      </w:pPr>
+    </w:p>
+    <w:p>
+      <w:pPr>
+        <w:jc w:val="both"/>
+        <w:rPr>
+          <w:rFonts w:ascii="Times New Roman" w:hAnsi="Times New Roman" w:cs="Times New Roman"/>
+          <w:b/>
+          <w:bCs/>
+        </w:rPr>
+      </w:pPr>
+    </w:p>
+    <w:p>
+      <w:pPr>
+        <w:jc w:val="both"/>
+        <w:rPr>
+          <w:rFonts w:ascii="Times New Roman" w:hAnsi="Times New Roman" w:cs="Times New Roman"/>
+          <w:b/>
+          <w:bCs/>
+        </w:rPr>
+      </w:pPr>
+      <w:r>
+        <w:rPr>
+          <w:rFonts w:ascii="Times New Roman" w:hAnsi="Times New Roman" w:cs="Times New Roman"/>
+          <w:b/>
+          <w:bCs/>
+          <w:noProof/>
         </w:rPr>
         <w:lastRenderedPageBreak/>
         <w:drawing>
@@ -11771,36 +9798,16 @@
           <w:b/>
           <w:bCs/>
         </w:rPr>
-        <w:t xml:space="preserve">Figure 14: </w:t>
-      </w:r>
-      <w:proofErr w:type="spellStart"/>
-      <w:r>
-        <w:rPr>
-          <w:rFonts w:ascii="Times New Roman" w:hAnsi="Times New Roman" w:cs="Times New Roman"/>
-          <w:b/>
-          <w:bCs/>
-        </w:rPr>
-        <w:t>Streamlit</w:t>
-      </w:r>
-      <w:proofErr w:type="spellEnd"/>
-      <w:r>
-        <w:rPr>
-          <w:rFonts w:ascii="Times New Roman" w:hAnsi="Times New Roman" w:cs="Times New Roman"/>
-          <w:b/>
-          <w:bCs/>
-        </w:rPr>
-        <w:t xml:space="preserve"> CSV Batch Upload – </w:t>
-      </w:r>
-      <w:proofErr w:type="gramStart"/>
-      <w:r>
-        <w:rPr>
-          <w:rFonts w:ascii="Times New Roman" w:hAnsi="Times New Roman" w:cs="Times New Roman"/>
-          <w:b/>
-          <w:bCs/>
-        </w:rPr>
-        <w:t>Sample  File</w:t>
-      </w:r>
-      <w:proofErr w:type="gramEnd"/>
+        <w:t xml:space="preserve">Figure 14: Streamlit CSV Batch Upload – </w:t>
+      </w:r>
+      <w:r>
+        <w:rPr>
+          <w:rFonts w:ascii="Times New Roman" w:hAnsi="Times New Roman" w:cs="Times New Roman"/>
+          <w:b/>
+          <w:bCs/>
+        </w:rPr>
+        <w:t>Sample File</w:t>
+      </w:r>
       <w:r>
         <w:rPr>
           <w:rFonts w:ascii="Times New Roman" w:hAnsi="Times New Roman" w:cs="Times New Roman"/>
@@ -11815,145 +9822,25 @@
         <w:jc w:val="both"/>
         <w:rPr>
           <w:rFonts w:ascii="Times New Roman" w:hAnsi="Times New Roman" w:cs="Times New Roman"/>
-          <w:b/>
-          <w:bCs/>
-        </w:rPr>
-      </w:pPr>
-    </w:p>
-    <w:p>
-      <w:pPr>
-        <w:jc w:val="both"/>
-        <w:rPr>
-          <w:rFonts w:ascii="Times New Roman" w:hAnsi="Times New Roman" w:cs="Times New Roman"/>
-        </w:rPr>
-      </w:pPr>
-      <w:r>
-        <w:rPr>
-          <w:rFonts w:ascii="Times New Roman" w:hAnsi="Times New Roman" w:cs="Times New Roman"/>
-        </w:rPr>
-        <w:t>Figure 15 shows</w:t>
-      </w:r>
-      <w:r>
-        <w:rPr>
-          <w:rFonts w:ascii="Times New Roman" w:hAnsi="Times New Roman" w:cs="Times New Roman"/>
-        </w:rPr>
-        <w:t xml:space="preserve"> a sequential debugging process for the /</w:t>
-      </w:r>
-      <w:proofErr w:type="spellStart"/>
-      <w:r>
-        <w:rPr>
-          <w:rFonts w:ascii="Times New Roman" w:hAnsi="Times New Roman" w:cs="Times New Roman"/>
-        </w:rPr>
-        <w:t>predict_batch</w:t>
-      </w:r>
-      <w:proofErr w:type="spellEnd"/>
-      <w:r>
-        <w:rPr>
-          <w:rFonts w:ascii="Times New Roman" w:hAnsi="Times New Roman" w:cs="Times New Roman"/>
-        </w:rPr>
-        <w:t xml:space="preserve"> endpoint, each surfacing a distinct failure mode before the pipeline reached a working state. The first (a </w:t>
-      </w:r>
-      <w:proofErr w:type="spellStart"/>
-      <w:r>
-        <w:rPr>
-          <w:rFonts w:ascii="Times New Roman" w:hAnsi="Times New Roman" w:cs="Times New Roman"/>
-        </w:rPr>
-        <w:t>ConnectionError</w:t>
-      </w:r>
-      <w:proofErr w:type="spellEnd"/>
-      <w:r>
-        <w:rPr>
-          <w:rFonts w:ascii="Times New Roman" w:hAnsi="Times New Roman" w:cs="Times New Roman"/>
-        </w:rPr>
-        <w:t xml:space="preserve">) indicated the </w:t>
-      </w:r>
-      <w:proofErr w:type="spellStart"/>
-      <w:r>
-        <w:rPr>
-          <w:rFonts w:ascii="Times New Roman" w:hAnsi="Times New Roman" w:cs="Times New Roman"/>
-        </w:rPr>
-        <w:t>FastAPI</w:t>
-      </w:r>
-      <w:proofErr w:type="spellEnd"/>
-      <w:r>
-        <w:rPr>
-          <w:rFonts w:ascii="Times New Roman" w:hAnsi="Times New Roman" w:cs="Times New Roman"/>
-        </w:rPr>
-        <w:t xml:space="preserve"> backend was not running at the time of the request </w:t>
-      </w:r>
-      <w:r>
-        <w:rPr>
-          <w:rFonts w:ascii="Times New Roman" w:hAnsi="Times New Roman" w:cs="Times New Roman"/>
-        </w:rPr>
-        <w:t xml:space="preserve">– </w:t>
-      </w:r>
-      <w:proofErr w:type="gramStart"/>
-      <w:r>
-        <w:rPr>
-          <w:rFonts w:ascii="Times New Roman" w:hAnsi="Times New Roman" w:cs="Times New Roman"/>
-        </w:rPr>
-        <w:t>resolved</w:t>
-      </w:r>
-      <w:r>
-        <w:rPr>
-          <w:rFonts w:ascii="Times New Roman" w:hAnsi="Times New Roman" w:cs="Times New Roman"/>
-        </w:rPr>
-        <w:t xml:space="preserve"> </w:t>
-      </w:r>
-      <w:r>
-        <w:rPr>
-          <w:rFonts w:ascii="Times New Roman" w:hAnsi="Times New Roman" w:cs="Times New Roman"/>
-        </w:rPr>
-        <w:t xml:space="preserve"> by</w:t>
-      </w:r>
-      <w:proofErr w:type="gramEnd"/>
-      <w:r>
-        <w:rPr>
-          <w:rFonts w:ascii="Times New Roman" w:hAnsi="Times New Roman" w:cs="Times New Roman"/>
-        </w:rPr>
-        <w:t xml:space="preserve"> starting the </w:t>
-      </w:r>
-      <w:proofErr w:type="spellStart"/>
-      <w:r>
-        <w:rPr>
-          <w:rFonts w:ascii="Times New Roman" w:hAnsi="Times New Roman" w:cs="Times New Roman"/>
-        </w:rPr>
-        <w:t>uvicorn</w:t>
-      </w:r>
-      <w:proofErr w:type="spellEnd"/>
-      <w:r>
-        <w:rPr>
-          <w:rFonts w:ascii="Times New Roman" w:hAnsi="Times New Roman" w:cs="Times New Roman"/>
-        </w:rPr>
-        <w:t xml:space="preserve"> server. The second (API Error 500: Internal Server Error) traced to a missing from typing import List import, causing </w:t>
-      </w:r>
-      <w:proofErr w:type="spellStart"/>
-      <w:r>
-        <w:rPr>
-          <w:rFonts w:ascii="Times New Roman" w:hAnsi="Times New Roman" w:cs="Times New Roman"/>
-        </w:rPr>
-        <w:t>Pydantic</w:t>
-      </w:r>
-      <w:proofErr w:type="spellEnd"/>
-      <w:r>
-        <w:rPr>
-          <w:rFonts w:ascii="Times New Roman" w:hAnsi="Times New Roman" w:cs="Times New Roman"/>
-        </w:rPr>
-        <w:t xml:space="preserve"> to fail resolving the </w:t>
-      </w:r>
-      <w:proofErr w:type="spellStart"/>
-      <w:r>
-        <w:rPr>
-          <w:rFonts w:ascii="Times New Roman" w:hAnsi="Times New Roman" w:cs="Times New Roman"/>
-        </w:rPr>
-        <w:t>TransactionBatch</w:t>
-      </w:r>
-      <w:proofErr w:type="spellEnd"/>
-      <w:r>
-        <w:rPr>
-          <w:rFonts w:ascii="Times New Roman" w:hAnsi="Times New Roman" w:cs="Times New Roman"/>
-        </w:rPr>
-        <w:t xml:space="preserve"> schema at request time; adding the import and restarting the backend resolved it. The third error, occurring only </w:t>
+        </w:rPr>
+      </w:pPr>
+      <w:r>
+        <w:rPr>
+          <w:rFonts w:ascii="Times New Roman" w:hAnsi="Times New Roman" w:cs="Times New Roman"/>
+        </w:rPr>
+        <w:t xml:space="preserve">Figure 15 shows a sequential debugging process for the /predict_batch endpoint, each surfacing a distinct failure mode before the pipeline reached a working state. The first (a ConnectionError) indicated the FastAPI backend was not running at the time of the request – </w:t>
+      </w:r>
+      <w:r>
+        <w:rPr>
+          <w:rFonts w:ascii="Times New Roman" w:hAnsi="Times New Roman" w:cs="Times New Roman"/>
+        </w:rPr>
+        <w:t>resolved by</w:t>
+      </w:r>
+      <w:r>
+        <w:rPr>
+          <w:rFonts w:ascii="Times New Roman" w:hAnsi="Times New Roman" w:cs="Times New Roman"/>
+        </w:rPr>
+        <w:t xml:space="preserve"> starting the uvicorn server. The second (API Error 500: Internal Server Error) traced to a missing from typing import List import, causing Pydantic to fail resolving the TransactionBatch schema at request time; adding the import and restarting the backend resolved it. The third error, occurring only </w:t>
       </w:r>
       <w:r>
         <w:rPr>
@@ -11967,145 +9854,21 @@
         <w:rPr>
           <w:rFonts w:ascii="Times New Roman" w:hAnsi="Times New Roman" w:cs="Times New Roman"/>
         </w:rPr>
-        <w:t xml:space="preserve"> correct predictions had already been returned (visible in "Total Flagged Fraud Transactions: 3/13"), stemmed from a </w:t>
-      </w:r>
-      <w:proofErr w:type="gramStart"/>
-      <w:r>
-        <w:rPr>
-          <w:rFonts w:ascii="Times New Roman" w:hAnsi="Times New Roman" w:cs="Times New Roman"/>
-        </w:rPr>
-        <w:t>pandas</w:t>
-      </w:r>
-      <w:proofErr w:type="gramEnd"/>
-      <w:r>
-        <w:rPr>
-          <w:rFonts w:ascii="Times New Roman" w:hAnsi="Times New Roman" w:cs="Times New Roman"/>
-        </w:rPr>
-        <w:t xml:space="preserve"> version incompatibility in the results-table styling code (</w:t>
-      </w:r>
-      <w:proofErr w:type="spellStart"/>
-      <w:r>
-        <w:rPr>
-          <w:rFonts w:ascii="Times New Roman" w:hAnsi="Times New Roman" w:cs="Times New Roman"/>
-        </w:rPr>
-        <w:t>Styler.applymap</w:t>
-      </w:r>
-      <w:proofErr w:type="spellEnd"/>
-      <w:r>
-        <w:rPr>
-          <w:rFonts w:ascii="Times New Roman" w:hAnsi="Times New Roman" w:cs="Times New Roman"/>
-        </w:rPr>
-        <w:t>, deprecated in pandas 3.x), unrelated to the prediction logic itself.</w:t>
-      </w:r>
-    </w:p>
-    <w:p>
-      <w:pPr>
-        <w:jc w:val="both"/>
-        <w:rPr>
-          <w:rFonts w:ascii="Times New Roman" w:hAnsi="Times New Roman" w:cs="Times New Roman"/>
-        </w:rPr>
-      </w:pPr>
-      <w:r>
-        <w:rPr>
-          <w:rFonts w:ascii="Times New Roman" w:hAnsi="Times New Roman" w:cs="Times New Roman"/>
-        </w:rPr>
-        <w:t xml:space="preserve">Each failure was caught and surfaced clearly rather than crashing the application silently </w:t>
-      </w:r>
-      <w:r>
-        <w:rPr>
-          <w:rFonts w:ascii="Times New Roman" w:hAnsi="Times New Roman" w:cs="Times New Roman"/>
-        </w:rPr>
-        <w:t xml:space="preserve">– </w:t>
-      </w:r>
-      <w:r>
-        <w:rPr>
-          <w:rFonts w:ascii="Times New Roman" w:hAnsi="Times New Roman" w:cs="Times New Roman"/>
-        </w:rPr>
-        <w:t>a</w:t>
-      </w:r>
-      <w:r>
-        <w:rPr>
-          <w:rFonts w:ascii="Times New Roman" w:hAnsi="Times New Roman" w:cs="Times New Roman"/>
-        </w:rPr>
-        <w:t xml:space="preserve"> </w:t>
-      </w:r>
-      <w:r>
-        <w:rPr>
-          <w:rFonts w:ascii="Times New Roman" w:hAnsi="Times New Roman" w:cs="Times New Roman"/>
-        </w:rPr>
-        <w:t xml:space="preserve">direct result of the try/except error handling built into both the frontend (frontend/app.py) and backend (backend/main.py), which was itself one of </w:t>
-      </w:r>
-      <w:r>
-        <w:rPr>
-          <w:rFonts w:ascii="Times New Roman" w:hAnsi="Times New Roman" w:cs="Times New Roman"/>
-        </w:rPr>
-        <w:t>my</w:t>
-      </w:r>
-      <w:r>
-        <w:rPr>
-          <w:rFonts w:ascii="Times New Roman" w:hAnsi="Times New Roman" w:cs="Times New Roman"/>
-        </w:rPr>
-        <w:t xml:space="preserve"> </w:t>
-      </w:r>
-      <w:r>
-        <w:rPr>
-          <w:rFonts w:ascii="Times New Roman" w:hAnsi="Times New Roman" w:cs="Times New Roman"/>
-        </w:rPr>
-        <w:t>mentor</w:t>
-      </w:r>
-      <w:r>
-        <w:rPr>
-          <w:rFonts w:ascii="Times New Roman" w:hAnsi="Times New Roman" w:cs="Times New Roman"/>
-        </w:rPr>
-        <w:t>-identified issues addressed</w:t>
-      </w:r>
-      <w:r>
-        <w:rPr>
-          <w:rFonts w:ascii="Times New Roman" w:hAnsi="Times New Roman" w:cs="Times New Roman"/>
-        </w:rPr>
-        <w:t xml:space="preserve"> in the</w:t>
-      </w:r>
-      <w:r>
-        <w:rPr>
-          <w:rFonts w:ascii="Times New Roman" w:hAnsi="Times New Roman" w:cs="Times New Roman"/>
-        </w:rPr>
-        <w:t xml:space="preserve"> earlier</w:t>
-      </w:r>
-      <w:r>
-        <w:rPr>
-          <w:rFonts w:ascii="Times New Roman" w:hAnsi="Times New Roman" w:cs="Times New Roman"/>
-        </w:rPr>
-        <w:t xml:space="preserve"> codes written by me</w:t>
-      </w:r>
-      <w:r>
-        <w:rPr>
-          <w:rFonts w:ascii="Times New Roman" w:hAnsi="Times New Roman" w:cs="Times New Roman"/>
-        </w:rPr>
-        <w:t xml:space="preserve"> in this project. This progression demonstrates that the underlying prediction pipeline was correct throughout; each error was infrastructural or environmental (a stopped server, a missing import, a library version mismatch) rather than a flaw in the model, preprocessing, or batch-prediction logic</w:t>
-      </w:r>
-      <w:r>
-        <w:rPr>
-          <w:rFonts w:ascii="Times New Roman" w:hAnsi="Times New Roman" w:cs="Times New Roman"/>
-        </w:rPr>
-        <w:t xml:space="preserve"> – </w:t>
-      </w:r>
-      <w:r>
-        <w:rPr>
-          <w:rFonts w:ascii="Times New Roman" w:hAnsi="Times New Roman" w:cs="Times New Roman"/>
-        </w:rPr>
-        <w:t>and</w:t>
-      </w:r>
-      <w:r>
-        <w:rPr>
-          <w:rFonts w:ascii="Times New Roman" w:hAnsi="Times New Roman" w:cs="Times New Roman"/>
-        </w:rPr>
-        <w:t xml:space="preserve"> </w:t>
-      </w:r>
-      <w:r>
-        <w:rPr>
-          <w:rFonts w:ascii="Times New Roman" w:hAnsi="Times New Roman" w:cs="Times New Roman"/>
-        </w:rPr>
-        <w:t xml:space="preserve">each was diagnosable specifically </w:t>
+        <w:t xml:space="preserve"> correct predictions had already been returned (visible in "Total Flagged Fraud Transactions: 3/13"), stemmed from a pandas version incompatibility in the results-table styling code (Styler.applymap, deprecated in pandas 3.x), unrelated to the prediction logic itself.</w:t>
+      </w:r>
+    </w:p>
+    <w:p>
+      <w:pPr>
+        <w:jc w:val="both"/>
+        <w:rPr>
+          <w:rFonts w:ascii="Times New Roman" w:hAnsi="Times New Roman" w:cs="Times New Roman"/>
+        </w:rPr>
+      </w:pPr>
+      <w:r>
+        <w:rPr>
+          <w:rFonts w:ascii="Times New Roman" w:hAnsi="Times New Roman" w:cs="Times New Roman"/>
+        </w:rPr>
+        <w:t xml:space="preserve">Each failure was caught and surfaced clearly rather than crashing the application silently – a direct result of the try/except error handling built into both the frontend (frontend/app.py) and backend (backend/main.py), which was itself one of my mentor-identified issues addressed in the earlier codes written by me in this project. This progression demonstrates that the underlying prediction pipeline was correct throughout; each error was infrastructural or environmental (a stopped server, a missing import, a library version mismatch) rather than a flaw in the model, preprocessing, or batch-prediction logic – and each was diagnosable specifically </w:t>
       </w:r>
       <w:r>
         <w:rPr>
@@ -12156,6 +9919,7 @@
           <w:rFonts w:ascii="Times New Roman" w:hAnsi="Times New Roman" w:cs="Times New Roman"/>
           <w:b/>
           <w:bCs/>
+          <w:noProof/>
         </w:rPr>
         <w:lastRenderedPageBreak/>
         <w:drawing>
@@ -12221,77 +9985,34 @@
           <w:b/>
           <w:bCs/>
         </w:rPr>
-        <w:t xml:space="preserve">Figure 15: </w:t>
-      </w:r>
-      <w:r>
-        <w:rPr>
-          <w:rFonts w:ascii="Times New Roman" w:hAnsi="Times New Roman" w:cs="Times New Roman"/>
-          <w:b/>
-          <w:bCs/>
-        </w:rPr>
-        <w:t>Batch Prediction Debugging Sequence — From Connection Failure to Successful Result</w:t>
-      </w:r>
-    </w:p>
-    <w:p>
-      <w:pPr>
-        <w:jc w:val="both"/>
-        <w:rPr>
-          <w:rFonts w:ascii="Times New Roman" w:hAnsi="Times New Roman" w:cs="Times New Roman"/>
-        </w:rPr>
-      </w:pPr>
-      <w:r>
-        <w:rPr>
-          <w:rFonts w:ascii="Times New Roman" w:hAnsi="Times New Roman" w:cs="Times New Roman"/>
-        </w:rPr>
-        <w:t>The batch endpoint correctly processed all 13 uploaded transactions in a single request, flagging 3 as fraudulent (Rows 1–3) with probabilities of 99.99%, 100.00%, and 99.90% respectively</w:t>
-      </w:r>
-      <w:r>
-        <w:rPr>
-          <w:rFonts w:ascii="Times New Roman" w:hAnsi="Times New Roman" w:cs="Times New Roman"/>
-        </w:rPr>
-        <w:t xml:space="preserve"> (see Figure 16)</w:t>
-      </w:r>
-      <w:r>
-        <w:rPr>
-          <w:rFonts w:ascii="Times New Roman" w:hAnsi="Times New Roman" w:cs="Times New Roman"/>
-        </w:rPr>
-        <w:t xml:space="preserve"> </w:t>
-      </w:r>
-      <w:r>
-        <w:rPr>
-          <w:rFonts w:ascii="Times New Roman" w:hAnsi="Times New Roman" w:cs="Times New Roman"/>
-        </w:rPr>
-        <w:t>–</w:t>
-      </w:r>
-      <w:r>
-        <w:rPr>
-          <w:rFonts w:ascii="Times New Roman" w:hAnsi="Times New Roman" w:cs="Times New Roman"/>
-        </w:rPr>
-        <w:t xml:space="preserve"> matching</w:t>
-      </w:r>
-      <w:r>
-        <w:rPr>
-          <w:rFonts w:ascii="Times New Roman" w:hAnsi="Times New Roman" w:cs="Times New Roman"/>
-        </w:rPr>
-        <w:t xml:space="preserve"> </w:t>
-      </w:r>
-      <w:r>
-        <w:rPr>
-          <w:rFonts w:ascii="Times New Roman" w:hAnsi="Times New Roman" w:cs="Times New Roman"/>
-        </w:rPr>
-        <w:t>the known composition of the test file. Each flagged transaction includes its own SHAP-derived top features and a distinct LLM-generated explanation, confirming that explanations are computed per-row rather than reused generically; notably, Row 1 and Row 3 share V14 and V10 but differ in their third feature (V12 vs. V28), and each LLM narrative reflects that specific combination. This validates that the batch pipeline preserves per-transaction explainability while eliminating the row-by-row API call inefficiency identified in the original tutor review.</w:t>
-      </w:r>
-    </w:p>
-    <w:p>
-      <w:pPr>
-        <w:jc w:val="both"/>
-        <w:rPr>
-          <w:rFonts w:ascii="Times New Roman" w:hAnsi="Times New Roman" w:cs="Times New Roman"/>
-        </w:rPr>
-      </w:pPr>
-      <w:r>
-        <w:rPr>
-          <w:rFonts w:ascii="Times New Roman" w:hAnsi="Times New Roman" w:cs="Times New Roman"/>
+        <w:t>Figure 15: Batch Prediction Debugging Sequence — From Connection Failure to Successful Result</w:t>
+      </w:r>
+    </w:p>
+    <w:p>
+      <w:pPr>
+        <w:jc w:val="both"/>
+        <w:rPr>
+          <w:rFonts w:ascii="Times New Roman" w:hAnsi="Times New Roman" w:cs="Times New Roman"/>
+        </w:rPr>
+      </w:pPr>
+      <w:r>
+        <w:rPr>
+          <w:rFonts w:ascii="Times New Roman" w:hAnsi="Times New Roman" w:cs="Times New Roman"/>
+        </w:rPr>
+        <w:t>The batch endpoint correctly processed all 13 uploaded transactions in a single request, flagging 3 as fraudulent (Rows 1–3) with probabilities of 99.99%, 100.00%, and 99.90% respectively (see Figure 16) – matching the known composition of the test file. Each flagged transaction includes its own SHAP-derived top features and a distinct LLM-generated explanation, confirming that explanations are computed per-row rather than reused generically; notably, Row 1 and Row 3 share V14 and V10 but differ in their third feature (V12 vs. V28), and each LLM narrative reflects that specific combination. This validates that the batch pipeline preserves per-transaction explainability while eliminating the row-by-row API call inefficiency identified in the original tutor review.</w:t>
+      </w:r>
+    </w:p>
+    <w:p>
+      <w:pPr>
+        <w:jc w:val="both"/>
+        <w:rPr>
+          <w:rFonts w:ascii="Times New Roman" w:hAnsi="Times New Roman" w:cs="Times New Roman"/>
+        </w:rPr>
+      </w:pPr>
+      <w:r>
+        <w:rPr>
+          <w:rFonts w:ascii="Times New Roman" w:hAnsi="Times New Roman" w:cs="Times New Roman"/>
+          <w:noProof/>
         </w:rPr>
         <w:lastRenderedPageBreak/>
         <w:drawing>
@@ -12359,15 +10080,7 @@
           <w:b/>
           <w:bCs/>
         </w:rPr>
-        <w:t xml:space="preserve">Figure 16: </w:t>
-      </w:r>
-      <w:r>
-        <w:rPr>
-          <w:rFonts w:ascii="Times New Roman" w:hAnsi="Times New Roman" w:cs="Times New Roman"/>
-          <w:b/>
-          <w:bCs/>
-        </w:rPr>
-        <w:t>Batch Prediction Results with Per-Transaction SHAP and LLM Explanations</w:t>
+        <w:t>Figure 16: Batch Prediction Results with Per-Transaction SHAP and LLM Explanations</w:t>
       </w:r>
     </w:p>
     <w:p>
@@ -12395,15 +10108,7 @@
           <w:bCs/>
         </w:rPr>
         <w:tab/>
-        <w:t xml:space="preserve">Summary of Findings and </w:t>
-      </w:r>
-      <w:r>
-        <w:rPr>
-          <w:rFonts w:ascii="Times New Roman" w:hAnsi="Times New Roman" w:cs="Times New Roman"/>
-          <w:b/>
-          <w:bCs/>
-        </w:rPr>
-        <w:t>Recommendations</w:t>
+        <w:t>Summary of Findings and Recommendations</w:t>
       </w:r>
     </w:p>
     <w:p>
@@ -12430,13 +10135,6 @@
           <w:bCs/>
         </w:rPr>
         <w:tab/>
-      </w:r>
-      <w:r>
-        <w:rPr>
-          <w:rFonts w:ascii="Times New Roman" w:hAnsi="Times New Roman" w:cs="Times New Roman"/>
-          <w:b/>
-          <w:bCs/>
-        </w:rPr>
         <w:t>Findings</w:t>
       </w:r>
     </w:p>
@@ -12451,187 +10149,35 @@
         <w:rPr>
           <w:rFonts w:ascii="Times New Roman" w:hAnsi="Times New Roman" w:cs="Times New Roman"/>
         </w:rPr>
-        <w:t xml:space="preserve">1. Model Performance The final model </w:t>
-      </w:r>
-      <w:r>
-        <w:rPr>
-          <w:rFonts w:ascii="Times New Roman" w:hAnsi="Times New Roman" w:cs="Times New Roman"/>
-        </w:rPr>
-        <w:t xml:space="preserve">– </w:t>
-      </w:r>
-      <w:proofErr w:type="spellStart"/>
-      <w:r>
-        <w:rPr>
-          <w:rFonts w:ascii="Times New Roman" w:hAnsi="Times New Roman" w:cs="Times New Roman"/>
-        </w:rPr>
-        <w:t>XGBoost</w:t>
-      </w:r>
-      <w:proofErr w:type="spellEnd"/>
-      <w:r>
-        <w:rPr>
-          <w:rFonts w:ascii="Times New Roman" w:hAnsi="Times New Roman" w:cs="Times New Roman"/>
-        </w:rPr>
-        <w:t xml:space="preserve"> </w:t>
-      </w:r>
-      <w:r>
-        <w:rPr>
-          <w:rFonts w:ascii="Times New Roman" w:hAnsi="Times New Roman" w:cs="Times New Roman"/>
-        </w:rPr>
-        <w:t xml:space="preserve">with class-weighted imbalance handling </w:t>
-      </w:r>
-      <w:r>
-        <w:rPr>
-          <w:rFonts w:ascii="Times New Roman" w:hAnsi="Times New Roman" w:cs="Times New Roman"/>
-        </w:rPr>
-        <w:t>-</w:t>
-      </w:r>
-      <w:proofErr w:type="gramStart"/>
-      <w:r>
-        <w:rPr>
-          <w:rFonts w:ascii="Times New Roman" w:hAnsi="Times New Roman" w:cs="Times New Roman"/>
-        </w:rPr>
-        <w:t>achieved</w:t>
-      </w:r>
-      <w:r>
-        <w:rPr>
-          <w:rFonts w:ascii="Times New Roman" w:hAnsi="Times New Roman" w:cs="Times New Roman"/>
-        </w:rPr>
-        <w:t xml:space="preserve"> </w:t>
-      </w:r>
-      <w:r>
-        <w:rPr>
-          <w:rFonts w:ascii="Times New Roman" w:hAnsi="Times New Roman" w:cs="Times New Roman"/>
-        </w:rPr>
-        <w:t xml:space="preserve"> a</w:t>
-      </w:r>
-      <w:proofErr w:type="gramEnd"/>
-      <w:r>
-        <w:rPr>
-          <w:rFonts w:ascii="Times New Roman" w:hAnsi="Times New Roman" w:cs="Times New Roman"/>
-        </w:rPr>
-        <w:t xml:space="preserve"> cross-validated PR-AUC of 0.8539 ± 0.0191 (5-fold stratified) and a test-set PR-AUC of 0.8844, with precision 0.89 and recall 0.84 on the fraud class. Recall consistently plateaued around 82–85% regardless of classification threshold, indicating the model's discriminative ceiling is set by its learned decision boundary rather than threshold placement</w:t>
-      </w:r>
-      <w:r>
-        <w:rPr>
-          <w:rFonts w:ascii="Times New Roman" w:hAnsi="Times New Roman" w:cs="Times New Roman"/>
-        </w:rPr>
-        <w:t xml:space="preserve"> –</w:t>
-      </w:r>
-      <w:r>
-        <w:rPr>
-          <w:rFonts w:ascii="Times New Roman" w:hAnsi="Times New Roman" w:cs="Times New Roman"/>
-        </w:rPr>
-        <w:t xml:space="preserve"> roughly</w:t>
-      </w:r>
-      <w:r>
-        <w:rPr>
-          <w:rFonts w:ascii="Times New Roman" w:hAnsi="Times New Roman" w:cs="Times New Roman"/>
-        </w:rPr>
-        <w:t xml:space="preserve"> </w:t>
-      </w:r>
-      <w:r>
-        <w:rPr>
-          <w:rFonts w:ascii="Times New Roman" w:hAnsi="Times New Roman" w:cs="Times New Roman"/>
-        </w:rPr>
-        <w:t>1 in 6 fraud cases in this dataset resist detection under any tested configuration.</w:t>
-      </w:r>
-    </w:p>
-    <w:p>
-      <w:pPr>
-        <w:jc w:val="both"/>
-        <w:rPr>
-          <w:rFonts w:ascii="Times New Roman" w:hAnsi="Times New Roman" w:cs="Times New Roman"/>
-        </w:rPr>
-      </w:pPr>
-      <w:r>
-        <w:rPr>
-          <w:rFonts w:ascii="Times New Roman" w:hAnsi="Times New Roman" w:cs="Times New Roman"/>
-        </w:rPr>
-        <w:t xml:space="preserve">2. Feature Signal V14, V10, V12, and V17 emerged repeatedly as the strongest fraud indicators </w:t>
-      </w:r>
-      <w:r>
-        <w:rPr>
-          <w:rFonts w:ascii="Times New Roman" w:hAnsi="Times New Roman" w:cs="Times New Roman"/>
-        </w:rPr>
-        <w:t>-</w:t>
-      </w:r>
-      <w:r>
-        <w:rPr>
-          <w:rFonts w:ascii="Times New Roman" w:hAnsi="Times New Roman" w:cs="Times New Roman"/>
-        </w:rPr>
-        <w:t>independently</w:t>
-      </w:r>
-      <w:r>
-        <w:rPr>
-          <w:rFonts w:ascii="Times New Roman" w:hAnsi="Times New Roman" w:cs="Times New Roman"/>
-        </w:rPr>
-        <w:t xml:space="preserve"> </w:t>
-      </w:r>
-      <w:r>
-        <w:rPr>
-          <w:rFonts w:ascii="Times New Roman" w:hAnsi="Times New Roman" w:cs="Times New Roman"/>
-        </w:rPr>
-        <w:t>confirmed through correlation analysis, KDE distribution comparisons, SHAP attribution on notebook test cases, and SHAP attribution on live dashboard predictions. This convergence across four separate analytical methods is strong evidence the model has learned a genuine, stable signal rather than an artifact of any one evaluation approach.</w:t>
-      </w:r>
-    </w:p>
-    <w:p>
-      <w:pPr>
-        <w:jc w:val="both"/>
-        <w:rPr>
-          <w:rFonts w:ascii="Times New Roman" w:hAnsi="Times New Roman" w:cs="Times New Roman"/>
-        </w:rPr>
-      </w:pPr>
-      <w:r>
-        <w:rPr>
-          <w:rFonts w:ascii="Times New Roman" w:hAnsi="Times New Roman" w:cs="Times New Roman"/>
-        </w:rPr>
-        <w:t xml:space="preserve">3. Model Selection Was Justified but Only Partially Validated </w:t>
-      </w:r>
-      <w:proofErr w:type="spellStart"/>
-      <w:r>
-        <w:rPr>
-          <w:rFonts w:ascii="Times New Roman" w:hAnsi="Times New Roman" w:cs="Times New Roman"/>
-        </w:rPr>
-        <w:t>XGBoost</w:t>
-      </w:r>
-      <w:proofErr w:type="spellEnd"/>
-      <w:r>
-        <w:rPr>
-          <w:rFonts w:ascii="Times New Roman" w:hAnsi="Times New Roman" w:cs="Times New Roman"/>
-        </w:rPr>
-        <w:t xml:space="preserve"> (class-weighted) outperformed four alternative models across three resampling strategies at default hyperparameters, and this selection held up after tuning and cross-validation were applied specifically to it. However, the second-place model (Random Forest + SMOTE) was never independently tuned to the same depth </w:t>
-      </w:r>
-      <w:r>
-        <w:rPr>
-          <w:rFonts w:ascii="Times New Roman" w:hAnsi="Times New Roman" w:cs="Times New Roman"/>
-        </w:rPr>
-        <w:t xml:space="preserve">– </w:t>
-      </w:r>
-      <w:proofErr w:type="gramStart"/>
-      <w:r>
-        <w:rPr>
-          <w:rFonts w:ascii="Times New Roman" w:hAnsi="Times New Roman" w:cs="Times New Roman"/>
-        </w:rPr>
-        <w:t>its</w:t>
-      </w:r>
-      <w:r>
-        <w:rPr>
-          <w:rFonts w:ascii="Times New Roman" w:hAnsi="Times New Roman" w:cs="Times New Roman"/>
-        </w:rPr>
-        <w:t xml:space="preserve"> </w:t>
-      </w:r>
-      <w:r>
-        <w:rPr>
-          <w:rFonts w:ascii="Times New Roman" w:hAnsi="Times New Roman" w:cs="Times New Roman"/>
-        </w:rPr>
-        <w:t xml:space="preserve"> tuning</w:t>
-      </w:r>
-      <w:proofErr w:type="gramEnd"/>
-      <w:r>
-        <w:rPr>
-          <w:rFonts w:ascii="Times New Roman" w:hAnsi="Times New Roman" w:cs="Times New Roman"/>
-        </w:rPr>
-        <w:t xml:space="preserve"> search ran for over an hour without completing and was abandoned under time pressure. The model comparison is trustworthy as a </w:t>
+        <w:t>1. Model Performance The final model – XGBoost with class-weighted imbalance handling -achieved  a cross-validated PR-AUC of 0.8539 ± 0.0191 (5-fold stratified) and a test-set PR-AUC of 0.8844, with precision 0.89 and recall 0.84 on the fraud class. Recall consistently plateaued around 82–85% regardless of classification threshold, indicating the model's discriminative ceiling is set by its learned decision boundary rather than threshold placement – roughly 1 in 6 fraud cases in this dataset resist detection under any tested configuration.</w:t>
+      </w:r>
+    </w:p>
+    <w:p>
+      <w:pPr>
+        <w:jc w:val="both"/>
+        <w:rPr>
+          <w:rFonts w:ascii="Times New Roman" w:hAnsi="Times New Roman" w:cs="Times New Roman"/>
+        </w:rPr>
+      </w:pPr>
+      <w:r>
+        <w:rPr>
+          <w:rFonts w:ascii="Times New Roman" w:hAnsi="Times New Roman" w:cs="Times New Roman"/>
+        </w:rPr>
+        <w:t>2. Feature Signal V14, V10, V12, and V17 emerged repeatedly as the strongest fraud indicators -independently confirmed through correlation analysis, KDE distribution comparisons, SHAP attribution on notebook test cases, and SHAP attribution on live dashboard predictions. This convergence across four separate analytical methods is strong evidence the model has learned a genuine, stable signal rather than an artifact of any one evaluation approach.</w:t>
+      </w:r>
+    </w:p>
+    <w:p>
+      <w:pPr>
+        <w:jc w:val="both"/>
+        <w:rPr>
+          <w:rFonts w:ascii="Times New Roman" w:hAnsi="Times New Roman" w:cs="Times New Roman"/>
+        </w:rPr>
+      </w:pPr>
+      <w:r>
+        <w:rPr>
+          <w:rFonts w:ascii="Times New Roman" w:hAnsi="Times New Roman" w:cs="Times New Roman"/>
+        </w:rPr>
+        <w:t xml:space="preserve">3. Model Selection Was Justified but Only Partially Validated XGBoost (class-weighted) outperformed four alternative models across three resampling strategies at default hyperparameters, and this selection held up after tuning and cross-validation were applied specifically to it. However, the second-place model (Random Forest + SMOTE) was never independently tuned to the same depth – its  tuning search ran for over an hour without completing and was abandoned under time pressure. The model comparison is trustworthy as a </w:t>
       </w:r>
       <w:r>
         <w:rPr>
@@ -12645,146 +10191,42 @@
         <w:rPr>
           <w:rFonts w:ascii="Times New Roman" w:hAnsi="Times New Roman" w:cs="Times New Roman"/>
         </w:rPr>
-        <w:t xml:space="preserve">; it is not proof that </w:t>
-      </w:r>
-      <w:proofErr w:type="spellStart"/>
-      <w:r>
-        <w:rPr>
-          <w:rFonts w:ascii="Times New Roman" w:hAnsi="Times New Roman" w:cs="Times New Roman"/>
-        </w:rPr>
-        <w:t>XGBoost</w:t>
-      </w:r>
-      <w:proofErr w:type="spellEnd"/>
-      <w:r>
-        <w:rPr>
-          <w:rFonts w:ascii="Times New Roman" w:hAnsi="Times New Roman" w:cs="Times New Roman"/>
-        </w:rPr>
-        <w:t xml:space="preserve"> would still win after every candidate received equal tuning investment.</w:t>
-      </w:r>
-    </w:p>
-    <w:p>
-      <w:pPr>
-        <w:jc w:val="both"/>
-        <w:rPr>
-          <w:rFonts w:ascii="Times New Roman" w:hAnsi="Times New Roman" w:cs="Times New Roman"/>
-        </w:rPr>
-      </w:pPr>
-      <w:r>
-        <w:rPr>
-          <w:rFonts w:ascii="Times New Roman" w:hAnsi="Times New Roman" w:cs="Times New Roman"/>
-        </w:rPr>
-        <w:t>4. The System Works End-to-End, But Only Because Live Testing Caught What Notebook Testing Missed Three distinct bugs were found and fixed only once the full deployed system (</w:t>
-      </w:r>
-      <w:proofErr w:type="spellStart"/>
-      <w:r>
-        <w:rPr>
-          <w:rFonts w:ascii="Times New Roman" w:hAnsi="Times New Roman" w:cs="Times New Roman"/>
-        </w:rPr>
-        <w:t>FastAPI</w:t>
-      </w:r>
-      <w:proofErr w:type="spellEnd"/>
-      <w:r>
-        <w:rPr>
-          <w:rFonts w:ascii="Times New Roman" w:hAnsi="Times New Roman" w:cs="Times New Roman"/>
-        </w:rPr>
-        <w:t xml:space="preserve"> + </w:t>
-      </w:r>
-      <w:proofErr w:type="spellStart"/>
-      <w:r>
-        <w:rPr>
-          <w:rFonts w:ascii="Times New Roman" w:hAnsi="Times New Roman" w:cs="Times New Roman"/>
-        </w:rPr>
-        <w:t>Streamlit</w:t>
-      </w:r>
-      <w:proofErr w:type="spellEnd"/>
-      <w:r>
-        <w:rPr>
-          <w:rFonts w:ascii="Times New Roman" w:hAnsi="Times New Roman" w:cs="Times New Roman"/>
-        </w:rPr>
-        <w:t xml:space="preserve">) was exercised directly, rather than relying on notebook-level function calls in isolation: a missing </w:t>
-      </w:r>
-      <w:proofErr w:type="spellStart"/>
-      <w:r>
-        <w:rPr>
-          <w:rFonts w:ascii="Times New Roman" w:hAnsi="Times New Roman" w:cs="Times New Roman"/>
-        </w:rPr>
-        <w:t>typing.List</w:t>
-      </w:r>
-      <w:proofErr w:type="spellEnd"/>
-      <w:r>
-        <w:rPr>
-          <w:rFonts w:ascii="Times New Roman" w:hAnsi="Times New Roman" w:cs="Times New Roman"/>
-        </w:rPr>
-        <w:t xml:space="preserve"> import that broke the batch endpoint, deprecated LLM model names that silently triggered fallback explanations, and a token limit that silently truncated LLM output. None of these were visible from notebook testing alone. This is itself a finding: component-level correctness does not guarantee system-level correctness, and this project's most valuable bug discoveries only happened during integration testing.</w:t>
-      </w:r>
-    </w:p>
-    <w:p>
-      <w:pPr>
-        <w:jc w:val="both"/>
-        <w:rPr>
-          <w:rFonts w:ascii="Times New Roman" w:hAnsi="Times New Roman" w:cs="Times New Roman"/>
-        </w:rPr>
-      </w:pPr>
-      <w:r>
-        <w:rPr>
-          <w:rFonts w:ascii="Times New Roman" w:hAnsi="Times New Roman" w:cs="Times New Roman"/>
-        </w:rPr>
-        <w:t xml:space="preserve">5. Defensive Design Choices Paid Off The graceful fallback in </w:t>
-      </w:r>
-      <w:proofErr w:type="spellStart"/>
-      <w:r>
-        <w:rPr>
-          <w:rFonts w:ascii="Times New Roman" w:hAnsi="Times New Roman" w:cs="Times New Roman"/>
-        </w:rPr>
-        <w:t>generate_llm_</w:t>
-      </w:r>
-      <w:proofErr w:type="gramStart"/>
-      <w:r>
-        <w:rPr>
-          <w:rFonts w:ascii="Times New Roman" w:hAnsi="Times New Roman" w:cs="Times New Roman"/>
-        </w:rPr>
-        <w:t>explanation</w:t>
-      </w:r>
-      <w:proofErr w:type="spellEnd"/>
-      <w:r>
-        <w:rPr>
-          <w:rFonts w:ascii="Times New Roman" w:hAnsi="Times New Roman" w:cs="Times New Roman"/>
-        </w:rPr>
-        <w:t>(</w:t>
-      </w:r>
-      <w:proofErr w:type="gramEnd"/>
-      <w:r>
-        <w:rPr>
-          <w:rFonts w:ascii="Times New Roman" w:hAnsi="Times New Roman" w:cs="Times New Roman"/>
-        </w:rPr>
-        <w:t xml:space="preserve">) (returning a template-based explanation rather than crashing when the LLM API failed) and the try/except wrapping in both frontend and backend meant every failure in this project surfaced as a readable error message rather than a silent hang or an unhandled crash </w:t>
-      </w:r>
-      <w:r>
-        <w:rPr>
-          <w:rFonts w:ascii="Times New Roman" w:hAnsi="Times New Roman" w:cs="Times New Roman"/>
-        </w:rPr>
-        <w:t xml:space="preserve">– </w:t>
-      </w:r>
-      <w:proofErr w:type="gramStart"/>
-      <w:r>
-        <w:rPr>
-          <w:rFonts w:ascii="Times New Roman" w:hAnsi="Times New Roman" w:cs="Times New Roman"/>
-        </w:rPr>
-        <w:t>which</w:t>
-      </w:r>
-      <w:r>
-        <w:rPr>
-          <w:rFonts w:ascii="Times New Roman" w:hAnsi="Times New Roman" w:cs="Times New Roman"/>
-        </w:rPr>
-        <w:t xml:space="preserve"> </w:t>
-      </w:r>
-      <w:r>
-        <w:rPr>
-          <w:rFonts w:ascii="Times New Roman" w:hAnsi="Times New Roman" w:cs="Times New Roman"/>
-        </w:rPr>
-        <w:t xml:space="preserve"> is</w:t>
-      </w:r>
-      <w:proofErr w:type="gramEnd"/>
+        <w:t>; it is not proof that XGBoost would still win after every candidate received equal tuning investment.</w:t>
+      </w:r>
+    </w:p>
+    <w:p>
+      <w:pPr>
+        <w:jc w:val="both"/>
+        <w:rPr>
+          <w:rFonts w:ascii="Times New Roman" w:hAnsi="Times New Roman" w:cs="Times New Roman"/>
+        </w:rPr>
+      </w:pPr>
+      <w:r>
+        <w:rPr>
+          <w:rFonts w:ascii="Times New Roman" w:hAnsi="Times New Roman" w:cs="Times New Roman"/>
+        </w:rPr>
+        <w:t>4. The System Works End-to-End, But Only Because Live Testing Caught What Notebook Testing Missed Three distinct bugs were found and fixed only once the full deployed system (FastAPI + Streamlit) was exercised directly, rather than relying on notebook-level function calls in isolation: a missing typing.List import that broke the batch endpoint, deprecated LLM model names that silently triggered fallback explanations, and a token limit that silently truncated LLM output. None of these were visible from notebook testing alone. This is itself a finding: component-level correctness does not guarantee system-level correctness, and this project's most valuable bug discoveries only happened during integration testing.</w:t>
+      </w:r>
+    </w:p>
+    <w:p>
+      <w:pPr>
+        <w:jc w:val="both"/>
+        <w:rPr>
+          <w:rFonts w:ascii="Times New Roman" w:hAnsi="Times New Roman" w:cs="Times New Roman"/>
+        </w:rPr>
+      </w:pPr>
+      <w:r>
+        <w:rPr>
+          <w:rFonts w:ascii="Times New Roman" w:hAnsi="Times New Roman" w:cs="Times New Roman"/>
+        </w:rPr>
+        <w:t xml:space="preserve">5. Defensive Design Choices Paid Off The graceful fallback in generate_llm_explanation() (returning a template-based explanation rather than crashing when the LLM API failed) and the try/except wrapping in both frontend and backend meant every failure in this project surfaced as a readable error message rather than a silent hang or an unhandled crash – </w:t>
+      </w:r>
+      <w:r>
+        <w:rPr>
+          <w:rFonts w:ascii="Times New Roman" w:hAnsi="Times New Roman" w:cs="Times New Roman"/>
+        </w:rPr>
+        <w:t>which is</w:t>
+      </w:r>
       <w:r>
         <w:rPr>
           <w:rFonts w:ascii="Times New Roman" w:hAnsi="Times New Roman" w:cs="Times New Roman"/>
@@ -12819,34 +10261,26 @@
     <w:p>
       <w:pPr>
         <w:jc w:val="both"/>
-      </w:pPr>
-      <w:r>
-        <w:rPr>
+        <w:rPr>
+          <w:rFonts w:ascii="Times New Roman" w:hAnsi="Times New Roman" w:cs="Times New Roman"/>
+        </w:rPr>
+      </w:pPr>
+      <w:r>
+        <w:rPr>
+          <w:rFonts w:ascii="Times New Roman" w:hAnsi="Times New Roman" w:cs="Times New Roman"/>
           <w:b/>
           <w:bCs/>
         </w:rPr>
         <w:lastRenderedPageBreak/>
-        <w:t>8.</w:t>
-      </w:r>
-      <w:r>
-        <w:rPr>
-          <w:b/>
-          <w:bCs/>
-        </w:rPr>
-        <w:t>2</w:t>
-      </w:r>
-      <w:r>
-        <w:rPr>
+        <w:t>8.2</w:t>
+      </w:r>
+      <w:r>
+        <w:rPr>
+          <w:rFonts w:ascii="Times New Roman" w:hAnsi="Times New Roman" w:cs="Times New Roman"/>
           <w:b/>
           <w:bCs/>
         </w:rPr>
         <w:tab/>
-      </w:r>
-      <w:r>
-        <w:rPr>
-          <w:b/>
-          <w:bCs/>
-        </w:rPr>
         <w:t xml:space="preserve"> Recommendations and Future Work</w:t>
       </w:r>
     </w:p>
@@ -12857,15 +10291,22 @@
           <w:numId w:val="11"/>
         </w:numPr>
         <w:jc w:val="both"/>
-      </w:pPr>
-      <w:r>
-        <w:rPr>
+        <w:rPr>
+          <w:rFonts w:ascii="Times New Roman" w:hAnsi="Times New Roman" w:cs="Times New Roman"/>
+        </w:rPr>
+      </w:pPr>
+      <w:r>
+        <w:rPr>
+          <w:rFonts w:ascii="Times New Roman" w:hAnsi="Times New Roman" w:cs="Times New Roman"/>
           <w:b/>
           <w:bCs/>
         </w:rPr>
         <w:t>Environment &amp; Reproducibility:</w:t>
       </w:r>
       <w:r>
+        <w:rPr>
+          <w:rFonts w:ascii="Times New Roman" w:hAnsi="Times New Roman" w:cs="Times New Roman"/>
+        </w:rPr>
         <w:t xml:space="preserve"> Complete requirements.txt version pinning and finalize the virtual environment setup (already in progress) to guarantee reproducible deployment.</w:t>
       </w:r>
     </w:p>
@@ -12876,16 +10317,57 @@
           <w:numId w:val="11"/>
         </w:numPr>
         <w:jc w:val="both"/>
-      </w:pPr>
-      <w:r>
-        <w:rPr>
+        <w:rPr>
+          <w:rFonts w:ascii="Times New Roman" w:hAnsi="Times New Roman" w:cs="Times New Roman"/>
+        </w:rPr>
+      </w:pPr>
+      <w:r>
+        <w:rPr>
+          <w:rFonts w:ascii="Times New Roman" w:hAnsi="Times New Roman" w:cs="Times New Roman"/>
           <w:b/>
           <w:bCs/>
         </w:rPr>
         <w:t>Model Versioning:</w:t>
       </w:r>
       <w:r>
-        <w:t xml:space="preserve"> Implement timestamped model artifacts and a change log to enable safe rollback between training runs.</w:t>
+        <w:rPr>
+          <w:rFonts w:ascii="Times New Roman" w:hAnsi="Times New Roman" w:cs="Times New Roman"/>
+        </w:rPr>
+        <w:t xml:space="preserve"> </w:t>
+      </w:r>
+      <w:r>
+        <w:rPr>
+          <w:rFonts w:ascii="Times New Roman" w:hAnsi="Times New Roman" w:cs="Times New Roman"/>
+        </w:rPr>
+        <w:t xml:space="preserve">Model versioning was implemented on an ad-hoc basis via a </w:t>
+      </w:r>
+      <w:r>
+        <w:rPr>
+          <w:rFonts w:ascii="Times New Roman" w:hAnsi="Times New Roman" w:cs="Times New Roman"/>
+          <w:i/>
+          <w:iCs/>
+        </w:rPr>
+        <w:t>save_versioned_artifact()</w:t>
+      </w:r>
+      <w:r>
+        <w:rPr>
+          <w:rFonts w:ascii="Times New Roman" w:hAnsi="Times New Roman" w:cs="Times New Roman"/>
+        </w:rPr>
+        <w:t xml:space="preserve"> utility, producing timestamped log entries </w:t>
+      </w:r>
+      <w:r>
+        <w:rPr>
+          <w:rFonts w:ascii="Times New Roman" w:hAnsi="Times New Roman" w:cs="Times New Roman"/>
+          <w:i/>
+          <w:iCs/>
+        </w:rPr>
+        <w:t>(models_archive/model_version_log.txt)</w:t>
+      </w:r>
+      <w:r>
+        <w:rPr>
+          <w:rFonts w:ascii="Times New Roman" w:hAnsi="Times New Roman" w:cs="Times New Roman"/>
+        </w:rPr>
+        <w:t xml:space="preserve"> for select training runs; this was not wired into the standard pipeline as an automatic step for every export, which remains a next-step improvement.</w:t>
       </w:r>
     </w:p>
     <w:p>
@@ -12895,15 +10377,22 @@
           <w:numId w:val="11"/>
         </w:numPr>
         <w:jc w:val="both"/>
-      </w:pPr>
-      <w:r>
-        <w:rPr>
+        <w:rPr>
+          <w:rFonts w:ascii="Times New Roman" w:hAnsi="Times New Roman" w:cs="Times New Roman"/>
+        </w:rPr>
+      </w:pPr>
+      <w:r>
+        <w:rPr>
+          <w:rFonts w:ascii="Times New Roman" w:hAnsi="Times New Roman" w:cs="Times New Roman"/>
           <w:b/>
           <w:bCs/>
         </w:rPr>
         <w:t>Comparative Model Tuning:</w:t>
       </w:r>
       <w:r>
+        <w:rPr>
+          <w:rFonts w:ascii="Times New Roman" w:hAnsi="Times New Roman" w:cs="Times New Roman"/>
+        </w:rPr>
         <w:t xml:space="preserve"> Extend hyperparameter tuning and cross-validation to the runner-up model (Random Forest + SMOTE) to confirm model selection holds under equal optimization effort.</w:t>
       </w:r>
     </w:p>
@@ -12914,32 +10403,23 @@
           <w:numId w:val="11"/>
         </w:numPr>
         <w:jc w:val="both"/>
-      </w:pPr>
-      <w:r>
-        <w:rPr>
+        <w:rPr>
+          <w:rFonts w:ascii="Times New Roman" w:hAnsi="Times New Roman" w:cs="Times New Roman"/>
+        </w:rPr>
+      </w:pPr>
+      <w:r>
+        <w:rPr>
+          <w:rFonts w:ascii="Times New Roman" w:hAnsi="Times New Roman" w:cs="Times New Roman"/>
           <w:b/>
           <w:bCs/>
         </w:rPr>
         <w:t>Ensemble Models:</w:t>
       </w:r>
       <w:r>
-        <w:t xml:space="preserve"> Explore combining </w:t>
-      </w:r>
-      <w:proofErr w:type="spellStart"/>
-      <w:r>
-        <w:t>XGBoost</w:t>
-      </w:r>
-      <w:proofErr w:type="spellEnd"/>
-      <w:r>
-        <w:t xml:space="preserve">, Random Forest, and </w:t>
-      </w:r>
-      <w:proofErr w:type="spellStart"/>
-      <w:r>
-        <w:t>CatBoost</w:t>
-      </w:r>
-      <w:proofErr w:type="spellEnd"/>
-      <w:r>
-        <w:t xml:space="preserve"> to reduce the ~15% recall ceiling observed across all tested thresholds.</w:t>
+        <w:rPr>
+          <w:rFonts w:ascii="Times New Roman" w:hAnsi="Times New Roman" w:cs="Times New Roman"/>
+        </w:rPr>
+        <w:t xml:space="preserve"> Explore combining XGBoost, Random Forest, and CatBoost to reduce the ~15% recall ceiling observed across all tested thresholds.</w:t>
       </w:r>
     </w:p>
     <w:p>
@@ -12949,15 +10429,22 @@
           <w:numId w:val="11"/>
         </w:numPr>
         <w:jc w:val="both"/>
-      </w:pPr>
-      <w:r>
-        <w:rPr>
+        <w:rPr>
+          <w:rFonts w:ascii="Times New Roman" w:hAnsi="Times New Roman" w:cs="Times New Roman"/>
+        </w:rPr>
+      </w:pPr>
+      <w:r>
+        <w:rPr>
+          <w:rFonts w:ascii="Times New Roman" w:hAnsi="Times New Roman" w:cs="Times New Roman"/>
           <w:b/>
           <w:bCs/>
         </w:rPr>
         <w:t>Dynamic Thresholding:</w:t>
       </w:r>
       <w:r>
+        <w:rPr>
+          <w:rFonts w:ascii="Times New Roman" w:hAnsi="Times New Roman" w:cs="Times New Roman"/>
+        </w:rPr>
         <w:t xml:space="preserve"> Investigate cost-sensitive threshold selection tied to real financial impact (false-negative vs. false-positive cost), rather than default 0.5, once such cost data is available.</w:t>
       </w:r>
     </w:p>
@@ -12968,15 +10455,22 @@
           <w:numId w:val="11"/>
         </w:numPr>
         <w:jc w:val="both"/>
-      </w:pPr>
-      <w:r>
-        <w:rPr>
+        <w:rPr>
+          <w:rFonts w:ascii="Times New Roman" w:hAnsi="Times New Roman" w:cs="Times New Roman"/>
+        </w:rPr>
+      </w:pPr>
+      <w:r>
+        <w:rPr>
+          <w:rFonts w:ascii="Times New Roman" w:hAnsi="Times New Roman" w:cs="Times New Roman"/>
           <w:b/>
           <w:bCs/>
         </w:rPr>
         <w:t>Asynchronous Processing:</w:t>
       </w:r>
       <w:r>
+        <w:rPr>
+          <w:rFonts w:ascii="Times New Roman" w:hAnsi="Times New Roman" w:cs="Times New Roman"/>
+        </w:rPr>
         <w:t xml:space="preserve"> Adopt a task queue (e.g., Celery/Redis) for batch prediction handling to improve scalability beyond the current single-request batching.</w:t>
       </w:r>
     </w:p>
@@ -12987,40 +10481,23 @@
           <w:numId w:val="11"/>
         </w:numPr>
         <w:jc w:val="both"/>
-      </w:pPr>
-      <w:r>
-        <w:rPr>
+        <w:rPr>
+          <w:rFonts w:ascii="Times New Roman" w:hAnsi="Times New Roman" w:cs="Times New Roman"/>
+        </w:rPr>
+      </w:pPr>
+      <w:r>
+        <w:rPr>
+          <w:rFonts w:ascii="Times New Roman" w:hAnsi="Times New Roman" w:cs="Times New Roman"/>
           <w:b/>
           <w:bCs/>
         </w:rPr>
         <w:t>LLM Dependency Monitoring:</w:t>
       </w:r>
       <w:r>
-        <w:t xml:space="preserve"> Schedule periodic checks of the </w:t>
-      </w:r>
-      <w:proofErr w:type="spellStart"/>
-      <w:r>
-        <w:t>Groq</w:t>
-      </w:r>
-      <w:proofErr w:type="spellEnd"/>
-      <w:r>
-        <w:t xml:space="preserve"> model list, given </w:t>
-      </w:r>
-      <w:proofErr w:type="spellStart"/>
-      <w:r>
-        <w:t>candidate_models</w:t>
-      </w:r>
-      <w:proofErr w:type="spellEnd"/>
-      <w:r>
-        <w:t xml:space="preserve"> was already found deprecated once during this project — silent fallback to template explanations should be logged and </w:t>
-      </w:r>
-      <w:proofErr w:type="spellStart"/>
-      <w:r>
-        <w:t>alertable</w:t>
-      </w:r>
-      <w:proofErr w:type="spellEnd"/>
-      <w:r>
-        <w:t xml:space="preserve"> in production.</w:t>
+        <w:rPr>
+          <w:rFonts w:ascii="Times New Roman" w:hAnsi="Times New Roman" w:cs="Times New Roman"/>
+        </w:rPr>
+        <w:t xml:space="preserve"> Schedule periodic checks of the Groq model list, given candidate_models was already found deprecated once during this project — silent fallback to template explanations should be logged and alertable in production.</w:t>
       </w:r>
     </w:p>
     <w:p>
@@ -13030,15 +10507,22 @@
           <w:numId w:val="11"/>
         </w:numPr>
         <w:jc w:val="both"/>
-      </w:pPr>
-      <w:r>
-        <w:rPr>
+        <w:rPr>
+          <w:rFonts w:ascii="Times New Roman" w:hAnsi="Times New Roman" w:cs="Times New Roman"/>
+        </w:rPr>
+      </w:pPr>
+      <w:r>
+        <w:rPr>
+          <w:rFonts w:ascii="Times New Roman" w:hAnsi="Times New Roman" w:cs="Times New Roman"/>
           <w:b/>
           <w:bCs/>
         </w:rPr>
         <w:t>Model Monitoring:</w:t>
       </w:r>
       <w:r>
+        <w:rPr>
+          <w:rFonts w:ascii="Times New Roman" w:hAnsi="Times New Roman" w:cs="Times New Roman"/>
+        </w:rPr>
         <w:t xml:space="preserve"> Implement drift detection (e.g., Population Stability Index) to catch degradation in live transaction patterns over time.</w:t>
       </w:r>
     </w:p>
@@ -13049,24 +10533,23 @@
           <w:numId w:val="11"/>
         </w:numPr>
         <w:jc w:val="both"/>
-      </w:pPr>
-      <w:r>
-        <w:rPr>
+        <w:rPr>
+          <w:rFonts w:ascii="Times New Roman" w:hAnsi="Times New Roman" w:cs="Times New Roman"/>
+        </w:rPr>
+      </w:pPr>
+      <w:r>
+        <w:rPr>
+          <w:rFonts w:ascii="Times New Roman" w:hAnsi="Times New Roman" w:cs="Times New Roman"/>
           <w:b/>
           <w:bCs/>
         </w:rPr>
         <w:t>Integration Testing:</w:t>
       </w:r>
       <w:r>
-        <w:t xml:space="preserve"> Add automated tests for /predict and /</w:t>
-      </w:r>
-      <w:proofErr w:type="spellStart"/>
-      <w:r>
-        <w:t>predict_batch</w:t>
-      </w:r>
-      <w:proofErr w:type="spellEnd"/>
-      <w:r>
-        <w:t xml:space="preserve"> with known inputs, to catch the class of bugs found manually in this project (missing imports, deprecated dependencies) before deployment.</w:t>
+        <w:rPr>
+          <w:rFonts w:ascii="Times New Roman" w:hAnsi="Times New Roman" w:cs="Times New Roman"/>
+        </w:rPr>
+        <w:t xml:space="preserve"> Add automated tests for /predict and /predict_batch with known inputs, to catch the class of bugs found manually in this project (missing imports, deprecated dependencies) before deployment.</w:t>
       </w:r>
     </w:p>
     <w:p>
@@ -13076,31 +10559,47 @@
           <w:numId w:val="11"/>
         </w:numPr>
         <w:jc w:val="both"/>
-      </w:pPr>
-      <w:r>
-        <w:rPr>
+        <w:rPr>
+          <w:rFonts w:ascii="Times New Roman" w:hAnsi="Times New Roman" w:cs="Times New Roman"/>
+        </w:rPr>
+      </w:pPr>
+      <w:r>
+        <w:rPr>
+          <w:rFonts w:ascii="Times New Roman" w:hAnsi="Times New Roman" w:cs="Times New Roman"/>
           <w:b/>
           <w:bCs/>
         </w:rPr>
         <w:t>Regulatory Compliance:</w:t>
       </w:r>
       <w:r>
+        <w:rPr>
+          <w:rFonts w:ascii="Times New Roman" w:hAnsi="Times New Roman" w:cs="Times New Roman"/>
+        </w:rPr>
         <w:t xml:space="preserve"> Extend the SHAP/LLM explainability layer toward audit-ready documentation standards, given fraud-detection systems are frequently subject to regulatory review.</w:t>
       </w:r>
     </w:p>
     <w:p>
       <w:pPr>
         <w:jc w:val="both"/>
-      </w:pPr>
-    </w:p>
-    <w:p>
-      <w:pPr>
-        <w:jc w:val="both"/>
-      </w:pPr>
-    </w:p>
-    <w:p>
-      <w:pPr>
-        <w:jc w:val="both"/>
+        <w:rPr>
+          <w:rFonts w:ascii="Times New Roman" w:hAnsi="Times New Roman" w:cs="Times New Roman"/>
+        </w:rPr>
+      </w:pPr>
+    </w:p>
+    <w:p>
+      <w:pPr>
+        <w:jc w:val="both"/>
+        <w:rPr>
+          <w:rFonts w:ascii="Times New Roman" w:hAnsi="Times New Roman" w:cs="Times New Roman"/>
+        </w:rPr>
+      </w:pPr>
+    </w:p>
+    <w:p>
+      <w:pPr>
+        <w:jc w:val="both"/>
+        <w:rPr>
+          <w:rFonts w:ascii="Times New Roman" w:hAnsi="Times New Roman" w:cs="Times New Roman"/>
+        </w:rPr>
       </w:pPr>
     </w:p>
     <w:p>
@@ -13139,69 +10638,35 @@
         <w:rPr>
           <w:rFonts w:ascii="Times New Roman" w:hAnsi="Times New Roman" w:cs="Times New Roman"/>
         </w:rPr>
-        <w:t xml:space="preserve">This project set out to build a full-stack credit card fraud detection system capable of operating reliably under the extreme class imbalance characteristic of real-world financial transaction data, while remaining interpretable enough for practical deployment in a fraud-analysis workflow. The final system integrates a tuned, cross-validated </w:t>
-      </w:r>
-      <w:proofErr w:type="spellStart"/>
-      <w:r>
-        <w:rPr>
-          <w:rFonts w:ascii="Times New Roman" w:hAnsi="Times New Roman" w:cs="Times New Roman"/>
-        </w:rPr>
-        <w:t>XGBoost</w:t>
-      </w:r>
-      <w:proofErr w:type="spellEnd"/>
-      <w:r>
-        <w:rPr>
-          <w:rFonts w:ascii="Times New Roman" w:hAnsi="Times New Roman" w:cs="Times New Roman"/>
-        </w:rPr>
-        <w:t xml:space="preserve"> classifier with a </w:t>
-      </w:r>
-      <w:proofErr w:type="spellStart"/>
-      <w:r>
-        <w:rPr>
-          <w:rFonts w:ascii="Times New Roman" w:hAnsi="Times New Roman" w:cs="Times New Roman"/>
-        </w:rPr>
-        <w:t>FastAPI</w:t>
-      </w:r>
-      <w:proofErr w:type="spellEnd"/>
-      <w:r>
-        <w:rPr>
-          <w:rFonts w:ascii="Times New Roman" w:hAnsi="Times New Roman" w:cs="Times New Roman"/>
-        </w:rPr>
-        <w:t xml:space="preserve"> backend and </w:t>
-      </w:r>
-      <w:proofErr w:type="spellStart"/>
-      <w:r>
-        <w:rPr>
-          <w:rFonts w:ascii="Times New Roman" w:hAnsi="Times New Roman" w:cs="Times New Roman"/>
-        </w:rPr>
-        <w:t>Streamlit</w:t>
-      </w:r>
-      <w:proofErr w:type="spellEnd"/>
-      <w:r>
-        <w:rPr>
-          <w:rFonts w:ascii="Times New Roman" w:hAnsi="Times New Roman" w:cs="Times New Roman"/>
-        </w:rPr>
-        <w:t xml:space="preserve"> dashboard, unified by a SHAP-and-LLM explainability layer that translates model output into analyst-readable justification for every flagged transaction.</w:t>
-      </w:r>
-    </w:p>
-    <w:p>
-      <w:pPr>
-        <w:jc w:val="both"/>
-        <w:rPr>
-          <w:rFonts w:ascii="Times New Roman" w:hAnsi="Times New Roman" w:cs="Times New Roman"/>
-        </w:rPr>
-      </w:pPr>
-      <w:r>
-        <w:rPr>
-          <w:rFonts w:ascii="Times New Roman" w:hAnsi="Times New Roman" w:cs="Times New Roman"/>
-        </w:rPr>
-        <w:t xml:space="preserve">The technical outcomes support this goal. A class-weighting strategy </w:t>
-      </w:r>
-      <w:r>
-        <w:rPr>
-          <w:rFonts w:ascii="Times New Roman" w:hAnsi="Times New Roman" w:cs="Times New Roman"/>
-        </w:rPr>
-        <w:t>–</w:t>
+        <w:t>This project set out to build a full-stack credit card fraud detection system capable of operating reliably under the extreme class imbalance characteristic of real-world financial transaction data, while remaining interpretable enough for practical deployment in a fraud-analysis workflow. The final system integrates a tuned, cross-validated XGBoost classifier with a FastAPI backend and Streamlit dashboard, unified by a SHAP-and-LLM explainability layer that translates model output into analyst-readable justification for every flagged transaction.</w:t>
+      </w:r>
+    </w:p>
+    <w:p>
+      <w:pPr>
+        <w:jc w:val="both"/>
+        <w:rPr>
+          <w:rFonts w:ascii="Times New Roman" w:hAnsi="Times New Roman" w:cs="Times New Roman"/>
+        </w:rPr>
+      </w:pPr>
+      <w:r>
+        <w:rPr>
+          <w:rFonts w:ascii="Times New Roman" w:hAnsi="Times New Roman" w:cs="Times New Roman"/>
+        </w:rPr>
+        <w:t>The technical outcomes support this goal. A class-weighting strategy – validated dynamically rather than assumed – combined with rigorous cross-validation and threshold analysis, produced a model with a cross-validated PR-AUC of 0.8539 (±0.0191) and a documented, evidence-based rationale for its final operating threshold, rather than an unexamined default. Critically, the explainability layer was not treated as an afterthought: SHAP feature attributions were independently corroborated by exploratory correlation analysis and class-conditional distribution plots, and the resulting LLM-generated explanations were validated not only in isolated notebook testing but through the live, deployed system – a distinction that proved consequential, since two of the three most significant bugs identified in this project (a schema validation failure and a truncated LLM response) were invisible until the complete pipeline was exercised end-to-end.</w:t>
+      </w:r>
+    </w:p>
+    <w:p>
+      <w:pPr>
+        <w:jc w:val="both"/>
+        <w:rPr>
+          <w:rFonts w:ascii="Times New Roman" w:hAnsi="Times New Roman" w:cs="Times New Roman"/>
+        </w:rPr>
+      </w:pPr>
+      <w:r>
+        <w:rPr>
+          <w:rFonts w:ascii="Times New Roman" w:hAnsi="Times New Roman" w:cs="Times New Roman"/>
+        </w:rPr>
+        <w:t>This last point merits emphasis as a broader lesson of the project: component-level correctness, a model that scores well in a notebook, a function that returns the expected output in isolation, does not guarantee system-level correctness. The debugging process documented throughout this report, from a misconfigured scale_pos_weight to a missing type import to a deprecated LLM model reference, illustrates that reliable machine learning systems are built as much through disciplined integration testing and honest scope management as through model architecture and hyperparameter selection.</w:t>
       </w:r>
       <w:r>
         <w:rPr>
@@ -13213,25 +10678,7 @@
         <w:rPr>
           <w:rFonts w:ascii="Times New Roman" w:hAnsi="Times New Roman" w:cs="Times New Roman"/>
         </w:rPr>
-        <w:t>validated dynamically</w:t>
-      </w:r>
-      <w:r>
-        <w:rPr>
-          <w:rFonts w:ascii="Times New Roman" w:hAnsi="Times New Roman" w:cs="Times New Roman"/>
-        </w:rPr>
-        <w:t xml:space="preserve"> rather than assumed </w:t>
-      </w:r>
-      <w:r>
-        <w:rPr>
-          <w:rFonts w:ascii="Times New Roman" w:hAnsi="Times New Roman" w:cs="Times New Roman"/>
-        </w:rPr>
-        <w:t>– combined with</w:t>
-      </w:r>
-      <w:r>
-        <w:rPr>
-          <w:rFonts w:ascii="Times New Roman" w:hAnsi="Times New Roman" w:cs="Times New Roman"/>
-        </w:rPr>
-        <w:t xml:space="preserve"> rigorous cross-validation and threshold analysis, produced a model with a cross-validated PR-AUC of 0.8539 (±0.0191) and a documented, evidence-based rationale for its final operating threshold, rather than an unexamined default. Critically, the explainability layer was not treated as an afterthought: SHAP feature attributions were independently corroborated by exploratory correlation analysis and class-conditional distribution plots, and the resulting LLM-generated explanations were validated not only in isolated notebook testing but through the live, deployed system </w:t>
+        <w:t xml:space="preserve">Model versioning was partially implemented </w:t>
       </w:r>
       <w:r>
         <w:rPr>
@@ -13255,109 +10702,33 @@
         <w:rPr>
           <w:rFonts w:ascii="Times New Roman" w:hAnsi="Times New Roman" w:cs="Times New Roman"/>
         </w:rPr>
-        <w:t>distinction that proved consequential, since two of the three most significant bugs identified in this project (a schema validation failure and a truncated LLM response) were invisible until the complete pipeline was exercised end-to-end.</w:t>
-      </w:r>
-    </w:p>
-    <w:p>
-      <w:pPr>
-        <w:jc w:val="both"/>
-        <w:rPr>
-          <w:rFonts w:ascii="Times New Roman" w:hAnsi="Times New Roman" w:cs="Times New Roman"/>
-        </w:rPr>
-      </w:pPr>
-      <w:r>
-        <w:rPr>
-          <w:rFonts w:ascii="Times New Roman" w:hAnsi="Times New Roman" w:cs="Times New Roman"/>
-        </w:rPr>
-        <w:t>This last point merits emphasis as a broader lesson of the project: component-level correctness</w:t>
-      </w:r>
-      <w:r>
-        <w:rPr>
-          <w:rFonts w:ascii="Times New Roman" w:hAnsi="Times New Roman" w:cs="Times New Roman"/>
-        </w:rPr>
-        <w:t>,</w:t>
-      </w:r>
-      <w:r>
-        <w:rPr>
-          <w:rFonts w:ascii="Times New Roman" w:hAnsi="Times New Roman" w:cs="Times New Roman"/>
-        </w:rPr>
-        <w:t xml:space="preserve"> a model that scores well in a notebook, a function that returns the expected output in isolation</w:t>
-      </w:r>
-      <w:r>
-        <w:rPr>
-          <w:rFonts w:ascii="Times New Roman" w:hAnsi="Times New Roman" w:cs="Times New Roman"/>
-        </w:rPr>
-        <w:t>,</w:t>
-      </w:r>
-      <w:r>
-        <w:rPr>
-          <w:rFonts w:ascii="Times New Roman" w:hAnsi="Times New Roman" w:cs="Times New Roman"/>
-        </w:rPr>
-        <w:t xml:space="preserve"> does not guarantee system-level correctness. The debugging process documented throughout this report, from a misconfigured </w:t>
-      </w:r>
-      <w:proofErr w:type="spellStart"/>
-      <w:r>
-        <w:rPr>
-          <w:rFonts w:ascii="Times New Roman" w:hAnsi="Times New Roman" w:cs="Times New Roman"/>
-        </w:rPr>
-        <w:t>scale_pos_weight</w:t>
-      </w:r>
-      <w:proofErr w:type="spellEnd"/>
-      <w:r>
-        <w:rPr>
-          <w:rFonts w:ascii="Times New Roman" w:hAnsi="Times New Roman" w:cs="Times New Roman"/>
-        </w:rPr>
-        <w:t xml:space="preserve"> to a missing type import to a deprecated LLM model reference, illustrates that reliable machine learning systems are built as much through disciplined integration testing and honest scope management as through model architecture and hyperparameter selection. Several improvements</w:t>
-      </w:r>
-      <w:r>
-        <w:rPr>
-          <w:rFonts w:ascii="Times New Roman" w:hAnsi="Times New Roman" w:cs="Times New Roman"/>
-        </w:rPr>
-        <w:t xml:space="preserve">, </w:t>
-      </w:r>
-      <w:r>
-        <w:rPr>
-          <w:rFonts w:ascii="Times New Roman" w:hAnsi="Times New Roman" w:cs="Times New Roman"/>
-        </w:rPr>
-        <w:t>full tuning of comparator models, model versioning, and environment reproducibility</w:t>
-      </w:r>
-      <w:r>
-        <w:rPr>
-          <w:rFonts w:ascii="Times New Roman" w:hAnsi="Times New Roman" w:cs="Times New Roman"/>
-        </w:rPr>
-        <w:t xml:space="preserve">, </w:t>
-      </w:r>
-      <w:r>
-        <w:rPr>
-          <w:rFonts w:ascii="Times New Roman" w:hAnsi="Times New Roman" w:cs="Times New Roman"/>
-        </w:rPr>
-        <w:t>were consciously deferred under real time constraints rather than silently omitted, a decision this report treats as itself part of sound engineering practice: knowing what was not done, and why, is as important to a project's technical integrity as what was completed.</w:t>
-      </w:r>
-    </w:p>
-    <w:p>
-      <w:pPr>
-        <w:jc w:val="both"/>
-        <w:rPr>
-          <w:rFonts w:ascii="Times New Roman" w:hAnsi="Times New Roman" w:cs="Times New Roman"/>
-        </w:rPr>
-      </w:pPr>
-      <w:r>
-        <w:rPr>
-          <w:rFonts w:ascii="Times New Roman" w:hAnsi="Times New Roman" w:cs="Times New Roman"/>
-        </w:rPr>
-        <w:t xml:space="preserve">Ultimately, this project demonstrates that a fraud detection system's value lies not only in its predictive accuracy, but in the transparency of its reasoning and the rigor with which its claims can be verified. The mentorship provided throughout this project </w:t>
-      </w:r>
-      <w:r>
-        <w:rPr>
-          <w:rFonts w:ascii="Times New Roman" w:hAnsi="Times New Roman" w:cs="Times New Roman"/>
-        </w:rPr>
-        <w:t>–</w:t>
-      </w:r>
-      <w:r>
-        <w:rPr>
-          <w:rFonts w:ascii="Times New Roman" w:hAnsi="Times New Roman" w:cs="Times New Roman"/>
-        </w:rPr>
-        <w:t xml:space="preserve"> including</w:t>
+        <w:t>save</w:t>
+      </w:r>
+      <w:r>
+        <w:rPr>
+          <w:rFonts w:ascii="Times New Roman" w:hAnsi="Times New Roman" w:cs="Times New Roman"/>
+          <w:i/>
+          <w:iCs/>
+        </w:rPr>
+        <w:t>_versioned_artifact()</w:t>
+      </w:r>
+      <w:r>
+        <w:rPr>
+          <w:rFonts w:ascii="Times New Roman" w:hAnsi="Times New Roman" w:cs="Times New Roman"/>
+        </w:rPr>
+        <w:t xml:space="preserve"> utility logs timestamped entries for select training runs (see models_archive/model_version_log.txt) </w:t>
+      </w:r>
+      <w:r>
+        <w:rPr>
+          <w:rFonts w:ascii="Times New Roman" w:hAnsi="Times New Roman" w:cs="Times New Roman"/>
+        </w:rPr>
+        <w:t xml:space="preserve">– </w:t>
+      </w:r>
+      <w:r>
+        <w:rPr>
+          <w:rFonts w:ascii="Times New Roman" w:hAnsi="Times New Roman" w:cs="Times New Roman"/>
+        </w:rPr>
+        <w:t>but</w:t>
       </w:r>
       <w:r>
         <w:rPr>
@@ -13369,64 +10740,52 @@
         <w:rPr>
           <w:rFonts w:ascii="Times New Roman" w:hAnsi="Times New Roman" w:cs="Times New Roman"/>
         </w:rPr>
-        <w:t xml:space="preserve">the detailed structured review that shaped its critical fixes </w:t>
-      </w:r>
-      <w:r>
-        <w:rPr>
-          <w:rFonts w:ascii="Times New Roman" w:hAnsi="Times New Roman" w:cs="Times New Roman"/>
-        </w:rPr>
-        <w:t xml:space="preserve">– </w:t>
-      </w:r>
-      <w:r>
-        <w:rPr>
-          <w:rFonts w:ascii="Times New Roman" w:hAnsi="Times New Roman" w:cs="Times New Roman"/>
-        </w:rPr>
-        <w:t>was</w:t>
-      </w:r>
-      <w:r>
-        <w:rPr>
-          <w:rFonts w:ascii="Times New Roman" w:hAnsi="Times New Roman" w:cs="Times New Roman"/>
-        </w:rPr>
-        <w:t xml:space="preserve"> </w:t>
-      </w:r>
-      <w:r>
-        <w:rPr>
-          <w:rFonts w:ascii="Times New Roman" w:hAnsi="Times New Roman" w:cs="Times New Roman"/>
-        </w:rPr>
-        <w:t xml:space="preserve">instrumental in grounding these engineering decisions in professional </w:t>
-      </w:r>
-      <w:proofErr w:type="spellStart"/>
-      <w:r>
-        <w:rPr>
-          <w:rFonts w:ascii="Times New Roman" w:hAnsi="Times New Roman" w:cs="Times New Roman"/>
-        </w:rPr>
-        <w:t>MLOps</w:t>
-      </w:r>
-      <w:proofErr w:type="spellEnd"/>
-      <w:r>
-        <w:rPr>
-          <w:rFonts w:ascii="Times New Roman" w:hAnsi="Times New Roman" w:cs="Times New Roman"/>
-        </w:rPr>
-        <w:t xml:space="preserve"> practice, and in reinforcing that a model is only as trustworthy as the evidence supporting it.</w:t>
-      </w:r>
-    </w:p>
-    <w:p>
-      <w:pPr>
-        <w:jc w:val="both"/>
-        <w:rPr>
-          <w:rFonts w:ascii="Times New Roman" w:hAnsi="Times New Roman" w:cs="Times New Roman"/>
-        </w:rPr>
-      </w:pPr>
-    </w:p>
-    <w:p>
-      <w:pPr>
-        <w:jc w:val="both"/>
-        <w:rPr>
-          <w:rFonts w:ascii="Times New Roman" w:hAnsi="Times New Roman" w:cs="Times New Roman"/>
-        </w:rPr>
-      </w:pPr>
-    </w:p>
-    <w:p/>
+        <w:t>was not adopted as an automatic step for every model export, and rollback functionality was not built.</w:t>
+      </w:r>
+      <w:r>
+        <w:rPr>
+          <w:rFonts w:ascii="Times New Roman" w:hAnsi="Times New Roman" w:cs="Times New Roman"/>
+        </w:rPr>
+        <w:t xml:space="preserve"> Several improvements, full tuning of comparator models, and environment reproducibility, were consciously deferred under real time constraints rather than silently omitted, a decision this report treats as itself part of sound engineering practice: knowing what was not done, and why, is as important to a project's technical integrity as what was completed.</w:t>
+      </w:r>
+    </w:p>
+    <w:p>
+      <w:pPr>
+        <w:jc w:val="both"/>
+        <w:rPr>
+          <w:rFonts w:ascii="Times New Roman" w:hAnsi="Times New Roman" w:cs="Times New Roman"/>
+        </w:rPr>
+      </w:pPr>
+      <w:r>
+        <w:rPr>
+          <w:rFonts w:ascii="Times New Roman" w:hAnsi="Times New Roman" w:cs="Times New Roman"/>
+        </w:rPr>
+        <w:t>Ultimately, this project demonstrates that a fraud detection system's value lies not only in its predictive accuracy, but in the transparency of its reasoning and the rigor with which its claims can be verified. The mentorship provided throughout this project – including the detailed structured review that shaped its critical fixes – was instrumental in grounding these engineering decisions in professional MLOps practice, and in reinforcing that a model is only as trustworthy as the evidence supporting it.</w:t>
+      </w:r>
+    </w:p>
+    <w:p>
+      <w:pPr>
+        <w:jc w:val="both"/>
+        <w:rPr>
+          <w:rFonts w:ascii="Times New Roman" w:hAnsi="Times New Roman" w:cs="Times New Roman"/>
+        </w:rPr>
+      </w:pPr>
+    </w:p>
+    <w:p>
+      <w:pPr>
+        <w:jc w:val="both"/>
+        <w:rPr>
+          <w:rFonts w:ascii="Times New Roman" w:hAnsi="Times New Roman" w:cs="Times New Roman"/>
+        </w:rPr>
+      </w:pPr>
+    </w:p>
+    <w:p>
+      <w:pPr>
+        <w:rPr>
+          <w:rFonts w:ascii="Times New Roman" w:hAnsi="Times New Roman" w:cs="Times New Roman"/>
+        </w:rPr>
+      </w:pPr>
+    </w:p>
     <w:sectPr>
       <w:pgSz w:w="12240" w:h="15840"/>
       <w:pgMar w:top="1440" w:right="1440" w:bottom="1440" w:left="1440" w:header="720" w:footer="720" w:gutter="0"/>
@@ -15610,7 +12969,6 @@
   <w:style w:type="character" w:default="1" w:styleId="DefaultParagraphFont">
     <w:name w:val="Default Paragraph Font"/>
     <w:uiPriority w:val="1"/>
-    <w:semiHidden/>
     <w:unhideWhenUsed/>
   </w:style>
   <w:style w:type="table" w:default="1" w:styleId="TableNormal">

</xml_diff>